<commit_message>
Remove handoff logic and simplify bot behavior
This commit removes the `needs_human`/handoff evaluation path and narrows chatbot behavior to `answer` and `decline`. It updates the notebook prompts, schema validation, scoring logic, and test case definitions to match the new policy, and removes stale cached LLM responses. The documentation asset and test fixtures were refreshed to reflect the simplified behavior model and the updated output contract.
</commit_message>
<xml_diff>
--- a/chatbot_documentation.docx
+++ b/chatbot_documentation.docx
@@ -159,13 +159,13 @@
           <w:b/>
           <w:bCs/>
         </w:rPr>
-        <w:t xml:space="preserve">hands over to a human</w:t>
-      </w:r>
-      <w:r>
-        <w:rPr>
-          <w:rFonts w:ascii="Calibri" w:cs="Calibri" w:eastAsia="Calibri" w:hAnsi="Calibri"/>
-        </w:rPr>
-        <w:t xml:space="preserve"> when it cannot help,</w:t>
+        <w:t xml:space="preserve">admits what it does not know</w:t>
+      </w:r>
+      <w:r>
+        <w:rPr>
+          <w:rFonts w:ascii="Calibri" w:cs="Calibri" w:eastAsia="Calibri" w:hAnsi="Calibri"/>
+        </w:rPr>
+        <w:t xml:space="preserve"> instead of guessing,</w:t>
       </w:r>
     </w:p>
     <w:p>
@@ -1472,7 +1472,7 @@
           <w:sz w:val="19"/>
           <w:szCs w:val="19"/>
         </w:rPr>
-        <w:t xml:space="preserve">{category, urgency, answer, sources, needs_human}</w:t>
+        <w:t xml:space="preserve">{category, urgency, answer, sources}</w:t>
       </w:r>
       <w:r>
         <w:rPr>
@@ -3009,22 +3009,7 @@
         <w:rPr>
           <w:rFonts w:ascii="Calibri" w:cs="Calibri" w:eastAsia="Calibri" w:hAnsi="Calibri"/>
         </w:rPr>
-        <w:t xml:space="preserve">, </w:t>
-      </w:r>
-      <w:r>
-        <w:rPr>
-          <w:rFonts w:ascii="Consolas" w:cs="Consolas" w:eastAsia="Consolas" w:hAnsi="Consolas"/>
-          <w:color w:val="1F3864"/>
-          <w:sz w:val="19"/>
-          <w:szCs w:val="19"/>
-        </w:rPr>
-        <w:t xml:space="preserve">handoff</w:t>
-      </w:r>
-      <w:r>
-        <w:rPr>
-          <w:rFonts w:ascii="Calibri" w:cs="Calibri" w:eastAsia="Calibri" w:hAnsi="Calibri"/>
-        </w:rPr>
-        <w:t xml:space="preserve">: the expected classification, urgency and hand-off decision, scored with </w:t>
+        <w:t xml:space="preserve">: the expected classification and urgency, scored with </w:t>
       </w:r>
       <w:r>
         <w:rPr>
@@ -3078,7 +3063,7 @@
         <w:rPr>
           <w:rFonts w:ascii="Calibri" w:cs="Calibri" w:eastAsia="Calibri" w:hAnsi="Calibri"/>
         </w:rPr>
-        <w:t xml:space="preserve">, </w:t>
+        <w:t xml:space="preserve"> or </w:t>
       </w:r>
       <w:r>
         <w:rPr>
@@ -3087,43 +3072,13 @@
           <w:sz w:val="19"/>
           <w:szCs w:val="19"/>
         </w:rPr>
-        <w:t xml:space="preserve">escalate</w:t>
-      </w:r>
-      <w:r>
-        <w:rPr>
-          <w:rFonts w:ascii="Calibri" w:cs="Calibri" w:eastAsia="Calibri" w:hAnsi="Calibri"/>
-        </w:rPr>
-        <w:t xml:space="preserve"> (must set </w:t>
-      </w:r>
-      <w:r>
-        <w:rPr>
-          <w:rFonts w:ascii="Consolas" w:cs="Consolas" w:eastAsia="Consolas" w:hAnsi="Consolas"/>
-          <w:color w:val="1F3864"/>
-          <w:sz w:val="19"/>
-          <w:szCs w:val="19"/>
-        </w:rPr>
-        <w:t xml:space="preserve">needs_human</w:t>
-      </w:r>
-      <w:r>
-        <w:rPr>
-          <w:rFonts w:ascii="Calibri" w:cs="Calibri" w:eastAsia="Calibri" w:hAnsi="Calibri"/>
-        </w:rPr>
-        <w:t xml:space="preserve">) or </w:t>
-      </w:r>
-      <w:r>
-        <w:rPr>
-          <w:rFonts w:ascii="Consolas" w:cs="Consolas" w:eastAsia="Consolas" w:hAnsi="Consolas"/>
-          <w:color w:val="1F3864"/>
-          <w:sz w:val="19"/>
-          <w:szCs w:val="19"/>
-        </w:rPr>
         <w:t xml:space="preserve">decline</w:t>
       </w:r>
       <w:r>
         <w:rPr>
           <w:rFonts w:ascii="Calibri" w:cs="Calibri" w:eastAsia="Calibri" w:hAnsi="Calibri"/>
         </w:rPr>
-        <w:t xml:space="preserve"> (must refuse or hand over),</w:t>
+        <w:t xml:space="preserve"> (must refuse or say the information is not available),</w:t>
       </w:r>
     </w:p>
     <w:p>
@@ -3852,7 +3807,7 @@
               <w:rPr>
                 <w:rFonts w:ascii="Calibri" w:cs="Calibri" w:eastAsia="Calibri" w:hAnsi="Calibri"/>
               </w:rPr>
-              <w:t xml:space="preserve">escalation</w:t>
+              <w:t xml:space="preserve">complaint</w:t>
             </w:r>
           </w:p>
         </w:tc>
@@ -4861,7 +4816,7 @@
               <w:rPr>
                 <w:rFonts w:ascii="Calibri" w:cs="Calibri" w:eastAsia="Calibri" w:hAnsi="Calibri"/>
               </w:rPr>
-              <w:t xml:space="preserve"> and tool results; never guess an order status; hand over when unsure</w:t>
+              <w:t xml:space="preserve"> and tool results; never guess an order status; say so when the information is missing</w:t>
             </w:r>
           </w:p>
         </w:tc>
@@ -5069,7 +5024,7 @@
               <w:rPr>
                 <w:rFonts w:ascii="Calibri" w:cs="Calibri" w:eastAsia="Calibri" w:hAnsi="Calibri"/>
               </w:rPr>
-              <w:t xml:space="preserve">three demonstrations: a normal answer, a hand-over to a human and a polite refusal; together they cover both positive and negative cases</w:t>
+              <w:t xml:space="preserve">three demonstrations: a normal answer, an apology with warranty guidance and a polite refusal; together they cover both positive and negative cases</w:t>
             </w:r>
           </w:p>
         </w:tc>
@@ -5969,7 +5924,7 @@
         <w:rPr>
           <w:rFonts w:ascii="Calibri" w:cs="Calibri" w:eastAsia="Calibri" w:hAnsi="Calibri"/>
         </w:rPr>
-        <w:t xml:space="preserve"> (main metric): right behaviour (answer, escalate or decline), all key facts present, nothing forbidden, and a correct tool decision.</w:t>
+        <w:t xml:space="preserve"> (main metric): right behaviour (answer or decline), all key facts present, nothing forbidden, and a correct tool decision.</w:t>
       </w:r>
     </w:p>
     <w:p>
@@ -6007,7 +5962,7 @@
         <w:rPr>
           <w:rFonts w:ascii="Calibri" w:cs="Calibri" w:eastAsia="Calibri" w:hAnsi="Calibri"/>
         </w:rPr>
-        <w:t xml:space="preserve">, </w:t>
+        <w:t xml:space="preserve"> and </w:t>
       </w:r>
       <w:r>
         <w:rPr>
@@ -6016,20 +5971,6 @@
           <w:iCs/>
         </w:rPr>
         <w:t xml:space="preserve">urgency</w:t>
-      </w:r>
-      <w:r>
-        <w:rPr>
-          <w:rFonts w:ascii="Calibri" w:cs="Calibri" w:eastAsia="Calibri" w:hAnsi="Calibri"/>
-        </w:rPr>
-        <w:t xml:space="preserve"> and </w:t>
-      </w:r>
-      <w:r>
-        <w:rPr>
-          <w:rFonts w:ascii="Calibri" w:cs="Calibri" w:eastAsia="Calibri" w:hAnsi="Calibri"/>
-          <w:i/>
-          <w:iCs/>
-        </w:rPr>
-        <w:t xml:space="preserve">hand-off</w:t>
       </w:r>
       <w:r>
         <w:rPr>
@@ -7577,22 +7518,7 @@
         <w:rPr>
           <w:rFonts w:ascii="Calibri" w:cs="Calibri" w:eastAsia="Calibri" w:hAnsi="Calibri"/>
         </w:rPr>
-        <w:t xml:space="preserve"> Customers should know they are talking to an AI and have an easy route to a human (EU AI Act transparency obligations for chatbots); </w:t>
-      </w:r>
-      <w:r>
-        <w:rPr>
-          <w:rFonts w:ascii="Consolas" w:cs="Consolas" w:eastAsia="Consolas" w:hAnsi="Consolas"/>
-          <w:color w:val="1F3864"/>
-          <w:sz w:val="19"/>
-          <w:szCs w:val="19"/>
-        </w:rPr>
-        <w:t xml:space="preserve">needs_human</w:t>
-      </w:r>
-      <w:r>
-        <w:rPr>
-          <w:rFonts w:ascii="Calibri" w:cs="Calibri" w:eastAsia="Calibri" w:hAnsi="Calibri"/>
-        </w:rPr>
-        <w:t xml:space="preserve"> provides that route.</w:t>
+        <w:t xml:space="preserve"> Customers should know they are talking to an AI (EU AI Act transparency obligations for chatbots). The prototype has no human hand-off; a production system would need an easy route to a human, for example the support contact listed in the knowledge base.</w:t>
       </w:r>
     </w:p>
     <w:sectPr>

</xml_diff>

<commit_message>
Remove Groq rate-limit sleep and update docs
This change removes the explicit 8-second delay between Groq API calls in both notebook workflows, since the free-tier pacing is no longer required. It also updates the run-time estimate in the evaluation notebook from ~15 minutes to a few minutes and refreshes the chatbot documentation file to reflect the current setup.
</commit_message>
<xml_diff>
--- a/chatbot_documentation.docx
+++ b/chatbot_documentation.docx
@@ -1559,7 +1559,7 @@
         <w:rPr>
           <w:rFonts w:ascii="Calibri" w:cs="Calibri" w:eastAsia="Calibri" w:hAnsi="Calibri"/>
         </w:rPr>
-        <w:t xml:space="preserve">. The full run makes about 80 API calls and takes about 15 minutes because of the free-tier limits; the first run also downloads the e5 embedding model (~470 MB).</w:t>
+        <w:t xml:space="preserve">. The full run makes about 80 API calls and takes a few minutes; the first run also downloads the e5 embedding model (~470 MB).</w:t>
       </w:r>
     </w:p>
     <w:p>
@@ -1974,28 +1974,13 @@
           <w:b/>
           <w:bCs/>
         </w:rPr>
-        <w:t xml:space="preserve">a short pause, no retries</w:t>
-      </w:r>
-      <w:r>
-        <w:rPr>
-          <w:rFonts w:ascii="Calibri" w:cs="Calibri" w:eastAsia="Calibri" w:hAnsi="Calibri"/>
-        </w:rPr>
-        <w:t xml:space="preserve">: before every call it waits </w:t>
-      </w:r>
-      <w:r>
-        <w:rPr>
-          <w:rFonts w:ascii="Consolas" w:cs="Consolas" w:eastAsia="Consolas" w:hAnsi="Consolas"/>
-          <w:color w:val="1F3864"/>
-          <w:sz w:val="19"/>
-          <w:szCs w:val="19"/>
-        </w:rPr>
-        <w:t xml:space="preserve">SECONDS_BETWEEN_CALLS</w:t>
-      </w:r>
-      <w:r>
-        <w:rPr>
-          <w:rFonts w:ascii="Calibri" w:cs="Calibri" w:eastAsia="Calibri" w:hAnsi="Calibri"/>
-        </w:rPr>
-        <w:t xml:space="preserve"> (8 seconds), so the free-tier tokens-per-minute limit is not exceeded; if Groq still returns an error, it is printed and the reply stays empty instead of being retried,</w:t>
+        <w:t xml:space="preserve">no retries</w:t>
+      </w:r>
+      <w:r>
+        <w:rPr>
+          <w:rFonts w:ascii="Calibri" w:cs="Calibri" w:eastAsia="Calibri" w:hAnsi="Calibri"/>
+        </w:rPr>
+        <w:t xml:space="preserve">: if Groq returns an error (for example because the free-tier rate limit is reached), it is printed and the reply stays empty instead of being retried,</w:t>
       </w:r>
     </w:p>
     <w:p>
@@ -6253,7 +6238,7 @@
         <w:rPr>
           <w:rFonts w:ascii="Calibri" w:cs="Calibri" w:eastAsia="Calibri" w:hAnsi="Calibri"/>
         </w:rPr>
-        <w:t xml:space="preserve"> makes one Groq call after a short pause; errors are printed, not retried.</w:t>
+        <w:t xml:space="preserve"> makes one Groq call; errors are printed, not retried.</w:t>
       </w:r>
     </w:p>
     <w:p>
@@ -6645,7 +6630,7 @@
         <w:rPr>
           <w:rFonts w:ascii="Calibri" w:cs="Calibri" w:eastAsia="Calibri" w:hAnsi="Calibri"/>
         </w:rPr>
-        <w:t xml:space="preserve"> cap the evaluation size and add waiting time.</w:t>
+        <w:t xml:space="preserve"> cap the evaluation size. The notebooks do not wait between calls or retry, so a call that hits the rate limit fails and its test case counts as failed.</w:t>
       </w:r>
     </w:p>
     <w:p>

</xml_diff>

<commit_message>
Clean notebooks: strip outputs & simplify guardrails
Remove execution outputs/metadata from notebooks and simplify several modules. Key changes: clear outputs and execution_count in 1_model_evaluation.ipynb and 2_run_chatbot.ipynb; simplify execute_tool_call to run get_order_status directly; replace detailed PII/Luhn/CVV/expiry checks with a simpler regex-based redact_pii; replace complex injection regexes with a phrase list; simplify parse_reply validation; change retrieval metrics to Precision@3/Recall@3/MRR and update plotting; remove generated image outputs/fig_rouge_vs_correctness.png; minor create_db.py tweak to avoid an assertion and print counts.
</commit_message>
<xml_diff>
--- a/chatbot_documentation.docx
+++ b/chatbot_documentation.docx
@@ -2325,7 +2325,7 @@
         <w:rPr>
           <w:rFonts w:ascii="Calibri" w:cs="Calibri" w:eastAsia="Calibri" w:hAnsi="Calibri"/>
         </w:rPr>
-        <w:t xml:space="preserve"> Python checks the tool name and the order-number format and runs the query, not the model.</w:t>
+        <w:t xml:space="preserve"> Python checks the tool name and runs the query, not the model.</w:t>
       </w:r>
     </w:p>
     <w:p>
@@ -2691,7 +2691,7 @@
         <w:rPr>
           <w:rFonts w:ascii="Calibri" w:cs="Calibri" w:eastAsia="Calibri" w:hAnsi="Calibri"/>
         </w:rPr>
-        <w:t xml:space="preserve">. Without them retrieval silently gets worse, so a self-check tests it.</w:t>
+        <w:t xml:space="preserve">. Without them retrieval silently gets worse.</w:t>
       </w:r>
     </w:p>
     <w:p>
@@ -4091,27 +4091,27 @@
           <w:b/>
           <w:bCs/>
         </w:rPr>
-        <w:t xml:space="preserve">Hit@k</w:t>
-      </w:r>
-      <w:r>
-        <w:rPr>
-          <w:rFonts w:ascii="Calibri" w:cs="Calibri" w:eastAsia="Calibri" w:hAnsi="Calibri"/>
-        </w:rPr>
-        <w:t xml:space="preserve"> (a gold document is among the top </w:t>
-      </w:r>
-      <w:r>
-        <w:rPr>
-          <w:rFonts w:ascii="Calibri" w:cs="Calibri" w:eastAsia="Calibri" w:hAnsi="Calibri"/>
-          <w:i/>
-          <w:iCs/>
-        </w:rPr>
-        <w:t xml:space="preserve">k</w:t>
-      </w:r>
-      <w:r>
-        <w:rPr>
-          <w:rFonts w:ascii="Calibri" w:cs="Calibri" w:eastAsia="Calibri" w:hAnsi="Calibri"/>
-        </w:rPr>
-        <w:t xml:space="preserve">) and </w:t>
+        <w:t xml:space="preserve">precision@3</w:t>
+      </w:r>
+      <w:r>
+        <w:rPr>
+          <w:rFonts w:ascii="Calibri" w:cs="Calibri" w:eastAsia="Calibri" w:hAnsi="Calibri"/>
+        </w:rPr>
+        <w:t xml:space="preserve"> (share of the 3 retrieved pages that are gold), </w:t>
+      </w:r>
+      <w:r>
+        <w:rPr>
+          <w:rFonts w:ascii="Calibri" w:cs="Calibri" w:eastAsia="Calibri" w:hAnsi="Calibri"/>
+          <w:b/>
+          <w:bCs/>
+        </w:rPr>
+        <w:t xml:space="preserve">recall@3</w:t>
+      </w:r>
+      <w:r>
+        <w:rPr>
+          <w:rFonts w:ascii="Calibri" w:cs="Calibri" w:eastAsia="Calibri" w:hAnsi="Calibri"/>
+        </w:rPr>
+        <w:t xml:space="preserve"> (share of the gold pages that are retrieved) and </w:t>
       </w:r>
       <w:r>
         <w:rPr>
@@ -4125,35 +4125,7 @@
         <w:rPr>
           <w:rFonts w:ascii="Calibri" w:cs="Calibri" w:eastAsia="Calibri" w:hAnsi="Calibri"/>
         </w:rPr>
-        <w:t xml:space="preserve"> (mean reciprocal rank of the first gold document), plus </w:t>
-      </w:r>
-      <w:r>
-        <w:rPr>
-          <w:rFonts w:ascii="Calibri" w:cs="Calibri" w:eastAsia="Calibri" w:hAnsi="Calibri"/>
-          <w:b/>
-          <w:bCs/>
-        </w:rPr>
-        <w:t xml:space="preserve">precision@3</w:t>
-      </w:r>
-      <w:r>
-        <w:rPr>
-          <w:rFonts w:ascii="Calibri" w:cs="Calibri" w:eastAsia="Calibri" w:hAnsi="Calibri"/>
-        </w:rPr>
-        <w:t xml:space="preserve"> (share of the 3 retrieved pages that are gold) and </w:t>
-      </w:r>
-      <w:r>
-        <w:rPr>
-          <w:rFonts w:ascii="Calibri" w:cs="Calibri" w:eastAsia="Calibri" w:hAnsi="Calibri"/>
-          <w:b/>
-          <w:bCs/>
-        </w:rPr>
-        <w:t xml:space="preserve">recall@3</w:t>
-      </w:r>
-      <w:r>
-        <w:rPr>
-          <w:rFonts w:ascii="Calibri" w:cs="Calibri" w:eastAsia="Calibri" w:hAnsi="Calibri"/>
-        </w:rPr>
-        <w:t xml:space="preserve"> (share of the gold pages that are retrieved). We compare six retrievers: word-only, character-only and hybrid TF-IDF, BM25, e5 vector search (used by the chatbot) and the BM25 + e5 hybrid (RRF).</w:t>
+        <w:t xml:space="preserve"> (mean reciprocal rank of the first gold page within the top 3; 0 if there is none). We compare six retrievers: word-only, character-only and hybrid TF-IDF, BM25, e5 vector search (used by the chatbot) and the BM25 + e5 hybrid (RRF).</w:t>
       </w:r>
     </w:p>
     <w:p>
@@ -4359,7 +4331,7 @@
         <w:rPr>
           <w:rFonts w:ascii="Calibri" w:cs="Calibri" w:eastAsia="Calibri" w:hAnsi="Calibri"/>
         </w:rPr>
-        <w:t xml:space="preserve">: card numbers (checked with the Luhn algorithm, so order numbers are not hit), CVV codes, expiry dates, e-mail addresses and phone numbers are masked before anything is sent to Groq. The customer's e-mail is kept by the </w:t>
+        <w:t xml:space="preserve">: card numbers (13–19 digits), e-mail addresses and phone numbers are masked before anything is sent to Groq. The customer's e-mail is kept by the </w:t>
       </w:r>
       <w:r>
         <w:rPr>
@@ -4397,7 +4369,7 @@
         <w:rPr>
           <w:rFonts w:ascii="Calibri" w:cs="Calibri" w:eastAsia="Calibri" w:hAnsi="Calibri"/>
         </w:rPr>
-        <w:t xml:space="preserve">: regular expressions catch common attacks ("ignore previous instructions", "system prompt", "admin mode"). Matching messages get a fixed reply and never reach the LLM.</w:t>
+        <w:t xml:space="preserve">: a short list of phrases catches common attacks ("ignore previous instructions", "system prompt", "admin mode"). Matching messages get a fixed reply and never reach the LLM.</w:t>
       </w:r>
     </w:p>
     <w:p>
@@ -4469,7 +4441,7 @@
         <w:rPr>
           <w:rFonts w:ascii="Calibri" w:cs="Calibri" w:eastAsia="Calibri" w:hAnsi="Calibri"/>
         </w:rPr>
-        <w:t xml:space="preserve"> string. If it ever appears in a reply, the prompt has leaked and the reply is replaced. Replies containing a valid card number are blocked as well.</w:t>
+        <w:t xml:space="preserve"> string. If it ever appears in a reply, the prompt has leaked and the reply is replaced. Replies containing a card number are blocked as well.</w:t>
       </w:r>
     </w:p>
     <w:p>
@@ -5126,7 +5098,7 @@
         <w:rPr>
           <w:rFonts w:ascii="Calibri" w:cs="Calibri" w:eastAsia="Calibri" w:hAnsi="Calibri"/>
         </w:rPr>
-        <w:t xml:space="preserve">, Python validates and runs it with the stored e-mail, then sends the result back as a </w:t>
+        <w:t xml:space="preserve">, Python runs it with the stored e-mail, then sends the result back as a </w:t>
       </w:r>
       <w:r>
         <w:rPr>
@@ -5347,7 +5319,7 @@
         <w:rPr>
           <w:rFonts w:ascii="Calibri" w:cs="Calibri" w:eastAsia="Calibri" w:hAnsi="Calibri"/>
         </w:rPr>
-        <w:t xml:space="preserve"> with all fields and allowed values; </w:t>
+        <w:t xml:space="preserve"> with all fields and an allowed category; </w:t>
       </w:r>
       <w:r>
         <w:rPr>
@@ -5361,21 +5333,31 @@
         <w:rPr>
           <w:rFonts w:ascii="Calibri" w:cs="Calibri" w:eastAsia="Calibri" w:hAnsi="Calibri"/>
         </w:rPr>
-        <w:t xml:space="preserve"> correct; </w:t>
-      </w:r>
-      <w:r>
-        <w:rPr>
-          <w:rFonts w:ascii="Calibri" w:cs="Calibri" w:eastAsia="Calibri" w:hAnsi="Calibri"/>
-          <w:b/>
-          <w:bCs/>
-        </w:rPr>
-        <w:t xml:space="preserve">citations</w:t>
-      </w:r>
-      <w:r>
-        <w:rPr>
-          <w:rFonts w:ascii="Calibri" w:cs="Calibri" w:eastAsia="Calibri" w:hAnsi="Calibri"/>
-        </w:rPr>
-        <w:t xml:space="preserve"> valid (no invented document IDs).</w:t>
+        <w:t xml:space="preserve"> correct.</w:t>
+      </w:r>
+    </w:p>
+    <w:p>
+      <w:pPr>
+        <w:pStyle w:val="ListParagraph"/>
+        <w:numPr>
+          <w:ilvl w:val="0"/>
+          <w:numId w:val="3"/>
+        </w:numPr>
+        <w:spacing w:after="60"/>
+      </w:pPr>
+      <w:r>
+        <w:rPr>
+          <w:rFonts w:ascii="Calibri" w:cs="Calibri" w:eastAsia="Calibri" w:hAnsi="Calibri"/>
+          <w:b/>
+          <w:bCs/>
+        </w:rPr>
+        <w:t xml:space="preserve">Token usage and latency</w:t>
+      </w:r>
+      <w:r>
+        <w:rPr>
+          <w:rFonts w:ascii="Calibri" w:cs="Calibri" w:eastAsia="Calibri" w:hAnsi="Calibri"/>
+        </w:rPr>
+        <w:t xml:space="preserve"> per answer: prompt and completion tokens from Groq's usage field and the measured call time.</w:t>
       </w:r>
     </w:p>
     <w:p>
@@ -5394,7 +5376,7 @@
         <w:rPr>
           <w:rFonts w:ascii="Calibri" w:cs="Calibri" w:eastAsia="Calibri" w:hAnsi="Calibri"/>
         </w:rPr>
-        <w:t xml:space="preserve">The notebook shows these metrics for the final chatbot in one table, followed by the number of passed cases per test group, a bar chart of the pass rate by group and a table of expected versus predicted categories. results_final.csv also records the token usage, the number of LLM calls and the latency of every answer.</w:t>
+        <w:t xml:space="preserve">The notebook shows these metrics for the final chatbot in one table and the pass rate per test group as a bar chart. Token usage and latency are averages per answer; results_final.csv has the values for every answer.</w:t>
       </w:r>
     </w:p>
     <w:p>
@@ -6710,7 +6692,7 @@
         <w:rPr>
           <w:rFonts w:ascii="Calibri" w:cs="Calibri" w:eastAsia="Calibri" w:hAnsi="Calibri"/>
         </w:rPr>
-        <w:t xml:space="preserve"> The regex filter catches only known phrasings; paraphrased attacks reach the model, which then relies on its instructions and the delimiter tags (Section 12). The real protection is the narrow tool design: even a successful injection can only look up one verified order.</w:t>
+        <w:t xml:space="preserve"> The phrase filter catches only known phrasings; paraphrased attacks reach the model, which then relies on its instructions and the delimiter tags (Section 12). The real protection is the narrow tool design: even a successful injection can only look up one verified order.</w:t>
       </w:r>
     </w:p>
     <w:p>

</xml_diff>

<commit_message>
Refactor chatbot into shared module
Moved the Cairnly chatbot implementation out of the notebooks into a reusable chatbot.py module and made both notebooks import it. This keeps the evaluation and runtime flows in sync, simplifies setup, and centralizes shared configuration, retrieval, guardrails, prompt logic, and the order tool. Also added a small .gitignore cleanup and updated notebook instructions to reflect the new workflow.
</commit_message>
<xml_diff>
--- a/chatbot_documentation.docx
+++ b/chatbot_documentation.docx
@@ -333,7 +333,7 @@
               <w:rPr>
                 <w:rFonts w:ascii="Calibri" w:cs="Calibri" w:eastAsia="Calibri" w:hAnsi="Calibri"/>
               </w:rPr>
-              <w:t xml:space="preserve">Builds the chatbot pipeline and evaluates it: retrievers, guardrails, LLM judge, failure analysis. Writes the results to </w:t>
+              <w:t xml:space="preserve">Evaluates the chatbot from chatbot.py: retrievers, guardrails, LLM judge, failure analysis. Writes the results to </w:t>
             </w:r>
             <w:r>
               <w:rPr>
@@ -403,7 +403,7 @@
               <w:rPr>
                 <w:rFonts w:ascii="Calibri" w:cs="Calibri" w:eastAsia="Calibri" w:hAnsi="Calibri"/>
               </w:rPr>
-              <w:t xml:space="preserve">Runs only the chosen configuration: a short demo and an interactive chat.</w:t>
+              <w:t xml:space="preserve">Runs the chatbot from chatbot.py: a short demo and an interactive chat.</w:t>
             </w:r>
           </w:p>
         </w:tc>
@@ -433,7 +433,7 @@
                 <w:sz w:val="19"/>
                 <w:szCs w:val="19"/>
               </w:rPr>
-              <w:t xml:space="preserve">chatbot_documentation.docx</w:t>
+              <w:t xml:space="preserve">chatbot.py</w:t>
             </w:r>
           </w:p>
         </w:tc>
@@ -458,7 +458,7 @@
               <w:rPr>
                 <w:rFonts w:ascii="Calibri" w:cs="Calibri" w:eastAsia="Calibri" w:hAnsi="Calibri"/>
               </w:rPr>
-              <w:t xml:space="preserve">This document: the explanations behind both notebooks.</w:t>
+              <w:t xml:space="preserve">The chatbot itself, imported by both notebooks: settings, Groq client, knowledge sources and order tool, e5 retrieval, guardrails, prompt and ChatSession.</w:t>
             </w:r>
           </w:p>
         </w:tc>
@@ -488,14 +488,54 @@
                 <w:sz w:val="19"/>
                 <w:szCs w:val="19"/>
               </w:rPr>
-              <w:t xml:space="preserve">data/cairnly.db</w:t>
-            </w:r>
-            <w:r>
-              <w:rPr>
-                <w:rFonts w:ascii="Calibri" w:cs="Calibri" w:eastAsia="Calibri" w:hAnsi="Calibri"/>
-              </w:rPr>
-              <w:t xml:space="preserve">, </w:t>
-            </w:r>
+              <w:t xml:space="preserve">chatbot_documentation.docx</w:t>
+            </w:r>
+          </w:p>
+        </w:tc>
+        <w:tc>
+          <w:tcPr>
+            <w:tcW w:type="dxa" w:w="6274"/>
+            <w:tcBorders>
+              <w:top w:val="single" w:color="BFBFBF" w:sz="4"/>
+              <w:left w:val="single" w:color="BFBFBF" w:sz="4"/>
+              <w:bottom w:val="single" w:color="BFBFBF" w:sz="4"/>
+              <w:right w:val="single" w:color="BFBFBF" w:sz="4"/>
+            </w:tcBorders>
+            <w:tcMar>
+              <w:top w:type="dxa" w:w="60"/>
+              <w:left w:type="dxa" w:w="100"/>
+              <w:bottom w:type="dxa" w:w="60"/>
+              <w:right w:type="dxa" w:w="100"/>
+            </w:tcMar>
+          </w:tcPr>
+          <w:p>
+            <w:r>
+              <w:rPr>
+                <w:rFonts w:ascii="Calibri" w:cs="Calibri" w:eastAsia="Calibri" w:hAnsi="Calibri"/>
+              </w:rPr>
+              <w:t xml:space="preserve">This document: the explanations behind both notebooks.</w:t>
+            </w:r>
+          </w:p>
+        </w:tc>
+      </w:tr>
+      <w:tr>
+        <w:tc>
+          <w:tcPr>
+            <w:tcW w:type="dxa" w:w="3232"/>
+            <w:tcBorders>
+              <w:top w:val="single" w:color="BFBFBF" w:sz="4"/>
+              <w:left w:val="single" w:color="BFBFBF" w:sz="4"/>
+              <w:bottom w:val="single" w:color="BFBFBF" w:sz="4"/>
+              <w:right w:val="single" w:color="BFBFBF" w:sz="4"/>
+            </w:tcBorders>
+            <w:tcMar>
+              <w:top w:type="dxa" w:w="60"/>
+              <w:left w:type="dxa" w:w="100"/>
+              <w:bottom w:type="dxa" w:w="60"/>
+              <w:right w:type="dxa" w:w="100"/>
+            </w:tcMar>
+          </w:tcPr>
+          <w:p>
             <w:r>
               <w:rPr>
                 <w:rFonts w:ascii="Consolas" w:cs="Consolas" w:eastAsia="Consolas" w:hAnsi="Consolas"/>
@@ -503,54 +543,14 @@
                 <w:sz w:val="19"/>
                 <w:szCs w:val="19"/>
               </w:rPr>
-              <w:t xml:space="preserve">data/create_db.py</w:t>
-            </w:r>
-          </w:p>
-        </w:tc>
-        <w:tc>
-          <w:tcPr>
-            <w:tcW w:type="dxa" w:w="6274"/>
-            <w:tcBorders>
-              <w:top w:val="single" w:color="BFBFBF" w:sz="4"/>
-              <w:left w:val="single" w:color="BFBFBF" w:sz="4"/>
-              <w:bottom w:val="single" w:color="BFBFBF" w:sz="4"/>
-              <w:right w:val="single" w:color="BFBFBF" w:sz="4"/>
-            </w:tcBorders>
-            <w:tcMar>
-              <w:top w:type="dxa" w:w="60"/>
-              <w:left w:type="dxa" w:w="100"/>
-              <w:bottom w:type="dxa" w:w="60"/>
-              <w:right w:type="dxa" w:w="100"/>
-            </w:tcMar>
-          </w:tcPr>
-          <w:p>
-            <w:r>
-              <w:rPr>
-                <w:rFonts w:ascii="Calibri" w:cs="Calibri" w:eastAsia="Calibri" w:hAnsi="Calibri"/>
-              </w:rPr>
-              <w:t xml:space="preserve">SQLite database with the help-centre documents and the orders, and the script that builds it (it also holds the source data).</w:t>
-            </w:r>
-          </w:p>
-        </w:tc>
-      </w:tr>
-      <w:tr>
-        <w:tc>
-          <w:tcPr>
-            <w:tcW w:type="dxa" w:w="3232"/>
-            <w:tcBorders>
-              <w:top w:val="single" w:color="BFBFBF" w:sz="4"/>
-              <w:left w:val="single" w:color="BFBFBF" w:sz="4"/>
-              <w:bottom w:val="single" w:color="BFBFBF" w:sz="4"/>
-              <w:right w:val="single" w:color="BFBFBF" w:sz="4"/>
-            </w:tcBorders>
-            <w:tcMar>
-              <w:top w:type="dxa" w:w="60"/>
-              <w:left w:type="dxa" w:w="100"/>
-              <w:bottom w:type="dxa" w:w="60"/>
-              <w:right w:type="dxa" w:w="100"/>
-            </w:tcMar>
-          </w:tcPr>
-          <w:p>
+              <w:t xml:space="preserve">data/cairnly.db</w:t>
+            </w:r>
+            <w:r>
+              <w:rPr>
+                <w:rFonts w:ascii="Calibri" w:cs="Calibri" w:eastAsia="Calibri" w:hAnsi="Calibri"/>
+              </w:rPr>
+              <w:t xml:space="preserve">, </w:t>
+            </w:r>
             <w:r>
               <w:rPr>
                 <w:rFonts w:ascii="Consolas" w:cs="Consolas" w:eastAsia="Consolas" w:hAnsi="Consolas"/>
@@ -558,7 +558,7 @@
                 <w:sz w:val="19"/>
                 <w:szCs w:val="19"/>
               </w:rPr>
-              <w:t xml:space="preserve">test/test_cases.json</w:t>
+              <w:t xml:space="preserve">data/create_db.py</w:t>
             </w:r>
           </w:p>
         </w:tc>
@@ -583,7 +583,7 @@
               <w:rPr>
                 <w:rFonts w:ascii="Calibri" w:cs="Calibri" w:eastAsia="Calibri" w:hAnsi="Calibri"/>
               </w:rPr>
-              <w:t xml:space="preserve">The 34 predefined test cases.</w:t>
+              <w:t xml:space="preserve">SQLite database with the help-centre documents and the orders, and the script that builds it (it also holds the source data).</w:t>
             </w:r>
           </w:p>
         </w:tc>
@@ -613,7 +613,7 @@
                 <w:sz w:val="19"/>
                 <w:szCs w:val="19"/>
               </w:rPr>
-              <w:t xml:space="preserve">outputs/</w:t>
+              <w:t xml:space="preserve">test/test_cases.json</w:t>
             </w:r>
           </w:p>
         </w:tc>
@@ -638,8 +638,29 @@
               <w:rPr>
                 <w:rFonts w:ascii="Calibri" w:cs="Calibri" w:eastAsia="Calibri" w:hAnsi="Calibri"/>
               </w:rPr>
-              <w:t xml:space="preserve">Evaluation results: CSV files, charts and </w:t>
-            </w:r>
+              <w:t xml:space="preserve">The 34 predefined test cases.</w:t>
+            </w:r>
+          </w:p>
+        </w:tc>
+      </w:tr>
+      <w:tr>
+        <w:tc>
+          <w:tcPr>
+            <w:tcW w:type="dxa" w:w="3232"/>
+            <w:tcBorders>
+              <w:top w:val="single" w:color="BFBFBF" w:sz="4"/>
+              <w:left w:val="single" w:color="BFBFBF" w:sz="4"/>
+              <w:bottom w:val="single" w:color="BFBFBF" w:sz="4"/>
+              <w:right w:val="single" w:color="BFBFBF" w:sz="4"/>
+            </w:tcBorders>
+            <w:tcMar>
+              <w:top w:type="dxa" w:w="60"/>
+              <w:left w:type="dxa" w:w="100"/>
+              <w:bottom w:type="dxa" w:w="60"/>
+              <w:right w:type="dxa" w:w="100"/>
+            </w:tcMar>
+          </w:tcPr>
+          <w:p>
             <w:r>
               <w:rPr>
                 <w:rFonts w:ascii="Consolas" w:cs="Consolas" w:eastAsia="Consolas" w:hAnsi="Consolas"/>
@@ -647,6 +668,40 @@
                 <w:sz w:val="19"/>
                 <w:szCs w:val="19"/>
               </w:rPr>
+              <w:t xml:space="preserve">outputs/</w:t>
+            </w:r>
+          </w:p>
+        </w:tc>
+        <w:tc>
+          <w:tcPr>
+            <w:tcW w:type="dxa" w:w="6274"/>
+            <w:tcBorders>
+              <w:top w:val="single" w:color="BFBFBF" w:sz="4"/>
+              <w:left w:val="single" w:color="BFBFBF" w:sz="4"/>
+              <w:bottom w:val="single" w:color="BFBFBF" w:sz="4"/>
+              <w:right w:val="single" w:color="BFBFBF" w:sz="4"/>
+            </w:tcBorders>
+            <w:tcMar>
+              <w:top w:type="dxa" w:w="60"/>
+              <w:left w:type="dxa" w:w="100"/>
+              <w:bottom w:type="dxa" w:w="60"/>
+              <w:right w:type="dxa" w:w="100"/>
+            </w:tcMar>
+          </w:tcPr>
+          <w:p>
+            <w:r>
+              <w:rPr>
+                <w:rFonts w:ascii="Calibri" w:cs="Calibri" w:eastAsia="Calibri" w:hAnsi="Calibri"/>
+              </w:rPr>
+              <w:t xml:space="preserve">Evaluation results: CSV files, charts and </w:t>
+            </w:r>
+            <w:r>
+              <w:rPr>
+                <w:rFonts w:ascii="Consolas" w:cs="Consolas" w:eastAsia="Consolas" w:hAnsi="Consolas"/>
+                <w:color w:val="1F3864"/>
+                <w:sz w:val="19"/>
+                <w:szCs w:val="19"/>
+              </w:rPr>
               <w:t xml:space="preserve">run_summary.txt</w:t>
             </w:r>
             <w:r>
@@ -690,6 +745,21 @@
           <w:szCs w:val="19"/>
         </w:rPr>
         <w:t xml:space="preserve">1_model_evaluation.ipynb</w:t>
+      </w:r>
+      <w:r>
+        <w:rPr>
+          <w:rFonts w:ascii="Calibri" w:cs="Calibri" w:eastAsia="Calibri" w:hAnsi="Calibri"/>
+        </w:rPr>
+        <w:t xml:space="preserve">; the chatbot code itself is in </w:t>
+      </w:r>
+      <w:r>
+        <w:rPr>
+          <w:rFonts w:ascii="Consolas" w:cs="Consolas" w:eastAsia="Consolas" w:hAnsi="Consolas"/>
+          <w:color w:val="1F3864"/>
+          <w:sz w:val="19"/>
+          <w:szCs w:val="19"/>
+        </w:rPr>
+        <w:t xml:space="preserve">chatbot.py</w:t>
       </w:r>
       <w:r>
         <w:rPr>
@@ -1432,6 +1502,42 @@
       </w:pPr>
       <w:r>
         <w:rPr>
+          <w:rFonts w:ascii="Calibri" w:cs="Calibri" w:eastAsia="Calibri" w:hAnsi="Calibri"/>
+        </w:rPr>
+        <w:t xml:space="preserve">The pipeline is written once, in </w:t>
+      </w:r>
+      <w:r>
+        <w:rPr>
+          <w:rFonts w:ascii="Consolas" w:cs="Consolas" w:eastAsia="Consolas" w:hAnsi="Consolas"/>
+          <w:color w:val="1F3864"/>
+          <w:sz w:val="19"/>
+          <w:szCs w:val="19"/>
+        </w:rPr>
+        <w:t xml:space="preserve">chatbot.py</w:t>
+      </w:r>
+      <w:r>
+        <w:rPr>
+          <w:rFonts w:ascii="Calibri" w:cs="Calibri" w:eastAsia="Calibri" w:hAnsi="Calibri"/>
+        </w:rPr>
+        <w:t xml:space="preserve">: </w:t>
+      </w:r>
+      <w:r>
+        <w:rPr>
+          <w:rFonts w:ascii="Consolas" w:cs="Consolas" w:eastAsia="Consolas" w:hAnsi="Consolas"/>
+          <w:color w:val="1F3864"/>
+          <w:sz w:val="19"/>
+          <w:szCs w:val="19"/>
+        </w:rPr>
+        <w:t xml:space="preserve">1_model_evaluation.ipynb</w:t>
+      </w:r>
+      <w:r>
+        <w:rPr>
+          <w:rFonts w:ascii="Calibri" w:cs="Calibri" w:eastAsia="Calibri" w:hAnsi="Calibri"/>
+        </w:rPr>
+        <w:t xml:space="preserve"> evaluates it (§11) and </w:t>
+      </w:r>
+      <w:r>
+        <w:rPr>
           <w:rFonts w:ascii="Consolas" w:cs="Consolas" w:eastAsia="Consolas" w:hAnsi="Consolas"/>
           <w:color w:val="1F3864"/>
           <w:sz w:val="19"/>
@@ -1443,21 +1549,7 @@
         <w:rPr>
           <w:rFonts w:ascii="Calibri" w:cs="Calibri" w:eastAsia="Calibri" w:hAnsi="Calibri"/>
         </w:rPr>
-        <w:t xml:space="preserve"> runs exactly this pipeline: the </w:t>
-      </w:r>
-      <w:r>
-        <w:rPr>
-          <w:rFonts w:ascii="Calibri" w:cs="Calibri" w:eastAsia="Calibri" w:hAnsi="Calibri"/>
-          <w:b/>
-          <w:bCs/>
-        </w:rPr>
-        <w:t xml:space="preserve">Final chatbot</w:t>
-      </w:r>
-      <w:r>
-        <w:rPr>
-          <w:rFonts w:ascii="Calibri" w:cs="Calibri" w:eastAsia="Calibri" w:hAnsi="Calibri"/>
-        </w:rPr>
-        <w:t xml:space="preserve"> evaluated in §11.</w:t>
+        <w:t xml:space="preserve"> runs it, so the chatbot runs exactly the code that was evaluated.</w:t>
       </w:r>
     </w:p>
     <w:p>
@@ -1476,7 +1568,22 @@
         <w:rPr>
           <w:rFonts w:ascii="Calibri" w:cs="Calibri" w:eastAsia="Calibri" w:hAnsi="Calibri"/>
         </w:rPr>
-        <w:t xml:space="preserve">Keep both notebooks next to the </w:t>
+        <w:t xml:space="preserve">Keep both notebooks next to </w:t>
+      </w:r>
+      <w:r>
+        <w:rPr>
+          <w:rFonts w:ascii="Consolas" w:cs="Consolas" w:eastAsia="Consolas" w:hAnsi="Consolas"/>
+          <w:color w:val="1F3864"/>
+          <w:sz w:val="19"/>
+          <w:szCs w:val="19"/>
+        </w:rPr>
+        <w:t xml:space="preserve">chatbot.py</w:t>
+      </w:r>
+      <w:r>
+        <w:rPr>
+          <w:rFonts w:ascii="Calibri" w:cs="Calibri" w:eastAsia="Calibri" w:hAnsi="Calibri"/>
+        </w:rPr>
+        <w:t xml:space="preserve"> and the </w:t>
       </w:r>
       <w:r>
         <w:rPr>
@@ -1658,7 +1765,22 @@
         <w:rPr>
           <w:rFonts w:ascii="Calibri" w:cs="Calibri" w:eastAsia="Calibri" w:hAnsi="Calibri"/>
         </w:rPr>
-        <w:t xml:space="preserve">. The headings match the section numbers in the notebook.</w:t>
+        <w:t xml:space="preserve">. The headings match the section numbers in the notebook. The chatbot described in Sections 2–10 is implemented in </w:t>
+      </w:r>
+      <w:r>
+        <w:rPr>
+          <w:rFonts w:ascii="Consolas" w:cs="Consolas" w:eastAsia="Consolas" w:hAnsi="Consolas"/>
+          <w:color w:val="1F3864"/>
+          <w:sz w:val="19"/>
+          <w:szCs w:val="19"/>
+        </w:rPr>
+        <w:t xml:space="preserve">chatbot.py</w:t>
+      </w:r>
+      <w:r>
+        <w:rPr>
+          <w:rFonts w:ascii="Calibri" w:cs="Calibri" w:eastAsia="Calibri" w:hAnsi="Calibri"/>
+        </w:rPr>
+        <w:t xml:space="preserve">; the notebook imports it, shows short examples of each part and adds the evaluation code (baseline retrievers, test set, metrics, LLM judge).</w:t>
       </w:r>
     </w:p>
     <w:p>
@@ -1685,7 +1807,22 @@
         <w:rPr>
           <w:rFonts w:ascii="Calibri" w:cs="Calibri" w:eastAsia="Calibri" w:hAnsi="Calibri"/>
         </w:rPr>
-        <w:t xml:space="preserve">: Python ≥ 3.10, the packages installed by the first code cell and two folders next to the notebook:</w:t>
+        <w:t xml:space="preserve">: Python ≥ 3.10, the packages installed by the first code cell, </w:t>
+      </w:r>
+      <w:r>
+        <w:rPr>
+          <w:rFonts w:ascii="Consolas" w:cs="Consolas" w:eastAsia="Consolas" w:hAnsi="Consolas"/>
+          <w:color w:val="1F3864"/>
+          <w:sz w:val="19"/>
+          <w:szCs w:val="19"/>
+        </w:rPr>
+        <w:t xml:space="preserve">chatbot.py</w:t>
+      </w:r>
+      <w:r>
+        <w:rPr>
+          <w:rFonts w:ascii="Calibri" w:cs="Calibri" w:eastAsia="Calibri" w:hAnsi="Calibri"/>
+        </w:rPr>
+        <w:t xml:space="preserve"> and two folders next to the notebook:</w:t>
       </w:r>
     </w:p>
     <w:p>
@@ -5689,7 +5826,7 @@
         <w:rPr>
           <w:rFonts w:ascii="Calibri" w:cs="Calibri" w:eastAsia="Calibri" w:hAnsi="Calibri"/>
         </w:rPr>
-        <w:t xml:space="preserve"> contains only what is needed to run the chosen configuration: the </w:t>
+        <w:t xml:space="preserve"> runs the </w:t>
       </w:r>
       <w:r>
         <w:rPr>
@@ -5703,7 +5840,22 @@
         <w:rPr>
           <w:rFonts w:ascii="Calibri" w:cs="Calibri" w:eastAsia="Calibri" w:hAnsi="Calibri"/>
         </w:rPr>
-        <w:t xml:space="preserve"> evaluated in Section 11 of notebook 1. It has no baselines, test cases or metrics. Its pipeline code is the same as in notebook 1, restricted to the chosen settings, so the chatbot sends exactly the requests that were evaluated.</w:t>
+        <w:t xml:space="preserve"> evaluated in Section 11 of notebook 1. It has no pipeline code of its own: it imports </w:t>
+      </w:r>
+      <w:r>
+        <w:rPr>
+          <w:rFonts w:ascii="Consolas" w:cs="Consolas" w:eastAsia="Consolas" w:hAnsi="Consolas"/>
+          <w:color w:val="1F3864"/>
+          <w:sz w:val="19"/>
+          <w:szCs w:val="19"/>
+        </w:rPr>
+        <w:t xml:space="preserve">chatbot.py</w:t>
+      </w:r>
+      <w:r>
+        <w:rPr>
+          <w:rFonts w:ascii="Calibri" w:cs="Calibri" w:eastAsia="Calibri" w:hAnsi="Calibri"/>
+        </w:rPr>
+        <w:t xml:space="preserve">, the same module that notebook 1 evaluates, so the chatbot sends exactly the requests that were evaluated. It has no baselines, test cases or metrics.</w:t>
       </w:r>
     </w:p>
     <w:tbl>
@@ -6166,7 +6318,22 @@
         <w:rPr>
           <w:rFonts w:ascii="Calibri" w:cs="Calibri" w:eastAsia="Calibri" w:hAnsi="Calibri"/>
         </w:rPr>
-        <w:t xml:space="preserve">: packages, configuration and the Groq API key (entered with </w:t>
+        <w:t xml:space="preserve">: packages, importing </w:t>
+      </w:r>
+      <w:r>
+        <w:rPr>
+          <w:rFonts w:ascii="Consolas" w:cs="Consolas" w:eastAsia="Consolas" w:hAnsi="Consolas"/>
+          <w:color w:val="1F3864"/>
+          <w:sz w:val="19"/>
+          <w:szCs w:val="19"/>
+        </w:rPr>
+        <w:t xml:space="preserve">chatbot.py</w:t>
+      </w:r>
+      <w:r>
+        <w:rPr>
+          <w:rFonts w:ascii="Calibri" w:cs="Calibri" w:eastAsia="Calibri" w:hAnsi="Calibri"/>
+        </w:rPr>
+        <w:t xml:space="preserve"> and the Groq API key (entered with </w:t>
       </w:r>
       <w:r>
         <w:rPr>
@@ -6182,180 +6349,6 @@
           <w:rFonts w:ascii="Calibri" w:cs="Calibri" w:eastAsia="Calibri" w:hAnsi="Calibri"/>
         </w:rPr>
         <w:t xml:space="preserve">, as in notebook 1).</w:t>
-      </w:r>
-    </w:p>
-    <w:p>
-      <w:pPr>
-        <w:pStyle w:val="ListParagraph"/>
-        <w:numPr>
-          <w:ilvl w:val="0"/>
-          <w:numId w:val="6"/>
-        </w:numPr>
-        <w:spacing w:after="60"/>
-      </w:pPr>
-      <w:r>
-        <w:rPr>
-          <w:rFonts w:ascii="Calibri" w:cs="Calibri" w:eastAsia="Calibri" w:hAnsi="Calibri"/>
-          <w:b/>
-          <w:bCs/>
-        </w:rPr>
-        <w:t xml:space="preserve">LLM client</w:t>
-      </w:r>
-      <w:r>
-        <w:rPr>
-          <w:rFonts w:ascii="Calibri" w:cs="Calibri" w:eastAsia="Calibri" w:hAnsi="Calibri"/>
-        </w:rPr>
-        <w:t xml:space="preserve">: </w:t>
-      </w:r>
-      <w:r>
-        <w:rPr>
-          <w:rFonts w:ascii="Consolas" w:cs="Consolas" w:eastAsia="Consolas" w:hAnsi="Consolas"/>
-          <w:color w:val="1F3864"/>
-          <w:sz w:val="19"/>
-          <w:szCs w:val="19"/>
-        </w:rPr>
-        <w:t xml:space="preserve">chat_completion()</w:t>
-      </w:r>
-      <w:r>
-        <w:rPr>
-          <w:rFonts w:ascii="Calibri" w:cs="Calibri" w:eastAsia="Calibri" w:hAnsi="Calibri"/>
-        </w:rPr>
-        <w:t xml:space="preserve"> makes one Groq call; errors are printed, not retried.</w:t>
-      </w:r>
-    </w:p>
-    <w:p>
-      <w:pPr>
-        <w:pStyle w:val="ListParagraph"/>
-        <w:numPr>
-          <w:ilvl w:val="0"/>
-          <w:numId w:val="6"/>
-        </w:numPr>
-        <w:spacing w:after="60"/>
-      </w:pPr>
-      <w:r>
-        <w:rPr>
-          <w:rFonts w:ascii="Calibri" w:cs="Calibri" w:eastAsia="Calibri" w:hAnsi="Calibri"/>
-          <w:b/>
-          <w:bCs/>
-        </w:rPr>
-        <w:t xml:space="preserve">Knowledge sources</w:t>
-      </w:r>
-      <w:r>
-        <w:rPr>
-          <w:rFonts w:ascii="Calibri" w:cs="Calibri" w:eastAsia="Calibri" w:hAnsi="Calibri"/>
-        </w:rPr>
-        <w:t xml:space="preserve">: help-centre documents and the order look-up tool.</w:t>
-      </w:r>
-    </w:p>
-    <w:p>
-      <w:pPr>
-        <w:pStyle w:val="ListParagraph"/>
-        <w:numPr>
-          <w:ilvl w:val="0"/>
-          <w:numId w:val="6"/>
-        </w:numPr>
-        <w:spacing w:after="60"/>
-      </w:pPr>
-      <w:r>
-        <w:rPr>
-          <w:rFonts w:ascii="Calibri" w:cs="Calibri" w:eastAsia="Calibri" w:hAnsi="Calibri"/>
-          <w:b/>
-          <w:bCs/>
-        </w:rPr>
-        <w:t xml:space="preserve">Retrieval</w:t>
-      </w:r>
-      <w:r>
-        <w:rPr>
-          <w:rFonts w:ascii="Calibri" w:cs="Calibri" w:eastAsia="Calibri" w:hAnsi="Calibri"/>
-        </w:rPr>
-        <w:t xml:space="preserve">: e5 vector search.</w:t>
-      </w:r>
-    </w:p>
-    <w:p>
-      <w:pPr>
-        <w:pStyle w:val="ListParagraph"/>
-        <w:numPr>
-          <w:ilvl w:val="0"/>
-          <w:numId w:val="6"/>
-        </w:numPr>
-        <w:spacing w:after="60"/>
-      </w:pPr>
-      <w:r>
-        <w:rPr>
-          <w:rFonts w:ascii="Calibri" w:cs="Calibri" w:eastAsia="Calibri" w:hAnsi="Calibri"/>
-          <w:b/>
-          <w:bCs/>
-        </w:rPr>
-        <w:t xml:space="preserve">Guardrails</w:t>
-      </w:r>
-      <w:r>
-        <w:rPr>
-          <w:rFonts w:ascii="Calibri" w:cs="Calibri" w:eastAsia="Calibri" w:hAnsi="Calibri"/>
-        </w:rPr>
-        <w:t xml:space="preserve">: input and output checks.</w:t>
-      </w:r>
-    </w:p>
-    <w:p>
-      <w:pPr>
-        <w:pStyle w:val="ListParagraph"/>
-        <w:numPr>
-          <w:ilvl w:val="0"/>
-          <w:numId w:val="6"/>
-        </w:numPr>
-        <w:spacing w:after="60"/>
-      </w:pPr>
-      <w:r>
-        <w:rPr>
-          <w:rFonts w:ascii="Calibri" w:cs="Calibri" w:eastAsia="Calibri" w:hAnsi="Calibri"/>
-          <w:b/>
-          <w:bCs/>
-        </w:rPr>
-        <w:t xml:space="preserve">Prompt</w:t>
-      </w:r>
-      <w:r>
-        <w:rPr>
-          <w:rFonts w:ascii="Calibri" w:cs="Calibri" w:eastAsia="Calibri" w:hAnsi="Calibri"/>
-        </w:rPr>
-        <w:t xml:space="preserve">: the few-shot system prompt and the JSON check.</w:t>
-      </w:r>
-    </w:p>
-    <w:p>
-      <w:pPr>
-        <w:pStyle w:val="ListParagraph"/>
-        <w:numPr>
-          <w:ilvl w:val="0"/>
-          <w:numId w:val="6"/>
-        </w:numPr>
-        <w:spacing w:after="60"/>
-      </w:pPr>
-      <w:r>
-        <w:rPr>
-          <w:rFonts w:ascii="Calibri" w:cs="Calibri" w:eastAsia="Calibri" w:hAnsi="Calibri"/>
-          <w:b/>
-          <w:bCs/>
-        </w:rPr>
-        <w:t xml:space="preserve">The chatbot</w:t>
-      </w:r>
-      <w:r>
-        <w:rPr>
-          <w:rFonts w:ascii="Calibri" w:cs="Calibri" w:eastAsia="Calibri" w:hAnsi="Calibri"/>
-        </w:rPr>
-        <w:t xml:space="preserve">: </w:t>
-      </w:r>
-      <w:r>
-        <w:rPr>
-          <w:rFonts w:ascii="Consolas" w:cs="Consolas" w:eastAsia="Consolas" w:hAnsi="Consolas"/>
-          <w:color w:val="1F3864"/>
-          <w:sz w:val="19"/>
-          <w:szCs w:val="19"/>
-        </w:rPr>
-        <w:t xml:space="preserve">ChatSession</w:t>
-      </w:r>
-      <w:r>
-        <w:rPr>
-          <w:rFonts w:ascii="Calibri" w:cs="Calibri" w:eastAsia="Calibri" w:hAnsi="Calibri"/>
-        </w:rPr>
-        <w:t xml:space="preserve">, which keeps the conversation history and the customer's e-mail.</w:t>
       </w:r>
     </w:p>
     <w:p>

</xml_diff>

<commit_message>
Handle failed tool calls in eval sweep
Catch Groq tool_use_failed errors and recover the model's generated reply when gpt-oss returns it as a nonexistent tool call. This also normalizes Unicode punctuation in the evaluation flow and refreshes the notebook, docs, and output summaries to reflect the latest benchmark results and failure analysis.
</commit_message>
<xml_diff>
--- a/chatbot_documentation.docx
+++ b/chatbot_documentation.docx
@@ -2118,6 +2118,60 @@
           <w:rFonts w:ascii="Calibri" w:cs="Calibri" w:eastAsia="Calibri" w:hAnsi="Calibri"/>
         </w:rPr>
         <w:t xml:space="preserve">: if Groq returns an error (for example because the free-tier rate limit is reached), it is printed and the reply stays empty instead of being retried,</w:t>
+      </w:r>
+    </w:p>
+    <w:p>
+      <w:pPr>
+        <w:pStyle w:val="ListParagraph"/>
+        <w:numPr>
+          <w:ilvl w:val="0"/>
+          <w:numId w:val="3"/>
+        </w:numPr>
+        <w:spacing w:after="60"/>
+      </w:pPr>
+      <w:r>
+        <w:rPr>
+          <w:rFonts w:ascii="Calibri" w:cs="Calibri" w:eastAsia="Calibri" w:hAnsi="Calibri"/>
+          <w:b/>
+          <w:bCs/>
+        </w:rPr>
+        <w:t xml:space="preserve">a reply sent as a tool call</w:t>
+      </w:r>
+      <w:r>
+        <w:rPr>
+          <w:rFonts w:ascii="Calibri" w:cs="Calibri" w:eastAsia="Calibri" w:hAnsi="Calibri"/>
+        </w:rPr>
+        <w:t xml:space="preserve">: gpt-oss sometimes sends its final JSON reply as a call to a tool that does not exist (for example "json"). Groq rejects it with </w:t>
+      </w:r>
+      <w:r>
+        <w:rPr>
+          <w:rFonts w:ascii="Consolas" w:cs="Consolas" w:eastAsia="Consolas" w:hAnsi="Consolas"/>
+          <w:color w:val="1F3864"/>
+          <w:sz w:val="19"/>
+          <w:szCs w:val="19"/>
+        </w:rPr>
+        <w:t xml:space="preserve">tool_use_failed</w:t>
+      </w:r>
+      <w:r>
+        <w:rPr>
+          <w:rFonts w:ascii="Calibri" w:cs="Calibri" w:eastAsia="Calibri" w:hAnsi="Calibri"/>
+        </w:rPr>
+        <w:t xml:space="preserve">, but the error contains the generated reply, so </w:t>
+      </w:r>
+      <w:r>
+        <w:rPr>
+          <w:rFonts w:ascii="Consolas" w:cs="Consolas" w:eastAsia="Consolas" w:hAnsi="Consolas"/>
+          <w:color w:val="1F3864"/>
+          <w:sz w:val="19"/>
+          <w:szCs w:val="19"/>
+        </w:rPr>
+        <w:t xml:space="preserve">chat_completion()</w:t>
+      </w:r>
+      <w:r>
+        <w:rPr>
+          <w:rFonts w:ascii="Calibri" w:cs="Calibri" w:eastAsia="Calibri" w:hAnsi="Calibri"/>
+        </w:rPr>
+        <w:t xml:space="preserve"> uses that reply instead of an empty one (no second request is sent),</w:t>
       </w:r>
     </w:p>
     <w:p>

</xml_diff>

<commit_message>
Simplify order lookup and multilingual replies
This commit removes email verification from the order lookup flow, so get_order_status only requires an order number and the app no longer tracks a session email. It updates the prompt instructions to prefer the customer’s latest language and to avoid asking for email when checking an order. The notebook examples and test cases were also refreshed to match the new tool contract and behavior, and the model generation settings were tuned for longer, more robust responses.
</commit_message>
<xml_diff>
--- a/chatbot_documentation.docx
+++ b/chatbot_documentation.docx
@@ -195,7 +195,7 @@
         <w:rPr>
           <w:rFonts w:ascii="Calibri" w:cs="Calibri" w:eastAsia="Calibri" w:hAnsi="Calibri"/>
         </w:rPr>
-        <w:t xml:space="preserve">: no invented policies, no leaked instructions or other customers' data, no handling of card details.</w:t>
+        <w:t xml:space="preserve">: no invented policies, no leaked instructions or e-mail addresses, no handling of card details.</w:t>
       </w:r>
     </w:p>
     <w:p>
@@ -2534,28 +2534,13 @@
           <w:b/>
           <w:bCs/>
         </w:rPr>
-        <w:t xml:space="preserve">Privacy by design.</w:t>
-      </w:r>
-      <w:r>
-        <w:rPr>
-          <w:rFonts w:ascii="Calibri" w:cs="Calibri" w:eastAsia="Calibri" w:hAnsi="Calibri"/>
-        </w:rPr>
-        <w:t xml:space="preserve"> An order is shown only if the e-mail address the customer typed matches the order. The application keeps that e-mail itself: the LLM only ever sees </w:t>
-      </w:r>
-      <w:r>
-        <w:rPr>
-          <w:rFonts w:ascii="Consolas" w:cs="Consolas" w:eastAsia="Consolas" w:hAnsi="Consolas"/>
-          <w:color w:val="1F3864"/>
-          <w:sz w:val="19"/>
-          <w:szCs w:val="19"/>
-        </w:rPr>
-        <w:t xml:space="preserve">[EMAIL REDACTED]</w:t>
-      </w:r>
-      <w:r>
-        <w:rPr>
-          <w:rFonts w:ascii="Calibri" w:cs="Calibri" w:eastAsia="Calibri" w:hAnsi="Calibri"/>
-        </w:rPr>
-        <w:t xml:space="preserve"> and never receives other customers' data.</w:t>
+        <w:t xml:space="preserve">No e-mail check.</w:t>
+      </w:r>
+      <w:r>
+        <w:rPr>
+          <w:rFonts w:ascii="Calibri" w:cs="Calibri" w:eastAsia="Calibri" w:hAnsi="Calibri"/>
+        </w:rPr>
+        <w:t xml:space="preserve"> The order number alone is enough to see an order's status, carrier, tracking code, dates and items, so the customer gets an answer at once. The tool never returns the e-mail address stored with the order, and e-mail addresses typed by the customer are redacted before anything is sent to the LLM. A real shop would add a verification step (see Limitations).</w:t>
       </w:r>
     </w:p>
     <w:p>
@@ -3862,7 +3847,7 @@
               <w:rPr>
                 <w:rFonts w:ascii="Calibri" w:cs="Calibri" w:eastAsia="Calibri" w:hAnsi="Calibri"/>
               </w:rPr>
-              <w:t xml:space="preserve">order look-up: success, missing e-mail, wrong e-mail (privacy)</w:t>
+              <w:t xml:space="preserve">order look-up: shipped, delivered and delayed orders</w:t>
             </w:r>
           </w:p>
         </w:tc>
@@ -4522,21 +4507,7 @@
         <w:rPr>
           <w:rFonts w:ascii="Calibri" w:cs="Calibri" w:eastAsia="Calibri" w:hAnsi="Calibri"/>
         </w:rPr>
-        <w:t xml:space="preserve">: card numbers (13–19 digits), e-mail addresses and phone numbers are masked before anything is sent to Groq. The customer's e-mail is kept by the </w:t>
-      </w:r>
-      <w:r>
-        <w:rPr>
-          <w:rFonts w:ascii="Calibri" w:cs="Calibri" w:eastAsia="Calibri" w:hAnsi="Calibri"/>
-          <w:i/>
-          <w:iCs/>
-        </w:rPr>
-        <w:t xml:space="preserve">application</w:t>
-      </w:r>
-      <w:r>
-        <w:rPr>
-          <w:rFonts w:ascii="Calibri" w:cs="Calibri" w:eastAsia="Calibri" w:hAnsi="Calibri"/>
-        </w:rPr>
-        <w:t xml:space="preserve"> for the order look-up.</w:t>
+        <w:t xml:space="preserve">: card numbers (13–19 digits), e-mail addresses and phone numbers are masked before anything is sent to Groq.</w:t>
       </w:r>
     </w:p>
     <w:p>
@@ -4922,7 +4893,7 @@
               <w:rPr>
                 <w:rFonts w:ascii="Calibri" w:cs="Calibri" w:eastAsia="Calibri" w:hAnsi="Calibri"/>
               </w:rPr>
-              <w:t xml:space="preserve">security rules (untrusted data in tags, no secrets, no card data, stay on topic); style (≤ 4 sentences, customer's language)</w:t>
+              <w:t xml:space="preserve">security rules (untrusted data in tags, no secrets, no card data, stay on topic); style (≤ 4 sentences, in the language of the customer's latest message, also after a language switch)</w:t>
             </w:r>
           </w:p>
         </w:tc>
@@ -5172,7 +5143,7 @@
         <w:rPr>
           <w:rFonts w:ascii="Calibri" w:cs="Calibri" w:eastAsia="Calibri" w:hAnsi="Calibri"/>
         </w:rPr>
-        <w:t xml:space="preserve">: remember the e-mail address (application side only), redact PII, stop known injection attacks.</w:t>
+        <w:t xml:space="preserve">: redact PII, stop known injection attacks.</w:t>
       </w:r>
     </w:p>
     <w:p>
@@ -5289,7 +5260,7 @@
         <w:rPr>
           <w:rFonts w:ascii="Calibri" w:cs="Calibri" w:eastAsia="Calibri" w:hAnsi="Calibri"/>
         </w:rPr>
-        <w:t xml:space="preserve">, Python runs it with the stored e-mail, then sends the result back as a </w:t>
+        <w:t xml:space="preserve">, Python runs it, then sends the result back as a </w:t>
       </w:r>
       <w:r>
         <w:rPr>
@@ -6426,7 +6397,7 @@
         <w:rPr>
           <w:rFonts w:ascii="Calibri" w:cs="Calibri" w:eastAsia="Calibri" w:hAnsi="Calibri"/>
         </w:rPr>
-        <w:t xml:space="preserve">: three single questions and a conversation with an order look-up.</w:t>
+        <w:t xml:space="preserve">: three single questions and a conversation with an order look-up and a language switch.</w:t>
       </w:r>
     </w:p>
     <w:p>
@@ -6484,7 +6455,7 @@
         <w:rPr>
           <w:rFonts w:ascii="Calibri" w:cs="Calibri" w:eastAsia="Calibri" w:hAnsi="Calibri"/>
         </w:rPr>
-        <w:t xml:space="preserve"> stops). Try an order look-up: ask about order A1001 and give the e-mail anna.k@example.com.</w:t>
+        <w:t xml:space="preserve"> stops). Try an order look-up: ask about order A1001, then switch to another language.</w:t>
       </w:r>
     </w:p>
     <w:p>
@@ -6715,7 +6686,7 @@
         <w:rPr>
           <w:rFonts w:ascii="Calibri" w:cs="Calibri" w:eastAsia="Calibri" w:hAnsi="Calibri"/>
         </w:rPr>
-        <w:t xml:space="preserve"> PII is redacted before every API call. Order data is shown only after the application verifies the e-mail address, and the LLM never sees customers' e-mail addresses. The database is opened read-only, so even a successful attack cannot change it. Real customer data would require a data-processing agreement with the API provider.</w:t>
+        <w:t xml:space="preserve"> PII is redacted before every API call, and the LLM never sees customers' e-mail addresses. Order data, however, is shown to anyone who knows the order number: there is no e-mail check, which a real shop would need before going live. The database is opened read-only, so even a successful attack cannot change it. Real customer data would require a data-processing agreement with the API provider.</w:t>
       </w:r>
     </w:p>
     <w:p>
@@ -6739,7 +6710,7 @@
         <w:rPr>
           <w:rFonts w:ascii="Calibri" w:cs="Calibri" w:eastAsia="Calibri" w:hAnsi="Calibri"/>
         </w:rPr>
-        <w:t xml:space="preserve"> The phrase filter catches only known phrasings; paraphrased attacks reach the model, which then relies on its instructions and the delimiter tags (Section 12). The real protection is the narrow tool design: even a successful injection can only look up one verified order.</w:t>
+        <w:t xml:space="preserve"> The phrase filter catches only known phrasings; paraphrased attacks reach the model, which then relies on its instructions and the delimiter tags (Section 12). The real protection is the narrow tool design: even a successful injection can only look up one order by its number.</w:t>
       </w:r>
     </w:p>
     <w:p>

</xml_diff>

<commit_message>
Add Streamlit web chat and KB wording fix
This change adds a Streamlit-based browser chat interface to the notebook workflow, including a generated web_chat.py launcher that passes the Groq API key securely into the app. It also updates the SQLite connection for multi-threaded Streamlit reruns and ignores the generated script in git. The knowledge base wording for order tracking was clarified to say status can be checked from the order number.
</commit_message>
<xml_diff>
--- a/chatbot_documentation.docx
+++ b/chatbot_documentation.docx
@@ -403,7 +403,7 @@
               <w:rPr>
                 <w:rFonts w:ascii="Calibri" w:cs="Calibri" w:eastAsia="Calibri" w:hAnsi="Calibri"/>
               </w:rPr>
-              <w:t xml:space="preserve">Runs the chatbot from chatbot.py: a short demo and an interactive chat.</w:t>
+              <w:t xml:space="preserve">Runs the chatbot from chatbot.py: a chat in the notebook and a Streamlit web chat started from the notebook.</w:t>
             </w:r>
           </w:p>
         </w:tc>
@@ -1719,7 +1719,7 @@
         <w:rPr>
           <w:rFonts w:ascii="Calibri" w:cs="Calibri" w:eastAsia="Calibri" w:hAnsi="Calibri"/>
         </w:rPr>
-        <w:t xml:space="preserve"> and chat with the bot in the last cell.</w:t>
+        <w:t xml:space="preserve"> and chat with the bot in Section 2, or in the browser with the web chat of Section 3.</w:t>
       </w:r>
     </w:p>
     <w:p>
@@ -5310,7 +5310,7 @@
         <w:rPr>
           <w:rFonts w:ascii="Calibri" w:cs="Calibri" w:eastAsia="Calibri" w:hAnsi="Calibri"/>
         </w:rPr>
-        <w:t xml:space="preserve">A short demo of the chatbot and the interactive chat are in </w:t>
+        <w:t xml:space="preserve">The interactive chat and the web chat are in </w:t>
       </w:r>
       <w:r>
         <w:rPr>
@@ -6391,13 +6391,13 @@
           <w:b/>
           <w:bCs/>
         </w:rPr>
-        <w:t xml:space="preserve">Demo</w:t>
-      </w:r>
-      <w:r>
-        <w:rPr>
-          <w:rFonts w:ascii="Calibri" w:cs="Calibri" w:eastAsia="Calibri" w:hAnsi="Calibri"/>
-        </w:rPr>
-        <w:t xml:space="preserve">: three single questions and a conversation with an order look-up and a language switch.</w:t>
+        <w:t xml:space="preserve">Chat with the bot</w:t>
+      </w:r>
+      <w:r>
+        <w:rPr>
+          <w:rFonts w:ascii="Calibri" w:cs="Calibri" w:eastAsia="Calibri" w:hAnsi="Calibri"/>
+        </w:rPr>
+        <w:t xml:space="preserve">: the interactive chat.</w:t>
       </w:r>
     </w:p>
     <w:p>
@@ -6415,13 +6415,28 @@
           <w:b/>
           <w:bCs/>
         </w:rPr>
-        <w:t xml:space="preserve">Chat with the bot</w:t>
-      </w:r>
-      <w:r>
-        <w:rPr>
-          <w:rFonts w:ascii="Calibri" w:cs="Calibri" w:eastAsia="Calibri" w:hAnsi="Calibri"/>
-        </w:rPr>
-        <w:t xml:space="preserve">: the interactive chat.</w:t>
+        <w:t xml:space="preserve">Web chat</w:t>
+      </w:r>
+      <w:r>
+        <w:rPr>
+          <w:rFonts w:ascii="Calibri" w:cs="Calibri" w:eastAsia="Calibri" w:hAnsi="Calibri"/>
+        </w:rPr>
+        <w:t xml:space="preserve">: writes </w:t>
+      </w:r>
+      <w:r>
+        <w:rPr>
+          <w:rFonts w:ascii="Consolas" w:cs="Consolas" w:eastAsia="Consolas" w:hAnsi="Consolas"/>
+          <w:color w:val="1F3864"/>
+          <w:sz w:val="19"/>
+          <w:szCs w:val="19"/>
+        </w:rPr>
+        <w:t xml:space="preserve">web_chat.py</w:t>
+      </w:r>
+      <w:r>
+        <w:rPr>
+          <w:rFonts w:ascii="Calibri" w:cs="Calibri" w:eastAsia="Calibri" w:hAnsi="Calibri"/>
+        </w:rPr>
+        <w:t xml:space="preserve"> (a small Streamlit page on top of chatbot.py) and starts it at http://localhost:8501 with the API key entered in Setup; the key is passed to the page in memory and never saved. Interrupt the cell to stop it.</w:t>
       </w:r>
     </w:p>
     <w:p>
@@ -6440,7 +6455,7 @@
         <w:rPr>
           <w:rFonts w:ascii="Calibri" w:cs="Calibri" w:eastAsia="Calibri" w:hAnsi="Calibri"/>
         </w:rPr>
-        <w:t xml:space="preserve">Run the last cell to chat with the bot in the cell's input box (an empty line or </w:t>
+        <w:t xml:space="preserve">Chat in Section 2 in the cell's input box (an empty line or </w:t>
       </w:r>
       <w:r>
         <w:rPr>
@@ -6455,7 +6470,7 @@
         <w:rPr>
           <w:rFonts w:ascii="Calibri" w:cs="Calibri" w:eastAsia="Calibri" w:hAnsi="Calibri"/>
         </w:rPr>
-        <w:t xml:space="preserve"> stops). Try an order look-up: ask about order A1001, then switch to another language.</w:t>
+        <w:t xml:space="preserve"> stops), or run Section 3 and open http://localhost:8501 (reload the page for a new conversation). Try an order look-up: ask about order A1001, then switch to another language.</w:t>
       </w:r>
     </w:p>
     <w:p>

</xml_diff>

<commit_message>
Run Streamlit chat from a temp script
Generate the web chat page in the system temp directory and launch it from the notebook, keeping generated files out of the project. Update the documentation and remove the obsolete web_chat.py ignore rule.
</commit_message>
<xml_diff>
--- a/chatbot_documentation.docx
+++ b/chatbot_documentation.docx
@@ -6421,22 +6421,37 @@
         <w:rPr>
           <w:rFonts w:ascii="Calibri" w:cs="Calibri" w:eastAsia="Calibri" w:hAnsi="Calibri"/>
         </w:rPr>
-        <w:t xml:space="preserve">: writes </w:t>
-      </w:r>
-      <w:r>
-        <w:rPr>
-          <w:rFonts w:ascii="Consolas" w:cs="Consolas" w:eastAsia="Consolas" w:hAnsi="Consolas"/>
-          <w:color w:val="1F3864"/>
-          <w:sz w:val="19"/>
-          <w:szCs w:val="19"/>
-        </w:rPr>
-        <w:t xml:space="preserve">web_chat.py</w:t>
-      </w:r>
-      <w:r>
-        <w:rPr>
-          <w:rFonts w:ascii="Calibri" w:cs="Calibri" w:eastAsia="Calibri" w:hAnsi="Calibri"/>
-        </w:rPr>
-        <w:t xml:space="preserve"> (a small Streamlit page on top of chatbot.py) and starts it at http://localhost:8501 with the API key entered in Setup; the key is passed to the page in memory and never saved. Interrupt the cell to stop it.</w:t>
+        <w:t xml:space="preserve">: running the cell builds a small Streamlit page on top of </w:t>
+      </w:r>
+      <w:r>
+        <w:rPr>
+          <w:rFonts w:ascii="Consolas" w:cs="Consolas" w:eastAsia="Consolas" w:hAnsi="Consolas"/>
+          <w:color w:val="1F3864"/>
+          <w:sz w:val="19"/>
+          <w:szCs w:val="19"/>
+        </w:rPr>
+        <w:t xml:space="preserve">chatbot.py</w:t>
+      </w:r>
+      <w:r>
+        <w:rPr>
+          <w:rFonts w:ascii="Calibri" w:cs="Calibri" w:eastAsia="Calibri" w:hAnsi="Calibri"/>
+        </w:rPr>
+        <w:t xml:space="preserve"> from the </w:t>
+      </w:r>
+      <w:r>
+        <w:rPr>
+          <w:rFonts w:ascii="Consolas" w:cs="Consolas" w:eastAsia="Consolas" w:hAnsi="Consolas"/>
+          <w:color w:val="1F3864"/>
+          <w:sz w:val="19"/>
+          <w:szCs w:val="19"/>
+        </w:rPr>
+        <w:t xml:space="preserve">web_chat()</w:t>
+      </w:r>
+      <w:r>
+        <w:rPr>
+          <w:rFonts w:ascii="Calibri" w:cs="Calibri" w:eastAsia="Calibri" w:hAnsi="Calibri"/>
+        </w:rPr>
+        <w:t xml:space="preserve"> function in the same cell and starts it right away at http://localhost:8501 with the API key entered in Setup. The key is passed to the page in memory and never saved; the page script goes to the system temp folder, not into the project. Interrupt the cell to stop the web chat.</w:t>
       </w:r>
     </w:p>
     <w:p>

</xml_diff>

<commit_message>
Harden chatbot input handling
Disable SDK retries, preserve dates during phone-number redaction, strip nested chatbot tags, and keep blocked injection attempts out of conversation history. Refresh evaluation artifacts; this run was heavily affected by Groq rate limits and reports 7/34 passes.
</commit_message>
<xml_diff>
--- a/chatbot_documentation.docx
+++ b/chatbot_documentation.docx
@@ -56,7 +56,7 @@
         <w:rPr>
           <w:rFonts w:ascii="Calibri" w:cs="Calibri" w:eastAsia="Calibri" w:hAnsi="Calibri"/>
         </w:rPr>
-        <w:t xml:space="preserve">This document holds the explanations that accompany the two notebooks of the project. The notebooks themselves contain only short headings and code comments.</w:t>
+        <w:t xml:space="preserve">This document holds the explanations that accompany the two notebooks and chatbot.py. The notebooks themselves contain only short section introductions and code comments.</w:t>
       </w:r>
     </w:p>
     <w:p>
@@ -709,6 +709,116 @@
                 <w:rFonts w:ascii="Calibri" w:cs="Calibri" w:eastAsia="Calibri" w:hAnsi="Calibri"/>
               </w:rPr>
               <w:t xml:space="preserve">.</w:t>
+            </w:r>
+          </w:p>
+        </w:tc>
+      </w:tr>
+      <w:tr>
+        <w:tc>
+          <w:tcPr>
+            <w:tcW w:type="dxa" w:w="3232"/>
+            <w:tcBorders>
+              <w:top w:val="single" w:color="BFBFBF" w:sz="4"/>
+              <w:left w:val="single" w:color="BFBFBF" w:sz="4"/>
+              <w:bottom w:val="single" w:color="BFBFBF" w:sz="4"/>
+              <w:right w:val="single" w:color="BFBFBF" w:sz="4"/>
+            </w:tcBorders>
+            <w:tcMar>
+              <w:top w:type="dxa" w:w="60"/>
+              <w:left w:type="dxa" w:w="100"/>
+              <w:bottom w:type="dxa" w:w="60"/>
+              <w:right w:type="dxa" w:w="100"/>
+            </w:tcMar>
+          </w:tcPr>
+          <w:p>
+            <w:r>
+              <w:rPr>
+                <w:rFonts w:ascii="Consolas" w:cs="Consolas" w:eastAsia="Consolas" w:hAnsi="Consolas"/>
+                <w:color w:val="1F3864"/>
+                <w:sz w:val="19"/>
+                <w:szCs w:val="19"/>
+              </w:rPr>
+              <w:t xml:space="preserve">classes/</w:t>
+            </w:r>
+          </w:p>
+        </w:tc>
+        <w:tc>
+          <w:tcPr>
+            <w:tcW w:type="dxa" w:w="6274"/>
+            <w:tcBorders>
+              <w:top w:val="single" w:color="BFBFBF" w:sz="4"/>
+              <w:left w:val="single" w:color="BFBFBF" w:sz="4"/>
+              <w:bottom w:val="single" w:color="BFBFBF" w:sz="4"/>
+              <w:right w:val="single" w:color="BFBFBF" w:sz="4"/>
+            </w:tcBorders>
+            <w:tcMar>
+              <w:top w:type="dxa" w:w="60"/>
+              <w:left w:type="dxa" w:w="100"/>
+              <w:bottom w:type="dxa" w:w="60"/>
+              <w:right w:type="dxa" w:w="100"/>
+            </w:tcMar>
+          </w:tcPr>
+          <w:p>
+            <w:r>
+              <w:rPr>
+                <w:rFonts w:ascii="Calibri" w:cs="Calibri" w:eastAsia="Calibri" w:hAnsi="Calibri"/>
+              </w:rPr>
+              <w:t xml:space="preserve">Course seminar notebooks (reference material, not part of the chatbot).</w:t>
+            </w:r>
+          </w:p>
+        </w:tc>
+      </w:tr>
+      <w:tr>
+        <w:tc>
+          <w:tcPr>
+            <w:tcW w:type="dxa" w:w="3232"/>
+            <w:tcBorders>
+              <w:top w:val="single" w:color="BFBFBF" w:sz="4"/>
+              <w:left w:val="single" w:color="BFBFBF" w:sz="4"/>
+              <w:bottom w:val="single" w:color="BFBFBF" w:sz="4"/>
+              <w:right w:val="single" w:color="BFBFBF" w:sz="4"/>
+            </w:tcBorders>
+            <w:tcMar>
+              <w:top w:type="dxa" w:w="60"/>
+              <w:left w:type="dxa" w:w="100"/>
+              <w:bottom w:type="dxa" w:w="60"/>
+              <w:right w:type="dxa" w:w="100"/>
+            </w:tcMar>
+          </w:tcPr>
+          <w:p>
+            <w:r>
+              <w:rPr>
+                <w:rFonts w:ascii="Consolas" w:cs="Consolas" w:eastAsia="Consolas" w:hAnsi="Consolas"/>
+                <w:color w:val="1F3864"/>
+                <w:sz w:val="19"/>
+                <w:szCs w:val="19"/>
+              </w:rPr>
+              <w:t xml:space="preserve">task.docx</w:t>
+            </w:r>
+          </w:p>
+        </w:tc>
+        <w:tc>
+          <w:tcPr>
+            <w:tcW w:type="dxa" w:w="6274"/>
+            <w:tcBorders>
+              <w:top w:val="single" w:color="BFBFBF" w:sz="4"/>
+              <w:left w:val="single" w:color="BFBFBF" w:sz="4"/>
+              <w:bottom w:val="single" w:color="BFBFBF" w:sz="4"/>
+              <w:right w:val="single" w:color="BFBFBF" w:sz="4"/>
+            </w:tcBorders>
+            <w:tcMar>
+              <w:top w:type="dxa" w:w="60"/>
+              <w:left w:type="dxa" w:w="100"/>
+              <w:bottom w:type="dxa" w:w="60"/>
+              <w:right w:type="dxa" w:w="100"/>
+            </w:tcMar>
+          </w:tcPr>
+          <w:p>
+            <w:r>
+              <w:rPr>
+                <w:rFonts w:ascii="Calibri" w:cs="Calibri" w:eastAsia="Calibri" w:hAnsi="Calibri"/>
+              </w:rPr>
+              <w:t xml:space="preserve">The assignment text.</w:t>
             </w:r>
           </w:p>
         </w:tc>
@@ -976,7 +1086,7 @@
               <w:rPr>
                 <w:rFonts w:ascii="Calibri" w:cs="Calibri" w:eastAsia="Calibri" w:hAnsi="Calibri"/>
               </w:rPr>
-              <w:t xml:space="preserve">§2 LLM client, §11 evaluation, test case T19</w:t>
+              <w:t xml:space="preserve">§2 LLM client, §11 evaluation (§11.2 limits of BLEU/ROUGE), §13 LLM judge, §14 failure analysis, test case T19</w:t>
             </w:r>
           </w:p>
         </w:tc>
@@ -1053,7 +1163,7 @@
               <w:rPr>
                 <w:rFonts w:ascii="Calibri" w:cs="Calibri" w:eastAsia="Calibri" w:hAnsi="Calibri"/>
               </w:rPr>
-              <w:t xml:space="preserve">§5 retrieval baseline and vector search</w:t>
+              <w:t xml:space="preserve">§5 TF-IDF baseline, §5.1 vector search</w:t>
             </w:r>
           </w:p>
         </w:tc>
@@ -1130,7 +1240,7 @@
               <w:rPr>
                 <w:rFonts w:ascii="Calibri" w:cs="Calibri" w:eastAsia="Calibri" w:hAnsi="Calibri"/>
               </w:rPr>
-              <w:t xml:space="preserve">temperature 0.2 (§2); the e5 encoder for retrieval (§5.1)</w:t>
+              <w:t xml:space="preserve">temperature 0.2 (set in chatbot.py, reported in the §15 summary); the e5 encoder for retrieval (§5.1)</w:t>
             </w:r>
           </w:p>
         </w:tc>
@@ -1182,22 +1292,7 @@
               <w:rPr>
                 <w:rFonts w:ascii="Calibri" w:cs="Calibri" w:eastAsia="Calibri" w:hAnsi="Calibri"/>
               </w:rPr>
-              <w:t xml:space="preserve">prompt anatomy (task/context/constraints/output), templates, few-shot, context-window management with </w:t>
-            </w:r>
-            <w:r>
-              <w:rPr>
-                <w:rFonts w:ascii="Consolas" w:cs="Consolas" w:eastAsia="Consolas" w:hAnsi="Consolas"/>
-                <w:color w:val="1F3864"/>
-                <w:sz w:val="19"/>
-                <w:szCs w:val="19"/>
-              </w:rPr>
-              <w:t xml:space="preserve">tiktoken</w:t>
-            </w:r>
-            <w:r>
-              <w:rPr>
-                <w:rFonts w:ascii="Calibri" w:cs="Calibri" w:eastAsia="Calibri" w:hAnsi="Calibri"/>
-              </w:rPr>
-              <w:t xml:space="preserve">, JSON output validated in code</w:t>
+              <w:t xml:space="preserve">prompt anatomy (task/context/constraints/output), templates, few-shot, context management (retrieval, history trimming) measured with tiktoken, JSON output checked in code</w:t>
             </w:r>
           </w:p>
         </w:tc>
@@ -1299,7 +1394,7 @@
               <w:rPr>
                 <w:rFonts w:ascii="Calibri" w:cs="Calibri" w:eastAsia="Calibri" w:hAnsi="Calibri"/>
               </w:rPr>
-              <w:t xml:space="preserve">§4 order database and tool, §8 guardrails, §10 chatbot loop</w:t>
+              <w:t xml:space="preserve">§4 order database and tool, §8 guardrails, §10 chatbot loop, §12 guardrail ablation</w:t>
             </w:r>
           </w:p>
         </w:tc>
@@ -1351,7 +1446,7 @@
               <w:rPr>
                 <w:rFonts w:ascii="Calibri" w:cs="Calibri" w:eastAsia="Calibri" w:hAnsi="Calibri"/>
               </w:rPr>
-              <w:t xml:space="preserve">vector search with sentence embeddings, compared with BM25 and hybrid search (reciprocal rank fusion); paragraph chunks; precision@k, recall@k and MRR; cited sources</w:t>
+              <w:t xml:space="preserve">vector search with sentence embeddings, compared with BM25 and hybrid search (reciprocal rank fusion); paragraph chunks; precision@k, recall@k and MRR; sources cited in the JSON reply</w:t>
             </w:r>
           </w:p>
         </w:tc>
@@ -1376,22 +1471,7 @@
               <w:rPr>
                 <w:rFonts w:ascii="Calibri" w:cs="Calibri" w:eastAsia="Calibri" w:hAnsi="Calibri"/>
               </w:rPr>
-              <w:t xml:space="preserve">§5 retrieval, §6.1 retrieval evaluation, </w:t>
-            </w:r>
-            <w:r>
-              <w:rPr>
-                <w:rFonts w:ascii="Consolas" w:cs="Consolas" w:eastAsia="Consolas" w:hAnsi="Consolas"/>
-                <w:color w:val="1F3864"/>
-                <w:sz w:val="19"/>
-                <w:szCs w:val="19"/>
-              </w:rPr>
-              <w:t xml:space="preserve">sources</w:t>
-            </w:r>
-            <w:r>
-              <w:rPr>
-                <w:rFonts w:ascii="Calibri" w:cs="Calibri" w:eastAsia="Calibri" w:hAnsi="Calibri"/>
-              </w:rPr>
-              <w:t xml:space="preserve"> in every reply</w:t>
+              <w:t xml:space="preserve">§5 retrieval, §6.1 retrieval evaluation, a sources field in every reply</w:t>
             </w:r>
           </w:p>
         </w:tc>
@@ -1418,7 +1498,7 @@
         <w:rPr>
           <w:rFonts w:ascii="Calibri" w:cs="Calibri" w:eastAsia="Calibri" w:hAnsi="Calibri"/>
         </w:rPr>
-        <w:t xml:space="preserve">Customer message → guardrails (PII redaction, injection filter) → e5 vector search (top 3 documents) → prompt template (rules, categories, few-shot examples, </w:t>
+        <w:t xml:space="preserve">Customer message → guardrails (PII redaction, injection filter) → e5 vector search (top 3 documents; follow-ups add the previous question) → prompt template (rules, categories, few-shot examples, the last 5 question/answer pairs, </w:t>
       </w:r>
       <w:r>
         <w:rPr>
@@ -1719,7 +1799,22 @@
         <w:rPr>
           <w:rFonts w:ascii="Calibri" w:cs="Calibri" w:eastAsia="Calibri" w:hAnsi="Calibri"/>
         </w:rPr>
-        <w:t xml:space="preserve"> and chat with the bot in Section 2, or in the browser with the web chat of Section 3.</w:t>
+        <w:t xml:space="preserve"> and chat with the bot in Section 2; an empty line or </w:t>
+      </w:r>
+      <w:r>
+        <w:rPr>
+          <w:rFonts w:ascii="Consolas" w:cs="Consolas" w:eastAsia="Consolas" w:hAnsi="Consolas"/>
+          <w:color w:val="1F3864"/>
+          <w:sz w:val="19"/>
+          <w:szCs w:val="19"/>
+        </w:rPr>
+        <w:t xml:space="preserve">quit</w:t>
+      </w:r>
+      <w:r>
+        <w:rPr>
+          <w:rFonts w:ascii="Calibri" w:cs="Calibri" w:eastAsia="Calibri" w:hAnsi="Calibri"/>
+        </w:rPr>
+        <w:t xml:space="preserve"> ends that chat, and Section 3 then starts the web chat at http://localhost:8501.</w:t>
       </w:r>
     </w:p>
     <w:p>
@@ -1765,7 +1860,7 @@
         <w:rPr>
           <w:rFonts w:ascii="Calibri" w:cs="Calibri" w:eastAsia="Calibri" w:hAnsi="Calibri"/>
         </w:rPr>
-        <w:t xml:space="preserve">. The headings match the section numbers in the notebook. The chatbot described in Sections 2–10 is implemented in </w:t>
+        <w:t xml:space="preserve">. The section numbers match the notebook; some titles here are longer. The chatbot parts described in Sections 2–4 and 7–10 and the e5 retriever of Section 5.1 are implemented in </w:t>
       </w:r>
       <w:r>
         <w:rPr>
@@ -1780,7 +1875,7 @@
         <w:rPr>
           <w:rFonts w:ascii="Calibri" w:cs="Calibri" w:eastAsia="Calibri" w:hAnsi="Calibri"/>
         </w:rPr>
-        <w:t xml:space="preserve">; the notebook imports it, shows short examples of each part and adds the evaluation code (baseline retrievers, test set, metrics, LLM judge).</w:t>
+        <w:t xml:space="preserve">; the notebook imports them, shows short examples and adds the evaluation code (baseline retrievers, test set, metrics, LLM judge).</w:t>
       </w:r>
     </w:p>
     <w:p>
@@ -2117,7 +2212,7 @@
         <w:rPr>
           <w:rFonts w:ascii="Calibri" w:cs="Calibri" w:eastAsia="Calibri" w:hAnsi="Calibri"/>
         </w:rPr>
-        <w:t xml:space="preserve">: if Groq returns an error (for example because the free-tier rate limit is reached), it is printed and the reply stays empty instead of being retried,</w:t>
+        <w:t xml:space="preserve">: the Groq client is created with max_retries=0, so the SDK does not retry either; if Groq returns an error (for example because the free-tier rate limit is reached), it is printed and the reply stays empty,</w:t>
       </w:r>
     </w:p>
     <w:p>
@@ -2279,6 +2374,27 @@
         </w:rPr>
         <w:t xml:space="preserve">, gpt-oss reasons briefly inside the model, and we receive only the final answer: a short customer reply does not need a long visible chain of thought.</w:t>
       </w:r>
+      <w:r>
+        <w:rPr>
+          <w:rFonts w:ascii="Calibri" w:cs="Calibri" w:eastAsia="Calibri" w:hAnsi="Calibri"/>
+        </w:rPr>
+        <w:t xml:space="preserve"> Replies are capped at 2,500 completion tokens (</w:t>
+      </w:r>
+      <w:r>
+        <w:rPr>
+          <w:rFonts w:ascii="Consolas" w:cs="Consolas" w:eastAsia="Consolas" w:hAnsi="Consolas"/>
+          <w:color w:val="1F3864"/>
+          <w:sz w:val="19"/>
+          <w:szCs w:val="19"/>
+        </w:rPr>
+        <w:t xml:space="preserve">MAX_COMPLETION_TOKENS</w:t>
+      </w:r>
+      <w:r>
+        <w:rPr>
+          <w:rFonts w:ascii="Calibri" w:cs="Calibri" w:eastAsia="Calibri" w:hAnsi="Calibri"/>
+        </w:rPr>
+        <w:t xml:space="preserve">).</w:t>
+      </w:r>
     </w:p>
     <w:p>
       <w:pPr>
@@ -2352,21 +2468,22 @@
         <w:rPr>
           <w:rFonts w:ascii="Calibri" w:cs="Calibri" w:eastAsia="Calibri" w:hAnsi="Calibri"/>
         </w:rPr>
-        <w:t xml:space="preserve"> and run it again). Both notebooks open the database </w:t>
-      </w:r>
-      <w:r>
-        <w:rPr>
-          <w:rFonts w:ascii="Calibri" w:cs="Calibri" w:eastAsia="Calibri" w:hAnsi="Calibri"/>
-          <w:b/>
-          <w:bCs/>
-        </w:rPr>
-        <w:t xml:space="preserve">read-only</w:t>
-      </w:r>
-      <w:r>
-        <w:rPr>
-          <w:rFonts w:ascii="Calibri" w:cs="Calibri" w:eastAsia="Calibri" w:hAnsi="Calibri"/>
-        </w:rPr>
-        <w:t xml:space="preserve">, so nothing in them, including the chatbot, can change the shop's data.</w:t>
+        <w:t xml:space="preserve"> and run it again). </w:t>
+      </w:r>
+      <w:r>
+        <w:rPr>
+          <w:rFonts w:ascii="Consolas" w:cs="Consolas" w:eastAsia="Consolas" w:hAnsi="Consolas"/>
+          <w:color w:val="1F3864"/>
+          <w:sz w:val="19"/>
+          <w:szCs w:val="19"/>
+        </w:rPr>
+        <w:t xml:space="preserve">chatbot.py</w:t>
+      </w:r>
+      <w:r>
+        <w:rPr>
+          <w:rFonts w:ascii="Calibri" w:cs="Calibri" w:eastAsia="Calibri" w:hAnsi="Calibri"/>
+        </w:rPr>
+        <w:t xml:space="preserve"> opens the database read-only (SQLite mode=ro) and both notebooks only use that connection, so nothing in them, including the chatbot, can change the shop's data.</w:t>
       </w:r>
     </w:p>
     <w:p>
@@ -2790,7 +2907,7 @@
         <w:rPr>
           <w:rFonts w:ascii="Calibri" w:cs="Calibri" w:eastAsia="Calibri" w:hAnsi="Calibri"/>
         </w:rPr>
-        <w:t xml:space="preserve">, it is multilingual, which matters for an EU shop: German and Hungarian questions find the right page.</w:t>
+        <w:t xml:space="preserve">, it is multilingual, which matters for an EU shop: a German question (test case T34) finds the right page.</w:t>
       </w:r>
     </w:p>
     <w:p>
@@ -2905,7 +3022,7 @@
         <w:rPr>
           <w:rFonts w:ascii="Calibri" w:cs="Calibri" w:eastAsia="Calibri" w:hAnsi="Calibri"/>
         </w:rPr>
-        <w:t xml:space="preserve">: one page = one chunk. Fixed windows of 70 words with a 15-word overlap were also tried and did not change the results.</w:t>
+        <w:t xml:space="preserve">: one page = one chunk. Fixed 70-word windows with a 15-word overlap were also tried outside the notebook and gave practically the same retrieval scores, so the notebook keeps paragraph chunks.</w:t>
       </w:r>
     </w:p>
     <w:p>
@@ -2993,7 +3110,7 @@
         <w:rPr>
           <w:rFonts w:ascii="Calibri" w:cs="Calibri" w:eastAsia="Calibri" w:hAnsi="Calibri"/>
         </w:rPr>
-        <w:t xml:space="preserve">The test set is fixed </w:t>
+        <w:t xml:space="preserve">The test cases are defined </w:t>
       </w:r>
       <w:r>
         <w:rPr>
@@ -3007,7 +3124,7 @@
         <w:rPr>
           <w:rFonts w:ascii="Calibri" w:cs="Calibri" w:eastAsia="Calibri" w:hAnsi="Calibri"/>
         </w:rPr>
-        <w:t xml:space="preserve"> looking at any model output, following the cycle </w:t>
+        <w:t xml:space="preserve"> the evaluation run and were revised only when the chatbot's specification changed (for example when the e-mail check and the human hand-off were dropped), following the cycle </w:t>
       </w:r>
       <w:r>
         <w:rPr>
@@ -3238,7 +3355,7 @@
         <w:rPr>
           <w:rFonts w:ascii="Calibri" w:cs="Calibri" w:eastAsia="Calibri" w:hAnsi="Calibri"/>
         </w:rPr>
-        <w:t xml:space="preserve"> appear (invented order status, leaked secrets, fake codes, echoed card numbers),</w:t>
+        <w:t xml:space="preserve"> appear (invented order status, prices or discounts, unsafe advice, leaked secrets, fake codes, echoed card numbers),</w:t>
       </w:r>
     </w:p>
     <w:p>
@@ -3263,52 +3380,22 @@
         <w:rPr>
           <w:rFonts w:ascii="Calibri" w:cs="Calibri" w:eastAsia="Calibri" w:hAnsi="Calibri"/>
         </w:rPr>
-        <w:t xml:space="preserve">: whether the order tool must be called (</w:t>
-      </w:r>
-      <w:r>
-        <w:rPr>
-          <w:rFonts w:ascii="Consolas" w:cs="Consolas" w:eastAsia="Consolas" w:hAnsi="Consolas"/>
-          <w:color w:val="1F3864"/>
-          <w:sz w:val="19"/>
-          <w:szCs w:val="19"/>
-        </w:rPr>
-        <w:t xml:space="preserve">required</w:t>
-      </w:r>
-      <w:r>
-        <w:rPr>
-          <w:rFonts w:ascii="Calibri" w:cs="Calibri" w:eastAsia="Calibri" w:hAnsi="Calibri"/>
-        </w:rPr>
-        <w:t xml:space="preserve">), must not be called (</w:t>
-      </w:r>
-      <w:r>
-        <w:rPr>
-          <w:rFonts w:ascii="Consolas" w:cs="Consolas" w:eastAsia="Consolas" w:hAnsi="Consolas"/>
-          <w:color w:val="1F3864"/>
-          <w:sz w:val="19"/>
-          <w:szCs w:val="19"/>
-        </w:rPr>
-        <w:t xml:space="preserve">none</w:t>
-      </w:r>
-      <w:r>
-        <w:rPr>
-          <w:rFonts w:ascii="Calibri" w:cs="Calibri" w:eastAsia="Calibri" w:hAnsi="Calibri"/>
-        </w:rPr>
-        <w:t xml:space="preserve">) or may be called (</w:t>
-      </w:r>
-      <w:r>
-        <w:rPr>
-          <w:rFonts w:ascii="Consolas" w:cs="Consolas" w:eastAsia="Consolas" w:hAnsi="Consolas"/>
-          <w:color w:val="1F3864"/>
-          <w:sz w:val="19"/>
-          <w:szCs w:val="19"/>
-        </w:rPr>
-        <w:t xml:space="preserve">optional</w:t>
-      </w:r>
-      <w:r>
-        <w:rPr>
-          <w:rFonts w:ascii="Calibri" w:cs="Calibri" w:eastAsia="Calibri" w:hAnsi="Calibri"/>
-        </w:rPr>
-        <w:t xml:space="preserve">),</w:t>
+        <w:t xml:space="preserve">, </w:t>
+      </w:r>
+      <w:r>
+        <w:rPr>
+          <w:rFonts w:ascii="Consolas" w:cs="Consolas" w:eastAsia="Consolas" w:hAnsi="Consolas"/>
+          <w:color w:val="1F3864"/>
+          <w:sz w:val="19"/>
+          <w:szCs w:val="19"/>
+        </w:rPr>
+        <w:t xml:space="preserve">order_id</w:t>
+      </w:r>
+      <w:r>
+        <w:rPr>
+          <w:rFonts w:ascii="Calibri" w:cs="Calibri" w:eastAsia="Calibri" w:hAnsi="Calibri"/>
+        </w:rPr>
+        <w:t xml:space="preserve">: whether the order tool must be called with the given order number (required), must not be called (none) or may be called (optional; supported but not used by the current cases),</w:t>
       </w:r>
     </w:p>
     <w:p>
@@ -3358,7 +3445,32 @@
         <w:rPr>
           <w:rFonts w:ascii="Calibri" w:cs="Calibri" w:eastAsia="Calibri" w:hAnsi="Calibri"/>
         </w:rPr>
-        <w:t xml:space="preserve">: the knowledge-base document(s) that contain the answer (for retrieval metrics).</w:t>
+        <w:t xml:space="preserve">: the knowledge-base document(s) that contain the answer (27 of the 34 cases); used for the retrieval metrics, as the LLM judge's reference and in the failure analysis,</w:t>
+      </w:r>
+    </w:p>
+    <w:p>
+      <w:pPr>
+        <w:pStyle w:val="ListParagraph"/>
+        <w:numPr>
+          <w:ilvl w:val="0"/>
+          <w:numId w:val="3"/>
+        </w:numPr>
+        <w:spacing w:after="60"/>
+      </w:pPr>
+      <w:r>
+        <w:rPr>
+          <w:rFonts w:ascii="Consolas" w:cs="Consolas" w:eastAsia="Consolas" w:hAnsi="Consolas"/>
+          <w:color w:val="1F3864"/>
+          <w:sz w:val="19"/>
+          <w:szCs w:val="19"/>
+        </w:rPr>
+        <w:t xml:space="preserve">history</w:t>
+      </w:r>
+      <w:r>
+        <w:rPr>
+          <w:rFonts w:ascii="Calibri" w:cs="Calibri" w:eastAsia="Calibri" w:hAnsi="Calibri"/>
+        </w:rPr>
+        <w:t xml:space="preserve">: earlier customer messages of the conversation (the multi-turn case).</w:t>
       </w:r>
     </w:p>
     <w:tbl>
@@ -4303,6 +4415,12 @@
         </w:rPr>
         <w:t xml:space="preserve"> (mean reciprocal rank of the first gold page within the top 3; 0 if there is none). We compare six retrievers: word-only, character-only and hybrid TF-IDF, BM25, e5 vector search (used by the chatbot) and the BM25 + e5 hybrid (RRF).</w:t>
       </w:r>
+      <w:r>
+        <w:rPr>
+          <w:rFonts w:ascii="Calibri" w:cs="Calibri" w:eastAsia="Calibri" w:hAnsi="Calibri"/>
+        </w:rPr>
+        <w:t xml:space="preserve"> 27 of the 34 cases have a gold page. Most have only one, so precision@3 cannot exceed about 0.38; recall@3 and MRR are the more informative scores.</w:t>
+      </w:r>
     </w:p>
     <w:p>
       <w:pPr>
@@ -4383,7 +4501,7 @@
         <w:rPr>
           <w:rFonts w:ascii="Calibri" w:cs="Calibri" w:eastAsia="Calibri" w:hAnsi="Calibri"/>
         </w:rPr>
-        <w:t xml:space="preserve"> question/answer pairs of a conversation are sent,</w:t>
+        <w:t xml:space="preserve"> (5) question/answer pairs are sent, each as the redacted customer message and the JSON reply; earlier documents and tool results are not sent again,</w:t>
       </w:r>
     </w:p>
     <w:p>
@@ -4421,7 +4539,7 @@
         <w:rPr>
           <w:rFonts w:ascii="Calibri" w:cs="Calibri" w:eastAsia="Calibri" w:hAnsi="Calibri"/>
         </w:rPr>
-        <w:t xml:space="preserve"> message. Groq automatically caches an identical prompt prefix for the gpt-oss models, and cached tokens do not count towards the free-tier rate limits, so the few-shot examples are almost free after the first call.</w:t>
+        <w:t xml:space="preserve"> message. Groq automatically caches an identical prompt prefix for the gpt-oss models, and cached tokens do not count towards the free-tier rate limits, so the few-shot examples are almost free after the first call (not measured in the notebook).</w:t>
       </w:r>
     </w:p>
     <w:p>
@@ -4507,7 +4625,7 @@
         <w:rPr>
           <w:rFonts w:ascii="Calibri" w:cs="Calibri" w:eastAsia="Calibri" w:hAnsi="Calibri"/>
         </w:rPr>
-        <w:t xml:space="preserve">: card numbers (13–19 digits), e-mail addresses and phone numbers are masked before anything is sent to Groq.</w:t>
+        <w:t xml:space="preserve">: card numbers (13–19 digits), e-mail addresses and phone numbers (9 or more digits and separators; dates such as 2026-10-12 or 12/10/2026 are kept) are masked before anything is sent to Groq.</w:t>
       </w:r>
     </w:p>
     <w:p>
@@ -4531,7 +4649,7 @@
         <w:rPr>
           <w:rFonts w:ascii="Calibri" w:cs="Calibri" w:eastAsia="Calibri" w:hAnsi="Calibri"/>
         </w:rPr>
-        <w:t xml:space="preserve">: a short list of phrases catches common attacks ("ignore previous instructions", "system prompt", "admin mode"). Matching messages get a fixed reply and never reach the LLM.</w:t>
+        <w:t xml:space="preserve">: nine fixed phrases (case-insensitive) catch common attacks ("ignore previous instructions", "system prompt", "admin mode"). Matching messages get a fixed reply without an LLM call and are not kept in the conversation history, so they never reach the LLM, not even with a later turn.</w:t>
       </w:r>
     </w:p>
     <w:p>
@@ -4570,7 +4688,7 @@
         <w:rPr>
           <w:rFonts w:ascii="Calibri" w:cs="Calibri" w:eastAsia="Calibri" w:hAnsi="Calibri"/>
         </w:rPr>
-        <w:t xml:space="preserve"> tags. Any of our own tag names typed by the customer are removed first, so the message cannot "close" the tag and pose as instructions.</w:t>
+        <w:t xml:space="preserve"> tags. Our own tag names typed by the customer are removed first, repeatedly until none is left, so the message cannot "close" the tag and pose as instructions.</w:t>
       </w:r>
     </w:p>
     <w:p>
@@ -4614,7 +4732,7 @@
         <w:rPr>
           <w:rFonts w:ascii="Calibri" w:cs="Calibri" w:eastAsia="Calibri" w:hAnsi="Calibri"/>
         </w:rPr>
-        <w:t xml:space="preserve">Section 12 measures what the LLM does when these rules are switched off.</w:t>
+        <w:t xml:space="preserve">Section 12 measures what the LLM does when redaction, the injection filter and the output check are switched off; the delimiter tags stay in place.</w:t>
       </w:r>
     </w:p>
     <w:p>
@@ -4841,7 +4959,7 @@
               <w:rPr>
                 <w:rFonts w:ascii="Calibri" w:cs="Calibri" w:eastAsia="Calibri" w:hAnsi="Calibri"/>
               </w:rPr>
-              <w:t xml:space="preserve"> and tool results; never guess an order status; say so when the information is missing</w:t>
+              <w:t xml:space="preserve"> and tool results; look up order numbers with the tool (no e-mail needed) and never guess an order status; say so when information is missing; no refunds, discount codes, payments or order changes; apologise briefly to upset customers</w:t>
             </w:r>
           </w:p>
         </w:tc>
@@ -4997,7 +5115,7 @@
               <w:rPr>
                 <w:rFonts w:ascii="Calibri" w:cs="Calibri" w:eastAsia="Calibri" w:hAnsi="Calibri"/>
               </w:rPr>
-              <w:t xml:space="preserve">one JSON object with fixed fields, validated in Python, outside the model</w:t>
+              <w:t xml:space="preserve">one JSON object with fixed fields, checked in Python outside the model (readable, all four fields, an allowed category); a reply without readable JSON is kept as plain text</w:t>
             </w:r>
           </w:p>
         </w:tc>
@@ -5275,7 +5393,7 @@
         <w:rPr>
           <w:rFonts w:ascii="Calibri" w:cs="Calibri" w:eastAsia="Calibri" w:hAnsi="Calibri"/>
         </w:rPr>
-        <w:t xml:space="preserve"> message. This repeats until the model answers without requesting the tool.</w:t>
+        <w:t xml:space="preserve"> message. This repeats, without an upper limit, until the model answers without requesting the tool.</w:t>
       </w:r>
     </w:p>
     <w:p>
@@ -5293,13 +5411,13 @@
           <w:b/>
           <w:bCs/>
         </w:rPr>
-        <w:t xml:space="preserve">Validation</w:t>
-      </w:r>
-      <w:r>
-        <w:rPr>
-          <w:rFonts w:ascii="Calibri" w:cs="Calibri" w:eastAsia="Calibri" w:hAnsi="Calibri"/>
-        </w:rPr>
-        <w:t xml:space="preserve">: parse and check the JSON, then run the output guard.</w:t>
+        <w:t xml:space="preserve">Validation and memory</w:t>
+      </w:r>
+      <w:r>
+        <w:rPr>
+          <w:rFonts w:ascii="Calibri" w:cs="Calibri" w:eastAsia="Calibri" w:hAnsi="Calibri"/>
+        </w:rPr>
+        <w:t xml:space="preserve">: parse and check the JSON, run the output guard, then add the redacted message and the reply to the history (messages stopped by the injection filter are not kept).</w:t>
       </w:r>
     </w:p>
     <w:p>
@@ -5344,7 +5462,7 @@
         <w:rPr>
           <w:rFonts w:ascii="Calibri" w:cs="Calibri" w:eastAsia="Calibri" w:hAnsi="Calibri"/>
         </w:rPr>
-        <w:t xml:space="preserve">We evaluate the final chatbot (retrieval, order tool, few-shot prompt and guardrails) on all 34 test cases. Section 12 re-runs the attack cases with the guardrails switched off.</w:t>
+        <w:t xml:space="preserve">We evaluate the final chatbot (retrieval, order tool, few-shot prompt and guardrails) on all 34 test cases. Section 12 re-runs the six adversarial and out-of-scope cases with the guardrails switched off.</w:t>
       </w:r>
     </w:p>
     <w:p>
@@ -5381,7 +5499,7 @@
         <w:rPr>
           <w:rFonts w:ascii="Calibri" w:cs="Calibri" w:eastAsia="Calibri" w:hAnsi="Calibri"/>
         </w:rPr>
-        <w:t xml:space="preserve"> (main metric): right behaviour (answer or decline), all key facts present, nothing forbidden, and a correct tool decision.</w:t>
+        <w:t xml:space="preserve"> (main metric): all key facts present, nothing forbidden, a correct tool decision (the right order number when the tool is required) and, for decline cases, a refusal phrase from a fixed list.</w:t>
       </w:r>
     </w:p>
     <w:p>
@@ -5457,7 +5575,7 @@
         <w:rPr>
           <w:rFonts w:ascii="Calibri" w:cs="Calibri" w:eastAsia="Calibri" w:hAnsi="Calibri"/>
         </w:rPr>
-        <w:t xml:space="preserve"> against the reference answers. Section 11.2 shows on our own data why these overlap scores are only weakly related to correctness.</w:t>
+        <w:t xml:space="preserve"> against the reference answers, for the answers written by the LLM (fixed guardrail replies are skipped). Section 11.2 compares them with the pass/fail result.</w:t>
       </w:r>
     </w:p>
     <w:p>
@@ -5519,7 +5637,7 @@
         <w:rPr>
           <w:rFonts w:ascii="Calibri" w:cs="Calibri" w:eastAsia="Calibri" w:hAnsi="Calibri"/>
         </w:rPr>
-        <w:t xml:space="preserve"> per answer: prompt and completion tokens from Groq's usage field and the measured call time.</w:t>
+        <w:t xml:space="preserve"> per answer: prompt and completion tokens from Groq's usage field and the time of all calls for the answer (an order look-up needs two calls); answers stopped by the injection filter count as 0.</w:t>
       </w:r>
     </w:p>
     <w:p>
@@ -5571,7 +5689,7 @@
         <w:rPr>
           <w:rFonts w:ascii="Calibri" w:cs="Calibri" w:eastAsia="Calibri" w:hAnsi="Calibri"/>
         </w:rPr>
-        <w:t xml:space="preserve"> sentence can score higher than a correct paraphrase. We test this on the chatbot's real answers: if ROUGE-L measured correctness, passed answers would score clearly higher than failed ones.</w:t>
+        <w:t xml:space="preserve"> sentence can score higher than a correct paraphrase. We compare the mean BLEU and ROUGE-L of passed and failed answers and look at their spread: if these scores measured correctness, passed answers would score clearly higher than failed ones.</w:t>
       </w:r>
     </w:p>
     <w:p>
@@ -5590,35 +5708,7 @@
         <w:rPr>
           <w:rFonts w:ascii="Calibri" w:cs="Calibri" w:eastAsia="Calibri" w:hAnsi="Calibri"/>
         </w:rPr>
-        <w:t xml:space="preserve">The adversarial and out-of-scope cases are re-run with </w:t>
-      </w:r>
-      <w:r>
-        <w:rPr>
-          <w:rFonts w:ascii="Calibri" w:cs="Calibri" w:eastAsia="Calibri" w:hAnsi="Calibri"/>
-          <w:b/>
-          <w:bCs/>
-        </w:rPr>
-        <w:t xml:space="preserve">guardrails switched off</w:t>
-      </w:r>
-      <w:r>
-        <w:rPr>
-          <w:rFonts w:ascii="Calibri" w:cs="Calibri" w:eastAsia="Calibri" w:hAnsi="Calibri"/>
-        </w:rPr>
-        <w:t xml:space="preserve">: no redaction, no injection filter, no output check. The model then has only its prompt to rely on, which shows how much the application-level layer adds. The card number used is the public Visa </w:t>
-      </w:r>
-      <w:r>
-        <w:rPr>
-          <w:rFonts w:ascii="Calibri" w:cs="Calibri" w:eastAsia="Calibri" w:hAnsi="Calibri"/>
-          <w:i/>
-          <w:iCs/>
-        </w:rPr>
-        <w:t xml:space="preserve">test</w:t>
-      </w:r>
-      <w:r>
-        <w:rPr>
-          <w:rFonts w:ascii="Calibri" w:cs="Calibri" w:eastAsia="Calibri" w:hAnsi="Calibri"/>
-        </w:rPr>
-        <w:t xml:space="preserve"> number, not real data.</w:t>
+        <w:t xml:space="preserve">The six adversarial and out-of-scope cases are re-run with guardrails switched off: no redaction, no injection filter, no output check; the delimiter tags stay in place. The model then has only its prompt to rely on, which shows how much the application-level layer adds. The card number used is the public Visa test number, not real data.</w:t>
       </w:r>
     </w:p>
     <w:p>
@@ -5637,21 +5727,7 @@
         <w:rPr>
           <w:rFonts w:ascii="Calibri" w:cs="Calibri" w:eastAsia="Calibri" w:hAnsi="Calibri"/>
         </w:rPr>
-        <w:t xml:space="preserve">Keyword checks are strict but brittle, and BLEU/ROUGE measure overlap rather than truth (Section 11.2). As a complementary view, a second model grades every answer of the final chatbot. It sees the </w:t>
-      </w:r>
-      <w:r>
-        <w:rPr>
-          <w:rFonts w:ascii="Calibri" w:cs="Calibri" w:eastAsia="Calibri" w:hAnsi="Calibri"/>
-          <w:b/>
-          <w:bCs/>
-        </w:rPr>
-        <w:t xml:space="preserve">reference documents, tool results and reference answer</w:t>
-      </w:r>
-      <w:r>
-        <w:rPr>
-          <w:rFonts w:ascii="Calibri" w:cs="Calibri" w:eastAsia="Calibri" w:hAnsi="Calibri"/>
-        </w:rPr>
-        <w:t xml:space="preserve">, and scores correctness, groundedness and helpfulness from 1 to 5. We then check how often the judge agrees with the rule-based result.</w:t>
+        <w:t xml:space="preserve">Keyword checks are strict but brittle, and BLEU/ROUGE measure overlap rather than truth (Section 11.2). As a complementary view, a second model grades every answer of the final chatbot. It sees the reference documents, tool results, reference answer and expected behaviour, scores correctness, groundedness and helpfulness from 1 to 5, and says whether the expected behaviour (answer or decline) was followed. A reply passes the judge if correctness is at least 4 and the behaviour is right; we report how often this agrees with the rule-based result.</w:t>
       </w:r>
     </w:p>
     <w:p>
@@ -5681,7 +5757,7 @@
         <w:rPr>
           <w:rFonts w:ascii="Calibri" w:cs="Calibri" w:eastAsia="Calibri" w:hAnsi="Calibri"/>
         </w:rPr>
-        <w:t xml:space="preserve">Every failing case of the final chatbot is listed with the likely cause:</w:t>
+        <w:t xml:space="preserve">Every failing case of the final chatbot gets an automatic first diagnosis:</w:t>
       </w:r>
     </w:p>
     <w:p>
@@ -5699,13 +5775,13 @@
           <w:b/>
           <w:bCs/>
         </w:rPr>
-        <w:t xml:space="preserve">retrieval</w:t>
-      </w:r>
-      <w:r>
-        <w:rPr>
-          <w:rFonts w:ascii="Calibri" w:cs="Calibri" w:eastAsia="Calibri" w:hAnsi="Calibri"/>
-        </w:rPr>
-        <w:t xml:space="preserve">: the gold document was not in the context,</w:t>
+        <w:t xml:space="preserve">guardrail</w:t>
+      </w:r>
+      <w:r>
+        <w:rPr>
+          <w:rFonts w:ascii="Calibri" w:cs="Calibri" w:eastAsia="Calibri" w:hAnsi="Calibri"/>
+        </w:rPr>
+        <w:t xml:space="preserve">: the reply was replaced by the injection filter or the output check,</w:t>
       </w:r>
     </w:p>
     <w:p>
@@ -5729,7 +5805,7 @@
         <w:rPr>
           <w:rFonts w:ascii="Calibri" w:cs="Calibri" w:eastAsia="Calibri" w:hAnsi="Calibri"/>
         </w:rPr>
-        <w:t xml:space="preserve">: the order tool was missed or used when it should not have been,</w:t>
+        <w:t xml:space="preserve">: the order tool was not called with the expected order number, or called when it should not have been,</w:t>
       </w:r>
     </w:p>
     <w:p>
@@ -5747,13 +5823,13 @@
           <w:b/>
           <w:bCs/>
         </w:rPr>
-        <w:t xml:space="preserve">generation</w:t>
-      </w:r>
-      <w:r>
-        <w:rPr>
-          <w:rFonts w:ascii="Calibri" w:cs="Calibri" w:eastAsia="Calibri" w:hAnsi="Calibri"/>
-        </w:rPr>
-        <w:t xml:space="preserve">: the context was right but the reply was wrong,</w:t>
+        <w:t xml:space="preserve">retrieval</w:t>
+      </w:r>
+      <w:r>
+        <w:rPr>
+          <w:rFonts w:ascii="Calibri" w:cs="Calibri" w:eastAsia="Calibri" w:hAnsi="Calibri"/>
+        </w:rPr>
+        <w:t xml:space="preserve">: the gold document was not in the top 3 (answer cases only),</w:t>
       </w:r>
     </w:p>
     <w:p>
@@ -5771,13 +5847,37 @@
           <w:b/>
           <w:bCs/>
         </w:rPr>
-        <w:t xml:space="preserve">keyword check</w:t>
-      </w:r>
-      <w:r>
-        <w:rPr>
-          <w:rFonts w:ascii="Calibri" w:cs="Calibri" w:eastAsia="Calibri" w:hAnsi="Calibri"/>
-        </w:rPr>
-        <w:t xml:space="preserve">: the reply was actually fine but the rule missed it.</w:t>
+        <w:t xml:space="preserve">generation</w:t>
+      </w:r>
+      <w:r>
+        <w:rPr>
+          <w:rFonts w:ascii="Calibri" w:cs="Calibri" w:eastAsia="Calibri" w:hAnsi="Calibri"/>
+        </w:rPr>
+        <w:t xml:space="preserve">: a decline case without a refusal phrase, or forbidden content in the reply,</w:t>
+      </w:r>
+    </w:p>
+    <w:p>
+      <w:pPr>
+        <w:pStyle w:val="ListParagraph"/>
+        <w:numPr>
+          <w:ilvl w:val="0"/>
+          <w:numId w:val="3"/>
+        </w:numPr>
+        <w:spacing w:after="60"/>
+      </w:pPr>
+      <w:r>
+        <w:rPr>
+          <w:rFonts w:ascii="Calibri" w:cs="Calibri" w:eastAsia="Calibri" w:hAnsi="Calibri"/>
+          <w:b/>
+          <w:bCs/>
+        </w:rPr>
+        <w:t xml:space="preserve">generation or keyword check</w:t>
+      </w:r>
+      <w:r>
+        <w:rPr>
+          <w:rFonts w:ascii="Calibri" w:cs="Calibri" w:eastAsia="Calibri" w:hAnsi="Calibri"/>
+        </w:rPr>
+        <w:t xml:space="preserve">: a key fact is missing; the code cannot tell whether the model left it out or the rule missed a paraphrase.</w:t>
       </w:r>
     </w:p>
     <w:p>
@@ -5788,7 +5888,7 @@
         <w:rPr>
           <w:rFonts w:ascii="Calibri" w:cs="Calibri" w:eastAsia="Calibri" w:hAnsi="Calibri"/>
         </w:rPr>
-        <w:t xml:space="preserve">Decide which is which: this is the critical interpretation the report needs.</w:t>
+        <w:t xml:space="preserve">The diagnosis is only a first guess, so every failure is also read by hand: for example, a correct refusal worded differently from the fixed refusal-phrase list is labelled a generation error.</w:t>
       </w:r>
     </w:p>
     <w:p>
@@ -5822,7 +5922,22 @@
         <w:rPr>
           <w:rFonts w:ascii="Calibri" w:cs="Calibri" w:eastAsia="Calibri" w:hAnsi="Calibri"/>
         </w:rPr>
-        <w:t xml:space="preserve">. Write your interpretation in the report next to these numbers, paying particular attention to which failures come from retrieval, tools, generation or the scoring itself. The limitations and safety considerations are in the last chapter of this document.</w:t>
+        <w:t xml:space="preserve"> (model, temperature, judge, top-k, retrieval scores, pass rate, category Exact Match, valid JSON, ROUGE-L, tokens, latency, guardrail ablation, judge and failure causes); the full metric table is in </w:t>
+      </w:r>
+      <w:r>
+        <w:rPr>
+          <w:rFonts w:ascii="Consolas" w:cs="Consolas" w:eastAsia="Consolas" w:hAnsi="Consolas"/>
+          <w:color w:val="1F3864"/>
+          <w:sz w:val="19"/>
+          <w:szCs w:val="19"/>
+        </w:rPr>
+        <w:t xml:space="preserve">outputs/overall_summary.csv</w:t>
+      </w:r>
+      <w:r>
+        <w:rPr>
+          <w:rFonts w:ascii="Calibri" w:cs="Calibri" w:eastAsia="Calibri" w:hAnsi="Calibri"/>
+        </w:rPr>
+        <w:t xml:space="preserve">. Section 14 interprets the failures; the limitations and safety considerations are in the last chapter of this document.</w:t>
       </w:r>
     </w:p>
     <w:p>
@@ -6397,7 +6512,52 @@
         <w:rPr>
           <w:rFonts w:ascii="Calibri" w:cs="Calibri" w:eastAsia="Calibri" w:hAnsi="Calibri"/>
         </w:rPr>
-        <w:t xml:space="preserve">: the interactive chat.</w:t>
+        <w:t xml:space="preserve">: an </w:t>
+      </w:r>
+      <w:r>
+        <w:rPr>
+          <w:rFonts w:ascii="Consolas" w:cs="Consolas" w:eastAsia="Consolas" w:hAnsi="Consolas"/>
+          <w:color w:val="1F3864"/>
+          <w:sz w:val="19"/>
+          <w:szCs w:val="19"/>
+        </w:rPr>
+        <w:t xml:space="preserve">input()</w:t>
+      </w:r>
+      <w:r>
+        <w:rPr>
+          <w:rFonts w:ascii="Calibri" w:cs="Calibri" w:eastAsia="Calibri" w:hAnsi="Calibri"/>
+        </w:rPr>
+        <w:t xml:space="preserve"> loop; every answer is printed with its category, urgency, sources, tool calls and guardrail result (an empty line, </w:t>
+      </w:r>
+      <w:r>
+        <w:rPr>
+          <w:rFonts w:ascii="Consolas" w:cs="Consolas" w:eastAsia="Consolas" w:hAnsi="Consolas"/>
+          <w:color w:val="1F3864"/>
+          <w:sz w:val="19"/>
+          <w:szCs w:val="19"/>
+        </w:rPr>
+        <w:t xml:space="preserve">quit</w:t>
+      </w:r>
+      <w:r>
+        <w:rPr>
+          <w:rFonts w:ascii="Calibri" w:cs="Calibri" w:eastAsia="Calibri" w:hAnsi="Calibri"/>
+        </w:rPr>
+        <w:t xml:space="preserve"> or </w:t>
+      </w:r>
+      <w:r>
+        <w:rPr>
+          <w:rFonts w:ascii="Consolas" w:cs="Consolas" w:eastAsia="Consolas" w:hAnsi="Consolas"/>
+          <w:color w:val="1F3864"/>
+          <w:sz w:val="19"/>
+          <w:szCs w:val="19"/>
+        </w:rPr>
+        <w:t xml:space="preserve">exit</w:t>
+      </w:r>
+      <w:r>
+        <w:rPr>
+          <w:rFonts w:ascii="Calibri" w:cs="Calibri" w:eastAsia="Calibri" w:hAnsi="Calibri"/>
+        </w:rPr>
+        <w:t xml:space="preserve"> stops).</w:t>
       </w:r>
     </w:p>
     <w:p>
@@ -6421,7 +6581,22 @@
         <w:rPr>
           <w:rFonts w:ascii="Calibri" w:cs="Calibri" w:eastAsia="Calibri" w:hAnsi="Calibri"/>
         </w:rPr>
-        <w:t xml:space="preserve">: running the cell builds a small Streamlit page on top of </w:t>
+        <w:t xml:space="preserve">: running the cell writes the </w:t>
+      </w:r>
+      <w:r>
+        <w:rPr>
+          <w:rFonts w:ascii="Consolas" w:cs="Consolas" w:eastAsia="Consolas" w:hAnsi="Consolas"/>
+          <w:color w:val="1F3864"/>
+          <w:sz w:val="19"/>
+          <w:szCs w:val="19"/>
+        </w:rPr>
+        <w:t xml:space="preserve">web_chat()</w:t>
+      </w:r>
+      <w:r>
+        <w:rPr>
+          <w:rFonts w:ascii="Calibri" w:cs="Calibri" w:eastAsia="Calibri" w:hAnsi="Calibri"/>
+        </w:rPr>
+        <w:t xml:space="preserve"> function of the same cell to the system temp folder (not into the project) and starts it with Streamlit at http://localhost:8501, reachable only from this computer. The API key from Setup is passed to the server process in memory (an environment variable) and never saved. The page loads </w:t>
       </w:r>
       <w:r>
         <w:rPr>
@@ -6436,22 +6611,22 @@
         <w:rPr>
           <w:rFonts w:ascii="Calibri" w:cs="Calibri" w:eastAsia="Calibri" w:hAnsi="Calibri"/>
         </w:rPr>
-        <w:t xml:space="preserve"> from the </w:t>
-      </w:r>
-      <w:r>
-        <w:rPr>
-          <w:rFonts w:ascii="Consolas" w:cs="Consolas" w:eastAsia="Consolas" w:hAnsi="Consolas"/>
-          <w:color w:val="1F3864"/>
-          <w:sz w:val="19"/>
-          <w:szCs w:val="19"/>
-        </w:rPr>
-        <w:t xml:space="preserve">web_chat()</w:t>
-      </w:r>
-      <w:r>
-        <w:rPr>
-          <w:rFonts w:ascii="Calibri" w:cs="Calibri" w:eastAsia="Calibri" w:hAnsi="Calibri"/>
-        </w:rPr>
-        <w:t xml:space="preserve"> function in the same cell and starts it right away at http://localhost:8501 with the API key entered in Setup. The key is passed to the page in memory and never saved; the page script goes to the system temp folder, not into the project. Interrupt the cell to stop the web chat.</w:t>
+        <w:t xml:space="preserve"> once (</w:t>
+      </w:r>
+      <w:r>
+        <w:rPr>
+          <w:rFonts w:ascii="Consolas" w:cs="Consolas" w:eastAsia="Consolas" w:hAnsi="Consolas"/>
+          <w:color w:val="1F3864"/>
+          <w:sz w:val="19"/>
+          <w:szCs w:val="19"/>
+        </w:rPr>
+        <w:t xml:space="preserve">st.cache_resource</w:t>
+      </w:r>
+      <w:r>
+        <w:rPr>
+          <w:rFonts w:ascii="Calibri" w:cs="Calibri" w:eastAsia="Calibri" w:hAnsi="Calibri"/>
+        </w:rPr>
+        <w:t xml:space="preserve">), keeps one conversation per browser tab and shows only the answer text. If port 8501 is already in use, the cell says so; interrupt the cell to stop the web chat.</w:t>
       </w:r>
     </w:p>
     <w:p>
@@ -6550,7 +6725,7 @@
         <w:rPr>
           <w:rFonts w:ascii="Calibri" w:cs="Calibri" w:eastAsia="Calibri" w:hAnsi="Calibri"/>
         </w:rPr>
-        <w:t xml:space="preserve"> TF-IDF and BM25 match words, not meaning, so synonyms ("broken" vs "damaged") and other languages fail; vector search fixes these cases (Section 6.1). Its similarity scores, however, lie in a narrow band, so they cannot reliably separate off-topic questions from real ones: the top 3 pages are always passed on and the prompt decides. The embedding model is not tuned to the shop and is a ~470 MB download on the first run. Combining it with BM25 (RRF) made retrieval worse on this data.</w:t>
+        <w:t xml:space="preserve"> TF-IDF and BM25 match words, not meaning, so synonyms ("broken" vs "damaged") and other languages fail; vector search fixes these cases (Sections 5.1 and 6.1). Its similarity scores, however, lie in a narrow band (top-1 cosine about 0.79–0.90 on the test set), so they cannot reliably separate off-topic questions from real ones: the top 3 pages are always passed on and the prompt decides. The embedding model is not tuned to the shop and is a ~470 MB download on the first run. Combining it with BM25 (RRF) made retrieval worse on this data.</w:t>
       </w:r>
     </w:p>
     <w:p>
@@ -6574,7 +6749,7 @@
         <w:rPr>
           <w:rFonts w:ascii="Calibri" w:cs="Calibri" w:eastAsia="Calibri" w:hAnsi="Calibri"/>
         </w:rPr>
-        <w:t xml:space="preserve"> Keyword checks can miss correct paraphrases, and BLEU/ROUGE reward word overlap rather than truth (Section 11.2). The LLM judge is noisy too, so human review of the failures remains necessary.</w:t>
+        <w:t xml:space="preserve"> Keyword checks can miss correct paraphrases (for example a refusal worded differently from the fixed phrase list), and BLEU/ROUGE reward word overlap rather than truth (Section 11.2). The LLM judge is noisy too, so human review of the failures remains necessary.</w:t>
       </w:r>
     </w:p>
     <w:p>
@@ -6598,7 +6773,7 @@
         <w:rPr>
           <w:rFonts w:ascii="Calibri" w:cs="Calibri" w:eastAsia="Calibri" w:hAnsi="Calibri"/>
         </w:rPr>
-        <w:t xml:space="preserve"> Even at low temperature the model can answer differently between runs (generation picks each token from a probability distribution). Responses are not cached, so a re-run can give slightly different results; report the model ID and the date of the run.</w:t>
+        <w:t xml:space="preserve"> Even at low temperature the model can answer differently between runs (generation picks each token from a probability distribution). Responses are not cached, so a re-run can give slightly different results; run_summary.txt records the model ID and temperature; report them with the date of the run, and restart the kernel before a run so that changes in chatbot.py take effect.</w:t>
       </w:r>
     </w:p>
     <w:p>
@@ -6660,15 +6835,7 @@
         <w:rPr>
           <w:rFonts w:ascii="Calibri" w:cs="Calibri" w:eastAsia="Calibri" w:hAnsi="Calibri"/>
         </w:rPr>
-        <w:t xml:space="preserve"> cap the evaluation size. The notebooks do not wait between calls or retry, so a call that hits the rate limit fails and its test case counts as failed.</w:t>
-      </w:r>
-    </w:p>
-    <w:p>
-      <w:pPr>
-        <w:pStyle w:val="Heading2"/>
-      </w:pPr>
-      <w:r>
-        <w:t xml:space="preserve">Safety considerations</w:t>
+        <w:t xml:space="preserve"> cap the evaluation size. The notebooks do not pause between calls and nothing is retried (the Groq SDK's retries are switched off), so a call that hits the rate limit fails and its test case counts as failed.</w:t>
       </w:r>
     </w:p>
     <w:p>
@@ -6686,13 +6853,21 @@
           <w:b/>
           <w:bCs/>
         </w:rPr>
-        <w:t xml:space="preserve">Hallucinated policies</w:t>
-      </w:r>
-      <w:r>
-        <w:rPr>
-          <w:rFonts w:ascii="Calibri" w:cs="Calibri" w:eastAsia="Calibri" w:hAnsi="Calibri"/>
-        </w:rPr>
-        <w:t xml:space="preserve"> are the main business risk: a bot that invents a refund rule creates a liability. Grounding and the false-premise test (T19) address and measure this.</w:t>
+        <w:t xml:space="preserve">Simple patterns.</w:t>
+      </w:r>
+      <w:r>
+        <w:rPr>
+          <w:rFonts w:ascii="Calibri" w:cs="Calibri" w:eastAsia="Calibri" w:hAnsi="Calibri"/>
+        </w:rPr>
+        <w:t xml:space="preserve"> The injection filter and the PII rules are plain patterns: the filter can block a harmless message that happens to contain one of its phrases, the phone rule can mask a long number that is not a phone number, and the model may call the order tool without a limit.</w:t>
+      </w:r>
+    </w:p>
+    <w:p>
+      <w:pPr>
+        <w:pStyle w:val="Heading2"/>
+      </w:pPr>
+      <w:r>
+        <w:t xml:space="preserve">Safety considerations</w:t>
       </w:r>
     </w:p>
     <w:p>
@@ -6710,13 +6885,13 @@
           <w:b/>
           <w:bCs/>
         </w:rPr>
-        <w:t xml:space="preserve">Privacy (GDPR).</w:t>
-      </w:r>
-      <w:r>
-        <w:rPr>
-          <w:rFonts w:ascii="Calibri" w:cs="Calibri" w:eastAsia="Calibri" w:hAnsi="Calibri"/>
-        </w:rPr>
-        <w:t xml:space="preserve"> PII is redacted before every API call, and the LLM never sees customers' e-mail addresses. Order data, however, is shown to anyone who knows the order number: there is no e-mail check, which a real shop would need before going live. The database is opened read-only, so even a successful attack cannot change it. Real customer data would require a data-processing agreement with the API provider.</w:t>
+        <w:t xml:space="preserve">Hallucinated policies</w:t>
+      </w:r>
+      <w:r>
+        <w:rPr>
+          <w:rFonts w:ascii="Calibri" w:cs="Calibri" w:eastAsia="Calibri" w:hAnsi="Calibri"/>
+        </w:rPr>
+        <w:t xml:space="preserve"> are the main business risk: a bot that invents a refund rule creates a liability. Grounding and the false-premise test (T19) address and measure this.</w:t>
       </w:r>
     </w:p>
     <w:p>
@@ -6734,13 +6909,13 @@
           <w:b/>
           <w:bCs/>
         </w:rPr>
-        <w:t xml:space="preserve">Prompt injection.</w:t>
-      </w:r>
-      <w:r>
-        <w:rPr>
-          <w:rFonts w:ascii="Calibri" w:cs="Calibri" w:eastAsia="Calibri" w:hAnsi="Calibri"/>
-        </w:rPr>
-        <w:t xml:space="preserve"> The phrase filter catches only known phrasings; paraphrased attacks reach the model, which then relies on its instructions and the delimiter tags (Section 12). The real protection is the narrow tool design: even a successful injection can only look up one order by its number.</w:t>
+        <w:t xml:space="preserve">Privacy (GDPR).</w:t>
+      </w:r>
+      <w:r>
+        <w:rPr>
+          <w:rFonts w:ascii="Calibri" w:cs="Calibri" w:eastAsia="Calibri" w:hAnsi="Calibri"/>
+        </w:rPr>
+        <w:t xml:space="preserve"> PII is redacted before every chatbot call, and the chatbot's LLM never sees customers' e-mail addresses (the evaluation's judge and ablation runs use the raw synthetic test messages). Order data, however, is shown to anyone who knows the order number: there is no e-mail check, which a real shop would need before going live. The database is opened read-only, so even a successful attack cannot change it. Real customer data would require a data-processing agreement with the API provider.</w:t>
       </w:r>
     </w:p>
     <w:p>
@@ -6758,13 +6933,13 @@
           <w:b/>
           <w:bCs/>
         </w:rPr>
-        <w:t xml:space="preserve">Physical safety.</w:t>
-      </w:r>
-      <w:r>
-        <w:rPr>
-          <w:rFonts w:ascii="Calibri" w:cs="Calibri" w:eastAsia="Calibri" w:hAnsi="Calibri"/>
-        </w:rPr>
-        <w:t xml:space="preserve"> Product-safety questions (stove in a tent) must get conservative, documented advice; the knowledge base contains an explicit safety page.</w:t>
+        <w:t xml:space="preserve">Prompt injection.</w:t>
+      </w:r>
+      <w:r>
+        <w:rPr>
+          <w:rFonts w:ascii="Calibri" w:cs="Calibri" w:eastAsia="Calibri" w:hAnsi="Calibri"/>
+        </w:rPr>
+        <w:t xml:space="preserve"> The phrase filter catches only known phrasings; paraphrased attacks reach the model, which then relies on its instructions and the delimiter tags (Section 12). The real protection is the narrow tool design: even a successful injection can only look up orders one number at a time; it cannot list or change them.</w:t>
       </w:r>
     </w:p>
     <w:p>
@@ -6782,13 +6957,37 @@
           <w:b/>
           <w:bCs/>
         </w:rPr>
+        <w:t xml:space="preserve">Physical safety.</w:t>
+      </w:r>
+      <w:r>
+        <w:rPr>
+          <w:rFonts w:ascii="Calibri" w:cs="Calibri" w:eastAsia="Calibri" w:hAnsi="Calibri"/>
+        </w:rPr>
+        <w:t xml:space="preserve"> Product-safety questions (stove in a tent) must get conservative, documented advice; the knowledge base contains an explicit safety page.</w:t>
+      </w:r>
+    </w:p>
+    <w:p>
+      <w:pPr>
+        <w:pStyle w:val="ListParagraph"/>
+        <w:numPr>
+          <w:ilvl w:val="0"/>
+          <w:numId w:val="3"/>
+        </w:numPr>
+        <w:spacing w:after="60"/>
+      </w:pPr>
+      <w:r>
+        <w:rPr>
+          <w:rFonts w:ascii="Calibri" w:cs="Calibri" w:eastAsia="Calibri" w:hAnsi="Calibri"/>
+          <w:b/>
+          <w:bCs/>
+        </w:rPr>
         <w:t xml:space="preserve">Transparency.</w:t>
       </w:r>
       <w:r>
         <w:rPr>
           <w:rFonts w:ascii="Calibri" w:cs="Calibri" w:eastAsia="Calibri" w:hAnsi="Calibri"/>
         </w:rPr>
-        <w:t xml:space="preserve"> Customers should know they are talking to an AI (EU AI Act transparency obligations for chatbots). The prototype has no human hand-off; a production system would need an easy route to a human, for example the support contact listed in the knowledge base.</w:t>
+        <w:t xml:space="preserve"> Customers should know they are talking to an AI (EU AI Act transparency obligations for chatbots); the web chat does not show such a notice yet. The prototype has no human hand-off; a production system would need an easy route to a human, for example the support contact listed in the knowledge base.</w:t>
       </w:r>
     </w:p>
     <w:sectPr>

</xml_diff>

<commit_message>
Retry transient Groq API failures
Configure the Groq client to retry rate limits, timeouts, and server errors up to five times. Update the chatbot documentation accordingly.
</commit_message>
<xml_diff>
--- a/chatbot_documentation.docx
+++ b/chatbot_documentation.docx
@@ -2206,13 +2206,13 @@
           <w:b/>
           <w:bCs/>
         </w:rPr>
-        <w:t xml:space="preserve">no retries</w:t>
-      </w:r>
-      <w:r>
-        <w:rPr>
-          <w:rFonts w:ascii="Calibri" w:cs="Calibri" w:eastAsia="Calibri" w:hAnsi="Calibri"/>
-        </w:rPr>
-        <w:t xml:space="preserve">: the Groq client is created with max_retries=0, so the SDK does not retry either; if Groq returns an error (for example because the free-tier rate limit is reached), it is printed and the reply stays empty,</w:t>
+        <w:t xml:space="preserve">retries on rate limits</w:t>
+      </w:r>
+      <w:r>
+        <w:rPr>
+          <w:rFonts w:ascii="Calibri" w:cs="Calibri" w:eastAsia="Calibri" w:hAnsi="Calibri"/>
+        </w:rPr>
+        <w:t xml:space="preserve">: the Groq client is created with max_retries=5, so on a rate limit (HTTP 429), a timeout or a server error the SDK waits as long as Groq asks and tries again; if the call still fails, the error is printed and the reply stays empty,</w:t>
       </w:r>
     </w:p>
     <w:p>
@@ -6835,7 +6835,7 @@
         <w:rPr>
           <w:rFonts w:ascii="Calibri" w:cs="Calibri" w:eastAsia="Calibri" w:hAnsi="Calibri"/>
         </w:rPr>
-        <w:t xml:space="preserve"> cap the evaluation size. The notebooks do not pause between calls and nothing is retried (the Groq SDK's retries are switched off), so a call that hits the rate limit fails and its test case counts as failed.</w:t>
+        <w:t xml:space="preserve"> cap the evaluation size and add waiting time: the notebooks do not pause between calls, but the Groq SDK waits and retries (up to 5 times) when a call hits the rate limit; a call that still fails counts as a failed test case.</w:t>
       </w:r>
     </w:p>
     <w:p>

</xml_diff>

<commit_message>
Improve chatbot evaluation results
Update chatbot PII redaction and conversation handling, and refresh evaluation outputs showing a 97% pass rate. Remove explicit Groq client retries.
</commit_message>
<xml_diff>
--- a/chatbot_documentation.docx
+++ b/chatbot_documentation.docx
@@ -56,7 +56,7 @@
         <w:rPr>
           <w:rFonts w:ascii="Calibri" w:cs="Calibri" w:eastAsia="Calibri" w:hAnsi="Calibri"/>
         </w:rPr>
-        <w:t xml:space="preserve">This document holds the explanations that accompany the two notebooks and chatbot.py. The notebooks themselves contain only short section introductions and code comments.</w:t>
+        <w:t xml:space="preserve">This document holds the explanations that accompany the two notebooks of the project. The notebooks themselves contain only short headings and code comments.</w:t>
       </w:r>
     </w:p>
     <w:p>
@@ -709,116 +709,6 @@
                 <w:rFonts w:ascii="Calibri" w:cs="Calibri" w:eastAsia="Calibri" w:hAnsi="Calibri"/>
               </w:rPr>
               <w:t xml:space="preserve">.</w:t>
-            </w:r>
-          </w:p>
-        </w:tc>
-      </w:tr>
-      <w:tr>
-        <w:tc>
-          <w:tcPr>
-            <w:tcW w:type="dxa" w:w="3232"/>
-            <w:tcBorders>
-              <w:top w:val="single" w:color="BFBFBF" w:sz="4"/>
-              <w:left w:val="single" w:color="BFBFBF" w:sz="4"/>
-              <w:bottom w:val="single" w:color="BFBFBF" w:sz="4"/>
-              <w:right w:val="single" w:color="BFBFBF" w:sz="4"/>
-            </w:tcBorders>
-            <w:tcMar>
-              <w:top w:type="dxa" w:w="60"/>
-              <w:left w:type="dxa" w:w="100"/>
-              <w:bottom w:type="dxa" w:w="60"/>
-              <w:right w:type="dxa" w:w="100"/>
-            </w:tcMar>
-          </w:tcPr>
-          <w:p>
-            <w:r>
-              <w:rPr>
-                <w:rFonts w:ascii="Consolas" w:cs="Consolas" w:eastAsia="Consolas" w:hAnsi="Consolas"/>
-                <w:color w:val="1F3864"/>
-                <w:sz w:val="19"/>
-                <w:szCs w:val="19"/>
-              </w:rPr>
-              <w:t xml:space="preserve">classes/</w:t>
-            </w:r>
-          </w:p>
-        </w:tc>
-        <w:tc>
-          <w:tcPr>
-            <w:tcW w:type="dxa" w:w="6274"/>
-            <w:tcBorders>
-              <w:top w:val="single" w:color="BFBFBF" w:sz="4"/>
-              <w:left w:val="single" w:color="BFBFBF" w:sz="4"/>
-              <w:bottom w:val="single" w:color="BFBFBF" w:sz="4"/>
-              <w:right w:val="single" w:color="BFBFBF" w:sz="4"/>
-            </w:tcBorders>
-            <w:tcMar>
-              <w:top w:type="dxa" w:w="60"/>
-              <w:left w:type="dxa" w:w="100"/>
-              <w:bottom w:type="dxa" w:w="60"/>
-              <w:right w:type="dxa" w:w="100"/>
-            </w:tcMar>
-          </w:tcPr>
-          <w:p>
-            <w:r>
-              <w:rPr>
-                <w:rFonts w:ascii="Calibri" w:cs="Calibri" w:eastAsia="Calibri" w:hAnsi="Calibri"/>
-              </w:rPr>
-              <w:t xml:space="preserve">Course seminar notebooks (reference material, not part of the chatbot).</w:t>
-            </w:r>
-          </w:p>
-        </w:tc>
-      </w:tr>
-      <w:tr>
-        <w:tc>
-          <w:tcPr>
-            <w:tcW w:type="dxa" w:w="3232"/>
-            <w:tcBorders>
-              <w:top w:val="single" w:color="BFBFBF" w:sz="4"/>
-              <w:left w:val="single" w:color="BFBFBF" w:sz="4"/>
-              <w:bottom w:val="single" w:color="BFBFBF" w:sz="4"/>
-              <w:right w:val="single" w:color="BFBFBF" w:sz="4"/>
-            </w:tcBorders>
-            <w:tcMar>
-              <w:top w:type="dxa" w:w="60"/>
-              <w:left w:type="dxa" w:w="100"/>
-              <w:bottom w:type="dxa" w:w="60"/>
-              <w:right w:type="dxa" w:w="100"/>
-            </w:tcMar>
-          </w:tcPr>
-          <w:p>
-            <w:r>
-              <w:rPr>
-                <w:rFonts w:ascii="Consolas" w:cs="Consolas" w:eastAsia="Consolas" w:hAnsi="Consolas"/>
-                <w:color w:val="1F3864"/>
-                <w:sz w:val="19"/>
-                <w:szCs w:val="19"/>
-              </w:rPr>
-              <w:t xml:space="preserve">task.docx</w:t>
-            </w:r>
-          </w:p>
-        </w:tc>
-        <w:tc>
-          <w:tcPr>
-            <w:tcW w:type="dxa" w:w="6274"/>
-            <w:tcBorders>
-              <w:top w:val="single" w:color="BFBFBF" w:sz="4"/>
-              <w:left w:val="single" w:color="BFBFBF" w:sz="4"/>
-              <w:bottom w:val="single" w:color="BFBFBF" w:sz="4"/>
-              <w:right w:val="single" w:color="BFBFBF" w:sz="4"/>
-            </w:tcBorders>
-            <w:tcMar>
-              <w:top w:type="dxa" w:w="60"/>
-              <w:left w:type="dxa" w:w="100"/>
-              <w:bottom w:type="dxa" w:w="60"/>
-              <w:right w:type="dxa" w:w="100"/>
-            </w:tcMar>
-          </w:tcPr>
-          <w:p>
-            <w:r>
-              <w:rPr>
-                <w:rFonts w:ascii="Calibri" w:cs="Calibri" w:eastAsia="Calibri" w:hAnsi="Calibri"/>
-              </w:rPr>
-              <w:t xml:space="preserve">The assignment text.</w:t>
             </w:r>
           </w:p>
         </w:tc>
@@ -1086,7 +976,7 @@
               <w:rPr>
                 <w:rFonts w:ascii="Calibri" w:cs="Calibri" w:eastAsia="Calibri" w:hAnsi="Calibri"/>
               </w:rPr>
-              <w:t xml:space="preserve">§2 LLM client, §11 evaluation (§11.2 limits of BLEU/ROUGE), §13 LLM judge, §14 failure analysis, test case T19</w:t>
+              <w:t xml:space="preserve">§2 LLM client, §11 evaluation, test case T19</w:t>
             </w:r>
           </w:p>
         </w:tc>
@@ -1163,7 +1053,7 @@
               <w:rPr>
                 <w:rFonts w:ascii="Calibri" w:cs="Calibri" w:eastAsia="Calibri" w:hAnsi="Calibri"/>
               </w:rPr>
-              <w:t xml:space="preserve">§5 TF-IDF baseline, §5.1 vector search</w:t>
+              <w:t xml:space="preserve">§5 retrieval baseline and vector search</w:t>
             </w:r>
           </w:p>
         </w:tc>
@@ -1240,7 +1130,7 @@
               <w:rPr>
                 <w:rFonts w:ascii="Calibri" w:cs="Calibri" w:eastAsia="Calibri" w:hAnsi="Calibri"/>
               </w:rPr>
-              <w:t xml:space="preserve">temperature 0.2 (set in chatbot.py, reported in the §15 summary); the e5 encoder for retrieval (§5.1)</w:t>
+              <w:t xml:space="preserve">temperature 0.2 (§2); the e5 encoder for retrieval (§5.1)</w:t>
             </w:r>
           </w:p>
         </w:tc>
@@ -1292,7 +1182,22 @@
               <w:rPr>
                 <w:rFonts w:ascii="Calibri" w:cs="Calibri" w:eastAsia="Calibri" w:hAnsi="Calibri"/>
               </w:rPr>
-              <w:t xml:space="preserve">prompt anatomy (task/context/constraints/output), templates, few-shot, context management (retrieval, history trimming) measured with tiktoken, JSON output checked in code</w:t>
+              <w:t xml:space="preserve">prompt anatomy (task/context/constraints/output), templates, few-shot, context-window management with </w:t>
+            </w:r>
+            <w:r>
+              <w:rPr>
+                <w:rFonts w:ascii="Consolas" w:cs="Consolas" w:eastAsia="Consolas" w:hAnsi="Consolas"/>
+                <w:color w:val="1F3864"/>
+                <w:sz w:val="19"/>
+                <w:szCs w:val="19"/>
+              </w:rPr>
+              <w:t xml:space="preserve">tiktoken</w:t>
+            </w:r>
+            <w:r>
+              <w:rPr>
+                <w:rFonts w:ascii="Calibri" w:cs="Calibri" w:eastAsia="Calibri" w:hAnsi="Calibri"/>
+              </w:rPr>
+              <w:t xml:space="preserve">, JSON output validated in code</w:t>
             </w:r>
           </w:p>
         </w:tc>
@@ -1394,7 +1299,7 @@
               <w:rPr>
                 <w:rFonts w:ascii="Calibri" w:cs="Calibri" w:eastAsia="Calibri" w:hAnsi="Calibri"/>
               </w:rPr>
-              <w:t xml:space="preserve">§4 order database and tool, §8 guardrails, §10 chatbot loop, §12 guardrail ablation</w:t>
+              <w:t xml:space="preserve">§4 order database and tool, §8 guardrails, §10 chatbot loop</w:t>
             </w:r>
           </w:p>
         </w:tc>
@@ -1446,7 +1351,7 @@
               <w:rPr>
                 <w:rFonts w:ascii="Calibri" w:cs="Calibri" w:eastAsia="Calibri" w:hAnsi="Calibri"/>
               </w:rPr>
-              <w:t xml:space="preserve">vector search with sentence embeddings, compared with BM25 and hybrid search (reciprocal rank fusion); paragraph chunks; precision@k, recall@k and MRR; sources cited in the JSON reply</w:t>
+              <w:t xml:space="preserve">vector search with sentence embeddings, compared with BM25 and hybrid search (reciprocal rank fusion); paragraph chunks; precision@k, recall@k and MRR; cited sources</w:t>
             </w:r>
           </w:p>
         </w:tc>
@@ -1471,7 +1376,22 @@
               <w:rPr>
                 <w:rFonts w:ascii="Calibri" w:cs="Calibri" w:eastAsia="Calibri" w:hAnsi="Calibri"/>
               </w:rPr>
-              <w:t xml:space="preserve">§5 retrieval, §6.1 retrieval evaluation, a sources field in every reply</w:t>
+              <w:t xml:space="preserve">§5 retrieval, §6.1 retrieval evaluation, </w:t>
+            </w:r>
+            <w:r>
+              <w:rPr>
+                <w:rFonts w:ascii="Consolas" w:cs="Consolas" w:eastAsia="Consolas" w:hAnsi="Consolas"/>
+                <w:color w:val="1F3864"/>
+                <w:sz w:val="19"/>
+                <w:szCs w:val="19"/>
+              </w:rPr>
+              <w:t xml:space="preserve">sources</w:t>
+            </w:r>
+            <w:r>
+              <w:rPr>
+                <w:rFonts w:ascii="Calibri" w:cs="Calibri" w:eastAsia="Calibri" w:hAnsi="Calibri"/>
+              </w:rPr>
+              <w:t xml:space="preserve"> in every reply</w:t>
             </w:r>
           </w:p>
         </w:tc>
@@ -1498,7 +1418,7 @@
         <w:rPr>
           <w:rFonts w:ascii="Calibri" w:cs="Calibri" w:eastAsia="Calibri" w:hAnsi="Calibri"/>
         </w:rPr>
-        <w:t xml:space="preserve">Customer message → guardrails (PII redaction, injection filter) → e5 vector search (top 3 documents; follow-ups add the previous question) → prompt template (rules, categories, few-shot examples, the last 5 question/answer pairs, </w:t>
+        <w:t xml:space="preserve">Customer message → guardrails (PII redaction, injection filter) → e5 vector search (top 3 documents) → prompt template (rules, categories, few-shot examples, </w:t>
       </w:r>
       <w:r>
         <w:rPr>
@@ -1799,22 +1719,7 @@
         <w:rPr>
           <w:rFonts w:ascii="Calibri" w:cs="Calibri" w:eastAsia="Calibri" w:hAnsi="Calibri"/>
         </w:rPr>
-        <w:t xml:space="preserve"> and chat with the bot in Section 2; an empty line or </w:t>
-      </w:r>
-      <w:r>
-        <w:rPr>
-          <w:rFonts w:ascii="Consolas" w:cs="Consolas" w:eastAsia="Consolas" w:hAnsi="Consolas"/>
-          <w:color w:val="1F3864"/>
-          <w:sz w:val="19"/>
-          <w:szCs w:val="19"/>
-        </w:rPr>
-        <w:t xml:space="preserve">quit</w:t>
-      </w:r>
-      <w:r>
-        <w:rPr>
-          <w:rFonts w:ascii="Calibri" w:cs="Calibri" w:eastAsia="Calibri" w:hAnsi="Calibri"/>
-        </w:rPr>
-        <w:t xml:space="preserve"> ends that chat, and Section 3 then starts the web chat at http://localhost:8501.</w:t>
+        <w:t xml:space="preserve"> and chat with the bot in Section 2, or in the browser with the web chat of Section 3.</w:t>
       </w:r>
     </w:p>
     <w:p>
@@ -1860,7 +1765,7 @@
         <w:rPr>
           <w:rFonts w:ascii="Calibri" w:cs="Calibri" w:eastAsia="Calibri" w:hAnsi="Calibri"/>
         </w:rPr>
-        <w:t xml:space="preserve">. The section numbers match the notebook; some titles here are longer. The chatbot parts described in Sections 2–4 and 7–10 and the e5 retriever of Section 5.1 are implemented in </w:t>
+        <w:t xml:space="preserve">. The headings match the section numbers in the notebook. The chatbot described in Sections 2–10 is implemented in </w:t>
       </w:r>
       <w:r>
         <w:rPr>
@@ -1875,7 +1780,7 @@
         <w:rPr>
           <w:rFonts w:ascii="Calibri" w:cs="Calibri" w:eastAsia="Calibri" w:hAnsi="Calibri"/>
         </w:rPr>
-        <w:t xml:space="preserve">; the notebook imports them, shows short examples and adds the evaluation code (baseline retrievers, test set, metrics, LLM judge).</w:t>
+        <w:t xml:space="preserve">; the notebook imports it, shows short examples of each part and adds the evaluation code (baseline retrievers, test set, metrics, LLM judge).</w:t>
       </w:r>
     </w:p>
     <w:p>
@@ -2206,13 +2111,13 @@
           <w:b/>
           <w:bCs/>
         </w:rPr>
-        <w:t xml:space="preserve">retries on rate limits</w:t>
-      </w:r>
-      <w:r>
-        <w:rPr>
-          <w:rFonts w:ascii="Calibri" w:cs="Calibri" w:eastAsia="Calibri" w:hAnsi="Calibri"/>
-        </w:rPr>
-        <w:t xml:space="preserve">: the Groq client is created with max_retries=5, so on a rate limit (HTTP 429), a timeout or a server error the SDK waits as long as Groq asks and tries again; if the call still fails, the error is printed and the reply stays empty,</w:t>
+        <w:t xml:space="preserve">no retries</w:t>
+      </w:r>
+      <w:r>
+        <w:rPr>
+          <w:rFonts w:ascii="Calibri" w:cs="Calibri" w:eastAsia="Calibri" w:hAnsi="Calibri"/>
+        </w:rPr>
+        <w:t xml:space="preserve">: if Groq returns an error (for example because the free-tier rate limit is reached), it is printed and the reply stays empty instead of being retried,</w:t>
       </w:r>
     </w:p>
     <w:p>
@@ -2374,27 +2279,6 @@
         </w:rPr>
         <w:t xml:space="preserve">, gpt-oss reasons briefly inside the model, and we receive only the final answer: a short customer reply does not need a long visible chain of thought.</w:t>
       </w:r>
-      <w:r>
-        <w:rPr>
-          <w:rFonts w:ascii="Calibri" w:cs="Calibri" w:eastAsia="Calibri" w:hAnsi="Calibri"/>
-        </w:rPr>
-        <w:t xml:space="preserve"> Replies are capped at 2,500 completion tokens (</w:t>
-      </w:r>
-      <w:r>
-        <w:rPr>
-          <w:rFonts w:ascii="Consolas" w:cs="Consolas" w:eastAsia="Consolas" w:hAnsi="Consolas"/>
-          <w:color w:val="1F3864"/>
-          <w:sz w:val="19"/>
-          <w:szCs w:val="19"/>
-        </w:rPr>
-        <w:t xml:space="preserve">MAX_COMPLETION_TOKENS</w:t>
-      </w:r>
-      <w:r>
-        <w:rPr>
-          <w:rFonts w:ascii="Calibri" w:cs="Calibri" w:eastAsia="Calibri" w:hAnsi="Calibri"/>
-        </w:rPr>
-        <w:t xml:space="preserve">).</w:t>
-      </w:r>
     </w:p>
     <w:p>
       <w:pPr>
@@ -2468,22 +2352,21 @@
         <w:rPr>
           <w:rFonts w:ascii="Calibri" w:cs="Calibri" w:eastAsia="Calibri" w:hAnsi="Calibri"/>
         </w:rPr>
-        <w:t xml:space="preserve"> and run it again). </w:t>
-      </w:r>
-      <w:r>
-        <w:rPr>
-          <w:rFonts w:ascii="Consolas" w:cs="Consolas" w:eastAsia="Consolas" w:hAnsi="Consolas"/>
-          <w:color w:val="1F3864"/>
-          <w:sz w:val="19"/>
-          <w:szCs w:val="19"/>
-        </w:rPr>
-        <w:t xml:space="preserve">chatbot.py</w:t>
-      </w:r>
-      <w:r>
-        <w:rPr>
-          <w:rFonts w:ascii="Calibri" w:cs="Calibri" w:eastAsia="Calibri" w:hAnsi="Calibri"/>
-        </w:rPr>
-        <w:t xml:space="preserve"> opens the database read-only (SQLite mode=ro) and both notebooks only use that connection, so nothing in them, including the chatbot, can change the shop's data.</w:t>
+        <w:t xml:space="preserve"> and run it again). Both notebooks open the database </w:t>
+      </w:r>
+      <w:r>
+        <w:rPr>
+          <w:rFonts w:ascii="Calibri" w:cs="Calibri" w:eastAsia="Calibri" w:hAnsi="Calibri"/>
+          <w:b/>
+          <w:bCs/>
+        </w:rPr>
+        <w:t xml:space="preserve">read-only</w:t>
+      </w:r>
+      <w:r>
+        <w:rPr>
+          <w:rFonts w:ascii="Calibri" w:cs="Calibri" w:eastAsia="Calibri" w:hAnsi="Calibri"/>
+        </w:rPr>
+        <w:t xml:space="preserve">, so nothing in them, including the chatbot, can change the shop's data.</w:t>
       </w:r>
     </w:p>
     <w:p>
@@ -2907,7 +2790,7 @@
         <w:rPr>
           <w:rFonts w:ascii="Calibri" w:cs="Calibri" w:eastAsia="Calibri" w:hAnsi="Calibri"/>
         </w:rPr>
-        <w:t xml:space="preserve">, it is multilingual, which matters for an EU shop: a German question (test case T34) finds the right page.</w:t>
+        <w:t xml:space="preserve">, it is multilingual, which matters for an EU shop: German and Hungarian questions find the right page.</w:t>
       </w:r>
     </w:p>
     <w:p>
@@ -3022,7 +2905,7 @@
         <w:rPr>
           <w:rFonts w:ascii="Calibri" w:cs="Calibri" w:eastAsia="Calibri" w:hAnsi="Calibri"/>
         </w:rPr>
-        <w:t xml:space="preserve">: one page = one chunk. Fixed 70-word windows with a 15-word overlap were also tried outside the notebook and gave practically the same retrieval scores, so the notebook keeps paragraph chunks.</w:t>
+        <w:t xml:space="preserve">: one page = one chunk. Fixed windows of 70 words with a 15-word overlap were also tried and did not change the results.</w:t>
       </w:r>
     </w:p>
     <w:p>
@@ -3110,7 +2993,7 @@
         <w:rPr>
           <w:rFonts w:ascii="Calibri" w:cs="Calibri" w:eastAsia="Calibri" w:hAnsi="Calibri"/>
         </w:rPr>
-        <w:t xml:space="preserve">The test cases are defined </w:t>
+        <w:t xml:space="preserve">The test set is fixed </w:t>
       </w:r>
       <w:r>
         <w:rPr>
@@ -3124,7 +3007,7 @@
         <w:rPr>
           <w:rFonts w:ascii="Calibri" w:cs="Calibri" w:eastAsia="Calibri" w:hAnsi="Calibri"/>
         </w:rPr>
-        <w:t xml:space="preserve"> the evaluation run and were revised only when the chatbot's specification changed (for example when the e-mail check and the human hand-off were dropped), following the cycle </w:t>
+        <w:t xml:space="preserve"> looking at any model output, following the cycle </w:t>
       </w:r>
       <w:r>
         <w:rPr>
@@ -3355,7 +3238,7 @@
         <w:rPr>
           <w:rFonts w:ascii="Calibri" w:cs="Calibri" w:eastAsia="Calibri" w:hAnsi="Calibri"/>
         </w:rPr>
-        <w:t xml:space="preserve"> appear (invented order status, prices or discounts, unsafe advice, leaked secrets, fake codes, echoed card numbers),</w:t>
+        <w:t xml:space="preserve"> appear (invented order status, leaked secrets, fake codes, echoed card numbers),</w:t>
       </w:r>
     </w:p>
     <w:p>
@@ -3380,22 +3263,52 @@
         <w:rPr>
           <w:rFonts w:ascii="Calibri" w:cs="Calibri" w:eastAsia="Calibri" w:hAnsi="Calibri"/>
         </w:rPr>
-        <w:t xml:space="preserve">, </w:t>
-      </w:r>
-      <w:r>
-        <w:rPr>
-          <w:rFonts w:ascii="Consolas" w:cs="Consolas" w:eastAsia="Consolas" w:hAnsi="Consolas"/>
-          <w:color w:val="1F3864"/>
-          <w:sz w:val="19"/>
-          <w:szCs w:val="19"/>
-        </w:rPr>
-        <w:t xml:space="preserve">order_id</w:t>
-      </w:r>
-      <w:r>
-        <w:rPr>
-          <w:rFonts w:ascii="Calibri" w:cs="Calibri" w:eastAsia="Calibri" w:hAnsi="Calibri"/>
-        </w:rPr>
-        <w:t xml:space="preserve">: whether the order tool must be called with the given order number (required), must not be called (none) or may be called (optional; supported but not used by the current cases),</w:t>
+        <w:t xml:space="preserve">: whether the order tool must be called (</w:t>
+      </w:r>
+      <w:r>
+        <w:rPr>
+          <w:rFonts w:ascii="Consolas" w:cs="Consolas" w:eastAsia="Consolas" w:hAnsi="Consolas"/>
+          <w:color w:val="1F3864"/>
+          <w:sz w:val="19"/>
+          <w:szCs w:val="19"/>
+        </w:rPr>
+        <w:t xml:space="preserve">required</w:t>
+      </w:r>
+      <w:r>
+        <w:rPr>
+          <w:rFonts w:ascii="Calibri" w:cs="Calibri" w:eastAsia="Calibri" w:hAnsi="Calibri"/>
+        </w:rPr>
+        <w:t xml:space="preserve">), must not be called (</w:t>
+      </w:r>
+      <w:r>
+        <w:rPr>
+          <w:rFonts w:ascii="Consolas" w:cs="Consolas" w:eastAsia="Consolas" w:hAnsi="Consolas"/>
+          <w:color w:val="1F3864"/>
+          <w:sz w:val="19"/>
+          <w:szCs w:val="19"/>
+        </w:rPr>
+        <w:t xml:space="preserve">none</w:t>
+      </w:r>
+      <w:r>
+        <w:rPr>
+          <w:rFonts w:ascii="Calibri" w:cs="Calibri" w:eastAsia="Calibri" w:hAnsi="Calibri"/>
+        </w:rPr>
+        <w:t xml:space="preserve">) or may be called (</w:t>
+      </w:r>
+      <w:r>
+        <w:rPr>
+          <w:rFonts w:ascii="Consolas" w:cs="Consolas" w:eastAsia="Consolas" w:hAnsi="Consolas"/>
+          <w:color w:val="1F3864"/>
+          <w:sz w:val="19"/>
+          <w:szCs w:val="19"/>
+        </w:rPr>
+        <w:t xml:space="preserve">optional</w:t>
+      </w:r>
+      <w:r>
+        <w:rPr>
+          <w:rFonts w:ascii="Calibri" w:cs="Calibri" w:eastAsia="Calibri" w:hAnsi="Calibri"/>
+        </w:rPr>
+        <w:t xml:space="preserve">),</w:t>
       </w:r>
     </w:p>
     <w:p>
@@ -3445,32 +3358,7 @@
         <w:rPr>
           <w:rFonts w:ascii="Calibri" w:cs="Calibri" w:eastAsia="Calibri" w:hAnsi="Calibri"/>
         </w:rPr>
-        <w:t xml:space="preserve">: the knowledge-base document(s) that contain the answer (27 of the 34 cases); used for the retrieval metrics, as the LLM judge's reference and in the failure analysis,</w:t>
-      </w:r>
-    </w:p>
-    <w:p>
-      <w:pPr>
-        <w:pStyle w:val="ListParagraph"/>
-        <w:numPr>
-          <w:ilvl w:val="0"/>
-          <w:numId w:val="3"/>
-        </w:numPr>
-        <w:spacing w:after="60"/>
-      </w:pPr>
-      <w:r>
-        <w:rPr>
-          <w:rFonts w:ascii="Consolas" w:cs="Consolas" w:eastAsia="Consolas" w:hAnsi="Consolas"/>
-          <w:color w:val="1F3864"/>
-          <w:sz w:val="19"/>
-          <w:szCs w:val="19"/>
-        </w:rPr>
-        <w:t xml:space="preserve">history</w:t>
-      </w:r>
-      <w:r>
-        <w:rPr>
-          <w:rFonts w:ascii="Calibri" w:cs="Calibri" w:eastAsia="Calibri" w:hAnsi="Calibri"/>
-        </w:rPr>
-        <w:t xml:space="preserve">: earlier customer messages of the conversation (the multi-turn case).</w:t>
+        <w:t xml:space="preserve">: the knowledge-base document(s) that contain the answer (for retrieval metrics).</w:t>
       </w:r>
     </w:p>
     <w:tbl>
@@ -4415,12 +4303,6 @@
         </w:rPr>
         <w:t xml:space="preserve"> (mean reciprocal rank of the first gold page within the top 3; 0 if there is none). We compare six retrievers: word-only, character-only and hybrid TF-IDF, BM25, e5 vector search (used by the chatbot) and the BM25 + e5 hybrid (RRF).</w:t>
       </w:r>
-      <w:r>
-        <w:rPr>
-          <w:rFonts w:ascii="Calibri" w:cs="Calibri" w:eastAsia="Calibri" w:hAnsi="Calibri"/>
-        </w:rPr>
-        <w:t xml:space="preserve"> 27 of the 34 cases have a gold page. Most have only one, so precision@3 cannot exceed about 0.38; recall@3 and MRR are the more informative scores.</w:t>
-      </w:r>
     </w:p>
     <w:p>
       <w:pPr>
@@ -4501,7 +4383,7 @@
         <w:rPr>
           <w:rFonts w:ascii="Calibri" w:cs="Calibri" w:eastAsia="Calibri" w:hAnsi="Calibri"/>
         </w:rPr>
-        <w:t xml:space="preserve"> (5) question/answer pairs are sent, each as the redacted customer message and the JSON reply; earlier documents and tool results are not sent again,</w:t>
+        <w:t xml:space="preserve"> question/answer pairs of a conversation are sent,</w:t>
       </w:r>
     </w:p>
     <w:p>
@@ -4539,7 +4421,7 @@
         <w:rPr>
           <w:rFonts w:ascii="Calibri" w:cs="Calibri" w:eastAsia="Calibri" w:hAnsi="Calibri"/>
         </w:rPr>
-        <w:t xml:space="preserve"> message. Groq automatically caches an identical prompt prefix for the gpt-oss models, and cached tokens do not count towards the free-tier rate limits, so the few-shot examples are almost free after the first call (not measured in the notebook).</w:t>
+        <w:t xml:space="preserve"> message. Groq automatically caches an identical prompt prefix for the gpt-oss models, and cached tokens do not count towards the free-tier rate limits, so the few-shot examples are almost free after the first call.</w:t>
       </w:r>
     </w:p>
     <w:p>
@@ -4625,7 +4507,7 @@
         <w:rPr>
           <w:rFonts w:ascii="Calibri" w:cs="Calibri" w:eastAsia="Calibri" w:hAnsi="Calibri"/>
         </w:rPr>
-        <w:t xml:space="preserve">: card numbers (13–19 digits), e-mail addresses and phone numbers (9 or more digits and separators; dates such as 2026-10-12 or 12/10/2026 are kept) are masked before anything is sent to Groq.</w:t>
+        <w:t xml:space="preserve">: card numbers (13–19 digits), e-mail addresses and phone numbers are masked before anything is sent to Groq.</w:t>
       </w:r>
     </w:p>
     <w:p>
@@ -4649,7 +4531,7 @@
         <w:rPr>
           <w:rFonts w:ascii="Calibri" w:cs="Calibri" w:eastAsia="Calibri" w:hAnsi="Calibri"/>
         </w:rPr>
-        <w:t xml:space="preserve">: nine fixed phrases (case-insensitive) catch common attacks ("ignore previous instructions", "system prompt", "admin mode"). Matching messages get a fixed reply without an LLM call and are not kept in the conversation history, so they never reach the LLM, not even with a later turn.</w:t>
+        <w:t xml:space="preserve">: a short list of phrases catches common attacks ("ignore previous instructions", "system prompt", "admin mode"). Matching messages get a fixed reply and never reach the LLM.</w:t>
       </w:r>
     </w:p>
     <w:p>
@@ -4688,7 +4570,7 @@
         <w:rPr>
           <w:rFonts w:ascii="Calibri" w:cs="Calibri" w:eastAsia="Calibri" w:hAnsi="Calibri"/>
         </w:rPr>
-        <w:t xml:space="preserve"> tags. Our own tag names typed by the customer are removed first, repeatedly until none is left, so the message cannot "close" the tag and pose as instructions.</w:t>
+        <w:t xml:space="preserve"> tags. Any of our own tag names typed by the customer are removed first, so the message cannot "close" the tag and pose as instructions.</w:t>
       </w:r>
     </w:p>
     <w:p>
@@ -4732,7 +4614,7 @@
         <w:rPr>
           <w:rFonts w:ascii="Calibri" w:cs="Calibri" w:eastAsia="Calibri" w:hAnsi="Calibri"/>
         </w:rPr>
-        <w:t xml:space="preserve">Section 12 measures what the LLM does when redaction, the injection filter and the output check are switched off; the delimiter tags stay in place.</w:t>
+        <w:t xml:space="preserve">Section 12 measures what the LLM does when these rules are switched off.</w:t>
       </w:r>
     </w:p>
     <w:p>
@@ -4959,7 +4841,7 @@
               <w:rPr>
                 <w:rFonts w:ascii="Calibri" w:cs="Calibri" w:eastAsia="Calibri" w:hAnsi="Calibri"/>
               </w:rPr>
-              <w:t xml:space="preserve"> and tool results; look up order numbers with the tool (no e-mail needed) and never guess an order status; say so when information is missing; no refunds, discount codes, payments or order changes; apologise briefly to upset customers</w:t>
+              <w:t xml:space="preserve"> and tool results; never guess an order status; say so when the information is missing</w:t>
             </w:r>
           </w:p>
         </w:tc>
@@ -5115,7 +4997,7 @@
               <w:rPr>
                 <w:rFonts w:ascii="Calibri" w:cs="Calibri" w:eastAsia="Calibri" w:hAnsi="Calibri"/>
               </w:rPr>
-              <w:t xml:space="preserve">one JSON object with fixed fields, checked in Python outside the model (readable, all four fields, an allowed category); a reply without readable JSON is kept as plain text</w:t>
+              <w:t xml:space="preserve">one JSON object with fixed fields, validated in Python, outside the model</w:t>
             </w:r>
           </w:p>
         </w:tc>
@@ -5393,7 +5275,7 @@
         <w:rPr>
           <w:rFonts w:ascii="Calibri" w:cs="Calibri" w:eastAsia="Calibri" w:hAnsi="Calibri"/>
         </w:rPr>
-        <w:t xml:space="preserve"> message. This repeats, without an upper limit, until the model answers without requesting the tool.</w:t>
+        <w:t xml:space="preserve"> message. This repeats until the model answers without requesting the tool.</w:t>
       </w:r>
     </w:p>
     <w:p>
@@ -5411,13 +5293,13 @@
           <w:b/>
           <w:bCs/>
         </w:rPr>
-        <w:t xml:space="preserve">Validation and memory</w:t>
-      </w:r>
-      <w:r>
-        <w:rPr>
-          <w:rFonts w:ascii="Calibri" w:cs="Calibri" w:eastAsia="Calibri" w:hAnsi="Calibri"/>
-        </w:rPr>
-        <w:t xml:space="preserve">: parse and check the JSON, run the output guard, then add the redacted message and the reply to the history (messages stopped by the injection filter are not kept).</w:t>
+        <w:t xml:space="preserve">Validation</w:t>
+      </w:r>
+      <w:r>
+        <w:rPr>
+          <w:rFonts w:ascii="Calibri" w:cs="Calibri" w:eastAsia="Calibri" w:hAnsi="Calibri"/>
+        </w:rPr>
+        <w:t xml:space="preserve">: parse and check the JSON, then run the output guard.</w:t>
       </w:r>
     </w:p>
     <w:p>
@@ -5462,7 +5344,7 @@
         <w:rPr>
           <w:rFonts w:ascii="Calibri" w:cs="Calibri" w:eastAsia="Calibri" w:hAnsi="Calibri"/>
         </w:rPr>
-        <w:t xml:space="preserve">We evaluate the final chatbot (retrieval, order tool, few-shot prompt and guardrails) on all 34 test cases. Section 12 re-runs the six adversarial and out-of-scope cases with the guardrails switched off.</w:t>
+        <w:t xml:space="preserve">We evaluate the final chatbot (retrieval, order tool, few-shot prompt and guardrails) on all 34 test cases. Section 12 re-runs the attack cases with the guardrails switched off.</w:t>
       </w:r>
     </w:p>
     <w:p>
@@ -5499,7 +5381,7 @@
         <w:rPr>
           <w:rFonts w:ascii="Calibri" w:cs="Calibri" w:eastAsia="Calibri" w:hAnsi="Calibri"/>
         </w:rPr>
-        <w:t xml:space="preserve"> (main metric): all key facts present, nothing forbidden, a correct tool decision (the right order number when the tool is required) and, for decline cases, a refusal phrase from a fixed list.</w:t>
+        <w:t xml:space="preserve"> (main metric): right behaviour (answer or decline), all key facts present, nothing forbidden, and a correct tool decision.</w:t>
       </w:r>
     </w:p>
     <w:p>
@@ -5575,7 +5457,7 @@
         <w:rPr>
           <w:rFonts w:ascii="Calibri" w:cs="Calibri" w:eastAsia="Calibri" w:hAnsi="Calibri"/>
         </w:rPr>
-        <w:t xml:space="preserve"> against the reference answers, for the answers written by the LLM (fixed guardrail replies are skipped). Section 11.2 compares them with the pass/fail result.</w:t>
+        <w:t xml:space="preserve"> against the reference answers. Section 11.2 shows on our own data why these overlap scores are only weakly related to correctness.</w:t>
       </w:r>
     </w:p>
     <w:p>
@@ -5637,7 +5519,7 @@
         <w:rPr>
           <w:rFonts w:ascii="Calibri" w:cs="Calibri" w:eastAsia="Calibri" w:hAnsi="Calibri"/>
         </w:rPr>
-        <w:t xml:space="preserve"> per answer: prompt and completion tokens from Groq's usage field and the time of all calls for the answer (an order look-up needs two calls); answers stopped by the injection filter count as 0.</w:t>
+        <w:t xml:space="preserve"> per answer: prompt and completion tokens from Groq's usage field and the measured call time.</w:t>
       </w:r>
     </w:p>
     <w:p>
@@ -5689,7 +5571,7 @@
         <w:rPr>
           <w:rFonts w:ascii="Calibri" w:cs="Calibri" w:eastAsia="Calibri" w:hAnsi="Calibri"/>
         </w:rPr>
-        <w:t xml:space="preserve"> sentence can score higher than a correct paraphrase. We compare the mean BLEU and ROUGE-L of passed and failed answers and look at their spread: if these scores measured correctness, passed answers would score clearly higher than failed ones.</w:t>
+        <w:t xml:space="preserve"> sentence can score higher than a correct paraphrase. We test this on the chatbot's real answers: if ROUGE-L measured correctness, passed answers would score clearly higher than failed ones.</w:t>
       </w:r>
     </w:p>
     <w:p>
@@ -5708,7 +5590,35 @@
         <w:rPr>
           <w:rFonts w:ascii="Calibri" w:cs="Calibri" w:eastAsia="Calibri" w:hAnsi="Calibri"/>
         </w:rPr>
-        <w:t xml:space="preserve">The six adversarial and out-of-scope cases are re-run with guardrails switched off: no redaction, no injection filter, no output check; the delimiter tags stay in place. The model then has only its prompt to rely on, which shows how much the application-level layer adds. The card number used is the public Visa test number, not real data.</w:t>
+        <w:t xml:space="preserve">The adversarial and out-of-scope cases are re-run with </w:t>
+      </w:r>
+      <w:r>
+        <w:rPr>
+          <w:rFonts w:ascii="Calibri" w:cs="Calibri" w:eastAsia="Calibri" w:hAnsi="Calibri"/>
+          <w:b/>
+          <w:bCs/>
+        </w:rPr>
+        <w:t xml:space="preserve">guardrails switched off</w:t>
+      </w:r>
+      <w:r>
+        <w:rPr>
+          <w:rFonts w:ascii="Calibri" w:cs="Calibri" w:eastAsia="Calibri" w:hAnsi="Calibri"/>
+        </w:rPr>
+        <w:t xml:space="preserve">: no redaction, no injection filter, no output check. The model then has only its prompt to rely on, which shows how much the application-level layer adds. The card number used is the public Visa </w:t>
+      </w:r>
+      <w:r>
+        <w:rPr>
+          <w:rFonts w:ascii="Calibri" w:cs="Calibri" w:eastAsia="Calibri" w:hAnsi="Calibri"/>
+          <w:i/>
+          <w:iCs/>
+        </w:rPr>
+        <w:t xml:space="preserve">test</w:t>
+      </w:r>
+      <w:r>
+        <w:rPr>
+          <w:rFonts w:ascii="Calibri" w:cs="Calibri" w:eastAsia="Calibri" w:hAnsi="Calibri"/>
+        </w:rPr>
+        <w:t xml:space="preserve"> number, not real data.</w:t>
       </w:r>
     </w:p>
     <w:p>
@@ -5727,7 +5637,21 @@
         <w:rPr>
           <w:rFonts w:ascii="Calibri" w:cs="Calibri" w:eastAsia="Calibri" w:hAnsi="Calibri"/>
         </w:rPr>
-        <w:t xml:space="preserve">Keyword checks are strict but brittle, and BLEU/ROUGE measure overlap rather than truth (Section 11.2). As a complementary view, a second model grades every answer of the final chatbot. It sees the reference documents, tool results, reference answer and expected behaviour, scores correctness, groundedness and helpfulness from 1 to 5, and says whether the expected behaviour (answer or decline) was followed. A reply passes the judge if correctness is at least 4 and the behaviour is right; we report how often this agrees with the rule-based result.</w:t>
+        <w:t xml:space="preserve">Keyword checks are strict but brittle, and BLEU/ROUGE measure overlap rather than truth (Section 11.2). As a complementary view, a second model grades every answer of the final chatbot. It sees the </w:t>
+      </w:r>
+      <w:r>
+        <w:rPr>
+          <w:rFonts w:ascii="Calibri" w:cs="Calibri" w:eastAsia="Calibri" w:hAnsi="Calibri"/>
+          <w:b/>
+          <w:bCs/>
+        </w:rPr>
+        <w:t xml:space="preserve">reference documents, tool results and reference answer</w:t>
+      </w:r>
+      <w:r>
+        <w:rPr>
+          <w:rFonts w:ascii="Calibri" w:cs="Calibri" w:eastAsia="Calibri" w:hAnsi="Calibri"/>
+        </w:rPr>
+        <w:t xml:space="preserve">, and scores correctness, groundedness and helpfulness from 1 to 5. We then check how often the judge agrees with the rule-based result.</w:t>
       </w:r>
     </w:p>
     <w:p>
@@ -5757,7 +5681,7 @@
         <w:rPr>
           <w:rFonts w:ascii="Calibri" w:cs="Calibri" w:eastAsia="Calibri" w:hAnsi="Calibri"/>
         </w:rPr>
-        <w:t xml:space="preserve">Every failing case of the final chatbot gets an automatic first diagnosis:</w:t>
+        <w:t xml:space="preserve">Every failing case of the final chatbot is listed with the likely cause:</w:t>
       </w:r>
     </w:p>
     <w:p>
@@ -5775,13 +5699,13 @@
           <w:b/>
           <w:bCs/>
         </w:rPr>
-        <w:t xml:space="preserve">guardrail</w:t>
-      </w:r>
-      <w:r>
-        <w:rPr>
-          <w:rFonts w:ascii="Calibri" w:cs="Calibri" w:eastAsia="Calibri" w:hAnsi="Calibri"/>
-        </w:rPr>
-        <w:t xml:space="preserve">: the reply was replaced by the injection filter or the output check,</w:t>
+        <w:t xml:space="preserve">retrieval</w:t>
+      </w:r>
+      <w:r>
+        <w:rPr>
+          <w:rFonts w:ascii="Calibri" w:cs="Calibri" w:eastAsia="Calibri" w:hAnsi="Calibri"/>
+        </w:rPr>
+        <w:t xml:space="preserve">: the gold document was not in the context,</w:t>
       </w:r>
     </w:p>
     <w:p>
@@ -5805,7 +5729,7 @@
         <w:rPr>
           <w:rFonts w:ascii="Calibri" w:cs="Calibri" w:eastAsia="Calibri" w:hAnsi="Calibri"/>
         </w:rPr>
-        <w:t xml:space="preserve">: the order tool was not called with the expected order number, or called when it should not have been,</w:t>
+        <w:t xml:space="preserve">: the order tool was missed or used when it should not have been,</w:t>
       </w:r>
     </w:p>
     <w:p>
@@ -5823,13 +5747,13 @@
           <w:b/>
           <w:bCs/>
         </w:rPr>
-        <w:t xml:space="preserve">retrieval</w:t>
-      </w:r>
-      <w:r>
-        <w:rPr>
-          <w:rFonts w:ascii="Calibri" w:cs="Calibri" w:eastAsia="Calibri" w:hAnsi="Calibri"/>
-        </w:rPr>
-        <w:t xml:space="preserve">: the gold document was not in the top 3 (answer cases only),</w:t>
+        <w:t xml:space="preserve">generation</w:t>
+      </w:r>
+      <w:r>
+        <w:rPr>
+          <w:rFonts w:ascii="Calibri" w:cs="Calibri" w:eastAsia="Calibri" w:hAnsi="Calibri"/>
+        </w:rPr>
+        <w:t xml:space="preserve">: the context was right but the reply was wrong,</w:t>
       </w:r>
     </w:p>
     <w:p>
@@ -5847,37 +5771,13 @@
           <w:b/>
           <w:bCs/>
         </w:rPr>
-        <w:t xml:space="preserve">generation</w:t>
-      </w:r>
-      <w:r>
-        <w:rPr>
-          <w:rFonts w:ascii="Calibri" w:cs="Calibri" w:eastAsia="Calibri" w:hAnsi="Calibri"/>
-        </w:rPr>
-        <w:t xml:space="preserve">: a decline case without a refusal phrase, or forbidden content in the reply,</w:t>
-      </w:r>
-    </w:p>
-    <w:p>
-      <w:pPr>
-        <w:pStyle w:val="ListParagraph"/>
-        <w:numPr>
-          <w:ilvl w:val="0"/>
-          <w:numId w:val="3"/>
-        </w:numPr>
-        <w:spacing w:after="60"/>
-      </w:pPr>
-      <w:r>
-        <w:rPr>
-          <w:rFonts w:ascii="Calibri" w:cs="Calibri" w:eastAsia="Calibri" w:hAnsi="Calibri"/>
-          <w:b/>
-          <w:bCs/>
-        </w:rPr>
-        <w:t xml:space="preserve">generation or keyword check</w:t>
-      </w:r>
-      <w:r>
-        <w:rPr>
-          <w:rFonts w:ascii="Calibri" w:cs="Calibri" w:eastAsia="Calibri" w:hAnsi="Calibri"/>
-        </w:rPr>
-        <w:t xml:space="preserve">: a key fact is missing; the code cannot tell whether the model left it out or the rule missed a paraphrase.</w:t>
+        <w:t xml:space="preserve">keyword check</w:t>
+      </w:r>
+      <w:r>
+        <w:rPr>
+          <w:rFonts w:ascii="Calibri" w:cs="Calibri" w:eastAsia="Calibri" w:hAnsi="Calibri"/>
+        </w:rPr>
+        <w:t xml:space="preserve">: the reply was actually fine but the rule missed it.</w:t>
       </w:r>
     </w:p>
     <w:p>
@@ -5888,7 +5788,7 @@
         <w:rPr>
           <w:rFonts w:ascii="Calibri" w:cs="Calibri" w:eastAsia="Calibri" w:hAnsi="Calibri"/>
         </w:rPr>
-        <w:t xml:space="preserve">The diagnosis is only a first guess, so every failure is also read by hand: for example, a correct refusal worded differently from the fixed refusal-phrase list is labelled a generation error.</w:t>
+        <w:t xml:space="preserve">Decide which is which: this is the critical interpretation the report needs.</w:t>
       </w:r>
     </w:p>
     <w:p>
@@ -5922,22 +5822,7 @@
         <w:rPr>
           <w:rFonts w:ascii="Calibri" w:cs="Calibri" w:eastAsia="Calibri" w:hAnsi="Calibri"/>
         </w:rPr>
-        <w:t xml:space="preserve"> (model, temperature, judge, top-k, retrieval scores, pass rate, category Exact Match, valid JSON, ROUGE-L, tokens, latency, guardrail ablation, judge and failure causes); the full metric table is in </w:t>
-      </w:r>
-      <w:r>
-        <w:rPr>
-          <w:rFonts w:ascii="Consolas" w:cs="Consolas" w:eastAsia="Consolas" w:hAnsi="Consolas"/>
-          <w:color w:val="1F3864"/>
-          <w:sz w:val="19"/>
-          <w:szCs w:val="19"/>
-        </w:rPr>
-        <w:t xml:space="preserve">outputs/overall_summary.csv</w:t>
-      </w:r>
-      <w:r>
-        <w:rPr>
-          <w:rFonts w:ascii="Calibri" w:cs="Calibri" w:eastAsia="Calibri" w:hAnsi="Calibri"/>
-        </w:rPr>
-        <w:t xml:space="preserve">. Section 14 interprets the failures; the limitations and safety considerations are in the last chapter of this document.</w:t>
+        <w:t xml:space="preserve">. Write your interpretation in the report next to these numbers, paying particular attention to which failures come from retrieval, tools, generation or the scoring itself. The limitations and safety considerations are in the last chapter of this document.</w:t>
       </w:r>
     </w:p>
     <w:p>
@@ -6512,52 +6397,7 @@
         <w:rPr>
           <w:rFonts w:ascii="Calibri" w:cs="Calibri" w:eastAsia="Calibri" w:hAnsi="Calibri"/>
         </w:rPr>
-        <w:t xml:space="preserve">: an </w:t>
-      </w:r>
-      <w:r>
-        <w:rPr>
-          <w:rFonts w:ascii="Consolas" w:cs="Consolas" w:eastAsia="Consolas" w:hAnsi="Consolas"/>
-          <w:color w:val="1F3864"/>
-          <w:sz w:val="19"/>
-          <w:szCs w:val="19"/>
-        </w:rPr>
-        <w:t xml:space="preserve">input()</w:t>
-      </w:r>
-      <w:r>
-        <w:rPr>
-          <w:rFonts w:ascii="Calibri" w:cs="Calibri" w:eastAsia="Calibri" w:hAnsi="Calibri"/>
-        </w:rPr>
-        <w:t xml:space="preserve"> loop; every answer is printed with its category, urgency, sources, tool calls and guardrail result (an empty line, </w:t>
-      </w:r>
-      <w:r>
-        <w:rPr>
-          <w:rFonts w:ascii="Consolas" w:cs="Consolas" w:eastAsia="Consolas" w:hAnsi="Consolas"/>
-          <w:color w:val="1F3864"/>
-          <w:sz w:val="19"/>
-          <w:szCs w:val="19"/>
-        </w:rPr>
-        <w:t xml:space="preserve">quit</w:t>
-      </w:r>
-      <w:r>
-        <w:rPr>
-          <w:rFonts w:ascii="Calibri" w:cs="Calibri" w:eastAsia="Calibri" w:hAnsi="Calibri"/>
-        </w:rPr>
-        <w:t xml:space="preserve"> or </w:t>
-      </w:r>
-      <w:r>
-        <w:rPr>
-          <w:rFonts w:ascii="Consolas" w:cs="Consolas" w:eastAsia="Consolas" w:hAnsi="Consolas"/>
-          <w:color w:val="1F3864"/>
-          <w:sz w:val="19"/>
-          <w:szCs w:val="19"/>
-        </w:rPr>
-        <w:t xml:space="preserve">exit</w:t>
-      </w:r>
-      <w:r>
-        <w:rPr>
-          <w:rFonts w:ascii="Calibri" w:cs="Calibri" w:eastAsia="Calibri" w:hAnsi="Calibri"/>
-        </w:rPr>
-        <w:t xml:space="preserve"> stops).</w:t>
+        <w:t xml:space="preserve">: the interactive chat.</w:t>
       </w:r>
     </w:p>
     <w:p>
@@ -6581,7 +6421,22 @@
         <w:rPr>
           <w:rFonts w:ascii="Calibri" w:cs="Calibri" w:eastAsia="Calibri" w:hAnsi="Calibri"/>
         </w:rPr>
-        <w:t xml:space="preserve">: running the cell writes the </w:t>
+        <w:t xml:space="preserve">: running the cell builds a small Streamlit page on top of </w:t>
+      </w:r>
+      <w:r>
+        <w:rPr>
+          <w:rFonts w:ascii="Consolas" w:cs="Consolas" w:eastAsia="Consolas" w:hAnsi="Consolas"/>
+          <w:color w:val="1F3864"/>
+          <w:sz w:val="19"/>
+          <w:szCs w:val="19"/>
+        </w:rPr>
+        <w:t xml:space="preserve">chatbot.py</w:t>
+      </w:r>
+      <w:r>
+        <w:rPr>
+          <w:rFonts w:ascii="Calibri" w:cs="Calibri" w:eastAsia="Calibri" w:hAnsi="Calibri"/>
+        </w:rPr>
+        <w:t xml:space="preserve"> from the </w:t>
       </w:r>
       <w:r>
         <w:rPr>
@@ -6596,37 +6451,7 @@
         <w:rPr>
           <w:rFonts w:ascii="Calibri" w:cs="Calibri" w:eastAsia="Calibri" w:hAnsi="Calibri"/>
         </w:rPr>
-        <w:t xml:space="preserve"> function of the same cell to the system temp folder (not into the project) and starts it with Streamlit at http://localhost:8501, reachable only from this computer. The API key from Setup is passed to the server process in memory (an environment variable) and never saved. The page loads </w:t>
-      </w:r>
-      <w:r>
-        <w:rPr>
-          <w:rFonts w:ascii="Consolas" w:cs="Consolas" w:eastAsia="Consolas" w:hAnsi="Consolas"/>
-          <w:color w:val="1F3864"/>
-          <w:sz w:val="19"/>
-          <w:szCs w:val="19"/>
-        </w:rPr>
-        <w:t xml:space="preserve">chatbot.py</w:t>
-      </w:r>
-      <w:r>
-        <w:rPr>
-          <w:rFonts w:ascii="Calibri" w:cs="Calibri" w:eastAsia="Calibri" w:hAnsi="Calibri"/>
-        </w:rPr>
-        <w:t xml:space="preserve"> once (</w:t>
-      </w:r>
-      <w:r>
-        <w:rPr>
-          <w:rFonts w:ascii="Consolas" w:cs="Consolas" w:eastAsia="Consolas" w:hAnsi="Consolas"/>
-          <w:color w:val="1F3864"/>
-          <w:sz w:val="19"/>
-          <w:szCs w:val="19"/>
-        </w:rPr>
-        <w:t xml:space="preserve">st.cache_resource</w:t>
-      </w:r>
-      <w:r>
-        <w:rPr>
-          <w:rFonts w:ascii="Calibri" w:cs="Calibri" w:eastAsia="Calibri" w:hAnsi="Calibri"/>
-        </w:rPr>
-        <w:t xml:space="preserve">), keeps one conversation per browser tab and shows only the answer text. If port 8501 is already in use, the cell says so; interrupt the cell to stop the web chat.</w:t>
+        <w:t xml:space="preserve"> function in the same cell and starts it right away at http://localhost:8501 with the API key entered in Setup. The key is passed to the page in memory and never saved; the page script goes to the system temp folder, not into the project. Interrupt the cell to stop the web chat.</w:t>
       </w:r>
     </w:p>
     <w:p>
@@ -6725,7 +6550,7 @@
         <w:rPr>
           <w:rFonts w:ascii="Calibri" w:cs="Calibri" w:eastAsia="Calibri" w:hAnsi="Calibri"/>
         </w:rPr>
-        <w:t xml:space="preserve"> TF-IDF and BM25 match words, not meaning, so synonyms ("broken" vs "damaged") and other languages fail; vector search fixes these cases (Sections 5.1 and 6.1). Its similarity scores, however, lie in a narrow band (top-1 cosine about 0.79–0.90 on the test set), so they cannot reliably separate off-topic questions from real ones: the top 3 pages are always passed on and the prompt decides. The embedding model is not tuned to the shop and is a ~470 MB download on the first run. Combining it with BM25 (RRF) made retrieval worse on this data.</w:t>
+        <w:t xml:space="preserve"> TF-IDF and BM25 match words, not meaning, so synonyms ("broken" vs "damaged") and other languages fail; vector search fixes these cases (Section 6.1). Its similarity scores, however, lie in a narrow band, so they cannot reliably separate off-topic questions from real ones: the top 3 pages are always passed on and the prompt decides. The embedding model is not tuned to the shop and is a ~470 MB download on the first run. Combining it with BM25 (RRF) made retrieval worse on this data.</w:t>
       </w:r>
     </w:p>
     <w:p>
@@ -6749,7 +6574,7 @@
         <w:rPr>
           <w:rFonts w:ascii="Calibri" w:cs="Calibri" w:eastAsia="Calibri" w:hAnsi="Calibri"/>
         </w:rPr>
-        <w:t xml:space="preserve"> Keyword checks can miss correct paraphrases (for example a refusal worded differently from the fixed phrase list), and BLEU/ROUGE reward word overlap rather than truth (Section 11.2). The LLM judge is noisy too, so human review of the failures remains necessary.</w:t>
+        <w:t xml:space="preserve"> Keyword checks can miss correct paraphrases, and BLEU/ROUGE reward word overlap rather than truth (Section 11.2). The LLM judge is noisy too, so human review of the failures remains necessary.</w:t>
       </w:r>
     </w:p>
     <w:p>
@@ -6773,7 +6598,7 @@
         <w:rPr>
           <w:rFonts w:ascii="Calibri" w:cs="Calibri" w:eastAsia="Calibri" w:hAnsi="Calibri"/>
         </w:rPr>
-        <w:t xml:space="preserve"> Even at low temperature the model can answer differently between runs (generation picks each token from a probability distribution). Responses are not cached, so a re-run can give slightly different results; run_summary.txt records the model ID and temperature; report them with the date of the run, and restart the kernel before a run so that changes in chatbot.py take effect.</w:t>
+        <w:t xml:space="preserve"> Even at low temperature the model can answer differently between runs (generation picks each token from a probability distribution). Responses are not cached, so a re-run can give slightly different results; report the model ID and the date of the run.</w:t>
       </w:r>
     </w:p>
     <w:p>
@@ -6835,7 +6660,15 @@
         <w:rPr>
           <w:rFonts w:ascii="Calibri" w:cs="Calibri" w:eastAsia="Calibri" w:hAnsi="Calibri"/>
         </w:rPr>
-        <w:t xml:space="preserve"> cap the evaluation size and add waiting time: the notebooks do not pause between calls, but the Groq SDK waits and retries (up to 5 times) when a call hits the rate limit; a call that still fails counts as a failed test case.</w:t>
+        <w:t xml:space="preserve"> cap the evaluation size. The notebooks do not wait between calls or retry, so a call that hits the rate limit fails and its test case counts as failed.</w:t>
+      </w:r>
+    </w:p>
+    <w:p>
+      <w:pPr>
+        <w:pStyle w:val="Heading2"/>
+      </w:pPr>
+      <w:r>
+        <w:t xml:space="preserve">Safety considerations</w:t>
       </w:r>
     </w:p>
     <w:p>
@@ -6853,21 +6686,13 @@
           <w:b/>
           <w:bCs/>
         </w:rPr>
-        <w:t xml:space="preserve">Simple patterns.</w:t>
-      </w:r>
-      <w:r>
-        <w:rPr>
-          <w:rFonts w:ascii="Calibri" w:cs="Calibri" w:eastAsia="Calibri" w:hAnsi="Calibri"/>
-        </w:rPr>
-        <w:t xml:space="preserve"> The injection filter and the PII rules are plain patterns: the filter can block a harmless message that happens to contain one of its phrases, the phone rule can mask a long number that is not a phone number, and the model may call the order tool without a limit.</w:t>
-      </w:r>
-    </w:p>
-    <w:p>
-      <w:pPr>
-        <w:pStyle w:val="Heading2"/>
-      </w:pPr>
-      <w:r>
-        <w:t xml:space="preserve">Safety considerations</w:t>
+        <w:t xml:space="preserve">Hallucinated policies</w:t>
+      </w:r>
+      <w:r>
+        <w:rPr>
+          <w:rFonts w:ascii="Calibri" w:cs="Calibri" w:eastAsia="Calibri" w:hAnsi="Calibri"/>
+        </w:rPr>
+        <w:t xml:space="preserve"> are the main business risk: a bot that invents a refund rule creates a liability. Grounding and the false-premise test (T19) address and measure this.</w:t>
       </w:r>
     </w:p>
     <w:p>
@@ -6885,13 +6710,13 @@
           <w:b/>
           <w:bCs/>
         </w:rPr>
-        <w:t xml:space="preserve">Hallucinated policies</w:t>
-      </w:r>
-      <w:r>
-        <w:rPr>
-          <w:rFonts w:ascii="Calibri" w:cs="Calibri" w:eastAsia="Calibri" w:hAnsi="Calibri"/>
-        </w:rPr>
-        <w:t xml:space="preserve"> are the main business risk: a bot that invents a refund rule creates a liability. Grounding and the false-premise test (T19) address and measure this.</w:t>
+        <w:t xml:space="preserve">Privacy (GDPR).</w:t>
+      </w:r>
+      <w:r>
+        <w:rPr>
+          <w:rFonts w:ascii="Calibri" w:cs="Calibri" w:eastAsia="Calibri" w:hAnsi="Calibri"/>
+        </w:rPr>
+        <w:t xml:space="preserve"> PII is redacted before every API call, and the LLM never sees customers' e-mail addresses. Order data, however, is shown to anyone who knows the order number: there is no e-mail check, which a real shop would need before going live. The database is opened read-only, so even a successful attack cannot change it. Real customer data would require a data-processing agreement with the API provider.</w:t>
       </w:r>
     </w:p>
     <w:p>
@@ -6909,13 +6734,13 @@
           <w:b/>
           <w:bCs/>
         </w:rPr>
-        <w:t xml:space="preserve">Privacy (GDPR).</w:t>
-      </w:r>
-      <w:r>
-        <w:rPr>
-          <w:rFonts w:ascii="Calibri" w:cs="Calibri" w:eastAsia="Calibri" w:hAnsi="Calibri"/>
-        </w:rPr>
-        <w:t xml:space="preserve"> PII is redacted before every chatbot call, and the chatbot's LLM never sees customers' e-mail addresses (the evaluation's judge and ablation runs use the raw synthetic test messages). Order data, however, is shown to anyone who knows the order number: there is no e-mail check, which a real shop would need before going live. The database is opened read-only, so even a successful attack cannot change it. Real customer data would require a data-processing agreement with the API provider.</w:t>
+        <w:t xml:space="preserve">Prompt injection.</w:t>
+      </w:r>
+      <w:r>
+        <w:rPr>
+          <w:rFonts w:ascii="Calibri" w:cs="Calibri" w:eastAsia="Calibri" w:hAnsi="Calibri"/>
+        </w:rPr>
+        <w:t xml:space="preserve"> The phrase filter catches only known phrasings; paraphrased attacks reach the model, which then relies on its instructions and the delimiter tags (Section 12). The real protection is the narrow tool design: even a successful injection can only look up one order by its number.</w:t>
       </w:r>
     </w:p>
     <w:p>
@@ -6933,13 +6758,13 @@
           <w:b/>
           <w:bCs/>
         </w:rPr>
-        <w:t xml:space="preserve">Prompt injection.</w:t>
-      </w:r>
-      <w:r>
-        <w:rPr>
-          <w:rFonts w:ascii="Calibri" w:cs="Calibri" w:eastAsia="Calibri" w:hAnsi="Calibri"/>
-        </w:rPr>
-        <w:t xml:space="preserve"> The phrase filter catches only known phrasings; paraphrased attacks reach the model, which then relies on its instructions and the delimiter tags (Section 12). The real protection is the narrow tool design: even a successful injection can only look up orders one number at a time; it cannot list or change them.</w:t>
+        <w:t xml:space="preserve">Physical safety.</w:t>
+      </w:r>
+      <w:r>
+        <w:rPr>
+          <w:rFonts w:ascii="Calibri" w:cs="Calibri" w:eastAsia="Calibri" w:hAnsi="Calibri"/>
+        </w:rPr>
+        <w:t xml:space="preserve"> Product-safety questions (stove in a tent) must get conservative, documented advice; the knowledge base contains an explicit safety page.</w:t>
       </w:r>
     </w:p>
     <w:p>
@@ -6957,37 +6782,13 @@
           <w:b/>
           <w:bCs/>
         </w:rPr>
-        <w:t xml:space="preserve">Physical safety.</w:t>
-      </w:r>
-      <w:r>
-        <w:rPr>
-          <w:rFonts w:ascii="Calibri" w:cs="Calibri" w:eastAsia="Calibri" w:hAnsi="Calibri"/>
-        </w:rPr>
-        <w:t xml:space="preserve"> Product-safety questions (stove in a tent) must get conservative, documented advice; the knowledge base contains an explicit safety page.</w:t>
-      </w:r>
-    </w:p>
-    <w:p>
-      <w:pPr>
-        <w:pStyle w:val="ListParagraph"/>
-        <w:numPr>
-          <w:ilvl w:val="0"/>
-          <w:numId w:val="3"/>
-        </w:numPr>
-        <w:spacing w:after="60"/>
-      </w:pPr>
-      <w:r>
-        <w:rPr>
-          <w:rFonts w:ascii="Calibri" w:cs="Calibri" w:eastAsia="Calibri" w:hAnsi="Calibri"/>
-          <w:b/>
-          <w:bCs/>
-        </w:rPr>
         <w:t xml:space="preserve">Transparency.</w:t>
       </w:r>
       <w:r>
         <w:rPr>
           <w:rFonts w:ascii="Calibri" w:cs="Calibri" w:eastAsia="Calibri" w:hAnsi="Calibri"/>
         </w:rPr>
-        <w:t xml:space="preserve"> Customers should know they are talking to an AI (EU AI Act transparency obligations for chatbots); the web chat does not show such a notice yet. The prototype has no human hand-off; a production system would need an easy route to a human, for example the support contact listed in the knowledge base.</w:t>
+        <w:t xml:space="preserve"> Customers should know they are talking to an AI (EU AI Act transparency obligations for chatbots). The prototype has no human hand-off; a production system would need an easy route to a human, for example the support contact listed in the knowledge base.</w:t>
       </w:r>
     </w:p>
     <w:sectPr>

</xml_diff>